<commit_message>
docs: fixed all SSU document formatting errors
</commit_message>
<xml_diff>
--- a/docs/SSU/12.SSU - AI Uparivanje Timova.docx
+++ b/docs/SSU/12.SSU - AI Uparivanje Timova.docx
@@ -1095,21 +1095,7 @@
             <w:rStyle w:val="Hyperlink"/>
             <w:noProof/>
           </w:rPr>
-          <w:t>Tak</w:t>
-        </w:r>
-        <w:r>
-          <w:rPr>
-            <w:rStyle w:val="Hyperlink"/>
-            <w:noProof/>
-          </w:rPr>
-          <w:t>m</w:t>
-        </w:r>
-        <w:r>
-          <w:rPr>
-            <w:rStyle w:val="Hyperlink"/>
-            <w:noProof/>
-          </w:rPr>
-          <w:t>ičar uspešno dobija predlog tima i prihvata ga</w:t>
+          <w:t>Takmičar uspešno dobija predlog tima i prihvata ga</w:t>
         </w:r>
         <w:r>
           <w:rPr>
@@ -1805,7 +1791,7 @@
         <w:pStyle w:val="PSITitle"/>
         <w:numPr>
           <w:ilvl w:val="0"/>
-          <w:numId w:val="52"/>
+          <w:numId w:val="9"/>
         </w:numPr>
       </w:pPr>
       <w:bookmarkStart w:id="2" w:name="_Toc226811052"/>
@@ -1884,7 +1870,7 @@
         <w:pStyle w:val="ListParagraph"/>
         <w:numPr>
           <w:ilvl w:val="0"/>
-          <w:numId w:val="29"/>
+          <w:numId w:val="7"/>
         </w:numPr>
         <w:rPr>
           <w:rFonts w:ascii="Space Grotesk" w:hAnsi="Space Grotesk"/>
@@ -1904,7 +1890,7 @@
         <w:pStyle w:val="ListParagraph"/>
         <w:numPr>
           <w:ilvl w:val="0"/>
-          <w:numId w:val="29"/>
+          <w:numId w:val="7"/>
         </w:numPr>
         <w:rPr>
           <w:rFonts w:ascii="Space Grotesk" w:hAnsi="Space Grotesk"/>
@@ -1924,7 +1910,7 @@
         <w:pStyle w:val="ListParagraph"/>
         <w:numPr>
           <w:ilvl w:val="0"/>
-          <w:numId w:val="29"/>
+          <w:numId w:val="7"/>
         </w:numPr>
         <w:rPr>
           <w:rFonts w:ascii="Space Grotesk" w:hAnsi="Space Grotesk"/>
@@ -1944,7 +1930,7 @@
         <w:pStyle w:val="ListParagraph"/>
         <w:numPr>
           <w:ilvl w:val="0"/>
-          <w:numId w:val="29"/>
+          <w:numId w:val="7"/>
         </w:numPr>
         <w:rPr>
           <w:rFonts w:ascii="Space Grotesk" w:hAnsi="Space Grotesk"/>
@@ -2235,6 +2221,7 @@
               <w:ind w:left="0"/>
             </w:pPr>
             <w:r>
+              <w:lastRenderedPageBreak/>
               <w:t>5.</w:t>
             </w:r>
           </w:p>
@@ -2283,7 +2270,6 @@
       <w:bookmarkStart w:id="12" w:name="_Toc226811057"/>
       <w:bookmarkStart w:id="13" w:name="_Toc226811179"/>
       <w:r>
-        <w:lastRenderedPageBreak/>
         <w:t>Scenario AI uparivanja timova</w:t>
       </w:r>
       <w:bookmarkEnd w:id="12"/>
@@ -2344,7 +2330,7 @@
         <w:pStyle w:val="PSISubtitle"/>
         <w:numPr>
           <w:ilvl w:val="2"/>
-          <w:numId w:val="10"/>
+          <w:numId w:val="1"/>
         </w:numPr>
       </w:pPr>
       <w:r>
@@ -2363,7 +2349,7 @@
         <w:pStyle w:val="PSItext"/>
         <w:numPr>
           <w:ilvl w:val="0"/>
-          <w:numId w:val="21"/>
+          <w:numId w:val="2"/>
         </w:numPr>
       </w:pPr>
       <w:r>
@@ -2375,7 +2361,7 @@
         <w:pStyle w:val="PSItext"/>
         <w:numPr>
           <w:ilvl w:val="0"/>
-          <w:numId w:val="21"/>
+          <w:numId w:val="2"/>
         </w:numPr>
       </w:pPr>
       <w:r>
@@ -2387,7 +2373,7 @@
         <w:pStyle w:val="PSItext"/>
         <w:numPr>
           <w:ilvl w:val="0"/>
-          <w:numId w:val="21"/>
+          <w:numId w:val="2"/>
         </w:numPr>
       </w:pPr>
       <w:r>
@@ -2399,7 +2385,7 @@
         <w:pStyle w:val="PSItext"/>
         <w:numPr>
           <w:ilvl w:val="0"/>
-          <w:numId w:val="21"/>
+          <w:numId w:val="2"/>
         </w:numPr>
       </w:pPr>
       <w:r>
@@ -2411,7 +2397,7 @@
         <w:pStyle w:val="PSItext"/>
         <w:numPr>
           <w:ilvl w:val="0"/>
-          <w:numId w:val="21"/>
+          <w:numId w:val="2"/>
         </w:numPr>
       </w:pPr>
       <w:r>
@@ -2423,7 +2409,7 @@
         <w:pStyle w:val="PSItext"/>
         <w:numPr>
           <w:ilvl w:val="0"/>
-          <w:numId w:val="21"/>
+          <w:numId w:val="2"/>
         </w:numPr>
       </w:pPr>
       <w:r>
@@ -2435,10 +2421,11 @@
         <w:pStyle w:val="PSItext"/>
         <w:numPr>
           <w:ilvl w:val="0"/>
-          <w:numId w:val="21"/>
+          <w:numId w:val="2"/>
         </w:numPr>
       </w:pPr>
       <w:r>
+        <w:lastRenderedPageBreak/>
         <w:t>Svi pozvani korisnici prihvataju poziv. Sistem zvanično formira tim, ažurira statuse svih članova i kreira grupni kanal tima na serveru hakathona.</w:t>
       </w:r>
     </w:p>
@@ -2452,7 +2439,7 @@
         <w:pStyle w:val="PSISubtitle"/>
         <w:numPr>
           <w:ilvl w:val="2"/>
-          <w:numId w:val="10"/>
+          <w:numId w:val="1"/>
         </w:numPr>
       </w:pPr>
       <w:r>
@@ -2471,7 +2458,7 @@
         <w:pStyle w:val="PSItext"/>
         <w:numPr>
           <w:ilvl w:val="0"/>
-          <w:numId w:val="22"/>
+          <w:numId w:val="3"/>
         </w:numPr>
       </w:pPr>
       <w:r>
@@ -2483,7 +2470,7 @@
         <w:pStyle w:val="PSItext"/>
         <w:numPr>
           <w:ilvl w:val="0"/>
-          <w:numId w:val="22"/>
+          <w:numId w:val="3"/>
         </w:numPr>
       </w:pPr>
       <w:r>
@@ -2495,7 +2482,7 @@
         <w:pStyle w:val="PSItext"/>
         <w:numPr>
           <w:ilvl w:val="0"/>
-          <w:numId w:val="22"/>
+          <w:numId w:val="3"/>
         </w:numPr>
       </w:pPr>
       <w:r>
@@ -2507,11 +2494,10 @@
         <w:pStyle w:val="PSItext"/>
         <w:numPr>
           <w:ilvl w:val="0"/>
-          <w:numId w:val="22"/>
+          <w:numId w:val="3"/>
         </w:numPr>
       </w:pPr>
       <w:r>
-        <w:lastRenderedPageBreak/>
         <w:t>Sistem prikazuje novi predlog takmičaru. Takmičar nastavlja po scenariju 2.2.1 od koraka 5.</w:t>
       </w:r>
     </w:p>
@@ -2525,7 +2511,7 @@
         <w:pStyle w:val="PSISubtitle"/>
         <w:numPr>
           <w:ilvl w:val="2"/>
-          <w:numId w:val="10"/>
+          <w:numId w:val="1"/>
         </w:numPr>
       </w:pPr>
       <w:r>
@@ -2544,7 +2530,7 @@
         <w:pStyle w:val="PSItext"/>
         <w:numPr>
           <w:ilvl w:val="0"/>
-          <w:numId w:val="23"/>
+          <w:numId w:val="4"/>
         </w:numPr>
       </w:pPr>
       <w:r>
@@ -2556,7 +2542,7 @@
         <w:pStyle w:val="PSItext"/>
         <w:numPr>
           <w:ilvl w:val="0"/>
-          <w:numId w:val="23"/>
+          <w:numId w:val="4"/>
         </w:numPr>
       </w:pPr>
       <w:r>
@@ -2568,7 +2554,7 @@
         <w:pStyle w:val="PSItext"/>
         <w:numPr>
           <w:ilvl w:val="0"/>
-          <w:numId w:val="23"/>
+          <w:numId w:val="4"/>
         </w:numPr>
       </w:pPr>
       <w:r>
@@ -2580,7 +2566,7 @@
         <w:pStyle w:val="PSItext"/>
         <w:numPr>
           <w:ilvl w:val="0"/>
-          <w:numId w:val="23"/>
+          <w:numId w:val="4"/>
         </w:numPr>
       </w:pPr>
       <w:r>
@@ -2597,7 +2583,7 @@
         <w:pStyle w:val="PSISubtitle"/>
         <w:numPr>
           <w:ilvl w:val="2"/>
-          <w:numId w:val="10"/>
+          <w:numId w:val="1"/>
         </w:numPr>
       </w:pPr>
       <w:r>
@@ -2616,7 +2602,7 @@
         <w:pStyle w:val="PSItext"/>
         <w:numPr>
           <w:ilvl w:val="0"/>
-          <w:numId w:val="24"/>
+          <w:numId w:val="5"/>
         </w:numPr>
       </w:pPr>
       <w:r>
@@ -2628,7 +2614,7 @@
         <w:pStyle w:val="PSItext"/>
         <w:numPr>
           <w:ilvl w:val="0"/>
-          <w:numId w:val="24"/>
+          <w:numId w:val="5"/>
         </w:numPr>
       </w:pPr>
       <w:r>
@@ -2640,7 +2626,7 @@
         <w:pStyle w:val="PSItext"/>
         <w:numPr>
           <w:ilvl w:val="0"/>
-          <w:numId w:val="24"/>
+          <w:numId w:val="5"/>
         </w:numPr>
       </w:pPr>
       <w:r>
@@ -2652,10 +2638,11 @@
         <w:pStyle w:val="PSItext"/>
         <w:numPr>
           <w:ilvl w:val="0"/>
-          <w:numId w:val="24"/>
+          <w:numId w:val="5"/>
         </w:numPr>
       </w:pPr>
       <w:r>
+        <w:lastRenderedPageBreak/>
         <w:t>Inicijator pokreće novu analizu. Sistem nastavlja po scenariju 2.2.1 od koraka 3, uz isključivanje korisnika koji je odbio poziv iz skupa kandidata.</w:t>
       </w:r>
     </w:p>
@@ -2669,7 +2656,7 @@
         <w:pStyle w:val="PSISubtitle"/>
         <w:numPr>
           <w:ilvl w:val="2"/>
-          <w:numId w:val="10"/>
+          <w:numId w:val="1"/>
         </w:numPr>
       </w:pPr>
       <w:r>
@@ -2694,7 +2681,7 @@
         <w:pStyle w:val="PSItext"/>
         <w:numPr>
           <w:ilvl w:val="0"/>
-          <w:numId w:val="25"/>
+          <w:numId w:val="6"/>
         </w:numPr>
       </w:pPr>
       <w:r>
@@ -2706,7 +2693,7 @@
         <w:pStyle w:val="PSItext"/>
         <w:numPr>
           <w:ilvl w:val="0"/>
-          <w:numId w:val="25"/>
+          <w:numId w:val="6"/>
         </w:numPr>
       </w:pPr>
       <w:r>
@@ -2718,7 +2705,7 @@
         <w:pStyle w:val="PSItext"/>
         <w:numPr>
           <w:ilvl w:val="0"/>
-          <w:numId w:val="25"/>
+          <w:numId w:val="6"/>
         </w:numPr>
       </w:pPr>
       <w:r>
@@ -2753,7 +2740,7 @@
         <w:pStyle w:val="ListParagraph"/>
         <w:numPr>
           <w:ilvl w:val="0"/>
-          <w:numId w:val="30"/>
+          <w:numId w:val="8"/>
         </w:numPr>
         <w:rPr>
           <w:rFonts w:ascii="Space Grotesk" w:hAnsi="Space Grotesk"/>
@@ -2773,7 +2760,7 @@
         <w:pStyle w:val="ListParagraph"/>
         <w:numPr>
           <w:ilvl w:val="0"/>
-          <w:numId w:val="30"/>
+          <w:numId w:val="8"/>
         </w:numPr>
         <w:rPr>
           <w:rFonts w:ascii="Space Grotesk" w:hAnsi="Space Grotesk"/>
@@ -2793,7 +2780,7 @@
         <w:pStyle w:val="ListParagraph"/>
         <w:numPr>
           <w:ilvl w:val="0"/>
-          <w:numId w:val="30"/>
+          <w:numId w:val="8"/>
         </w:numPr>
         <w:rPr>
           <w:rFonts w:ascii="Space Grotesk" w:hAnsi="Space Grotesk"/>
@@ -2813,7 +2800,7 @@
         <w:pStyle w:val="ListParagraph"/>
         <w:numPr>
           <w:ilvl w:val="0"/>
-          <w:numId w:val="30"/>
+          <w:numId w:val="8"/>
         </w:numPr>
         <w:rPr>
           <w:rFonts w:ascii="Space Grotesk" w:hAnsi="Space Grotesk"/>
@@ -2825,7 +2812,6 @@
           <w:rFonts w:ascii="Space Grotesk" w:hAnsi="Space Grotesk"/>
           <w:lang w:val="sr-Latn-RS"/>
         </w:rPr>
-        <w:lastRenderedPageBreak/>
         <w:t>Privatnost: GitHub podaci se koriste isključivo za potrebe AI analize i nisu vidljivi trećim stranama van platforme.</w:t>
       </w:r>
     </w:p>
@@ -2834,7 +2820,7 @@
         <w:pStyle w:val="ListParagraph"/>
         <w:numPr>
           <w:ilvl w:val="0"/>
-          <w:numId w:val="30"/>
+          <w:numId w:val="8"/>
         </w:numPr>
         <w:rPr>
           <w:rFonts w:ascii="Space Grotesk" w:hAnsi="Space Grotesk"/>
@@ -2932,6 +2918,7 @@
       <w:bookmarkStart w:id="32" w:name="_Toc226811067"/>
       <w:bookmarkStart w:id="33" w:name="_Toc226811189"/>
       <w:r>
+        <w:lastRenderedPageBreak/>
         <w:t>Posledice</w:t>
       </w:r>
       <w:bookmarkEnd w:id="32"/>
@@ -3552,496 +3539,6 @@
 <file path=word/numbering.xml><?xml version="1.0" encoding="utf-8"?>
 <w:numbering xmlns:wpc="http://schemas.microsoft.com/office/word/2010/wordprocessingCanvas" xmlns:cx="http://schemas.microsoft.com/office/drawing/2014/chartex" xmlns:cx1="http://schemas.microsoft.com/office/drawing/2015/9/8/chartex" xmlns:cx2="http://schemas.microsoft.com/office/drawing/2015/10/21/chartex" xmlns:cx3="http://schemas.microsoft.com/office/drawing/2016/5/9/chartex" xmlns:cx4="http://schemas.microsoft.com/office/drawing/2016/5/10/chartex" xmlns:cx5="http://schemas.microsoft.com/office/drawing/2016/5/11/chartex" xmlns:cx6="http://schemas.microsoft.com/office/drawing/2016/5/12/chartex" xmlns:cx7="http://schemas.microsoft.com/office/drawing/2016/5/13/chartex" xmlns:cx8="http://schemas.microsoft.com/office/drawing/2016/5/14/chartex" xmlns:mc="http://schemas.openxmlformats.org/markup-compatibility/2006" xmlns:aink="http://schemas.microsoft.com/office/drawing/2016/ink" xmlns:am3d="http://schemas.microsoft.com/office/drawing/2017/model3d" xmlns:o="urn:schemas-microsoft-com:office:office" xmlns:oel="http://schemas.microsoft.com/office/2019/extlst" xmlns:r="http://schemas.openxmlformats.org/officeDocument/2006/relationships" xmlns:m="http://schemas.openxmlformats.org/officeDocument/2006/math" xmlns:v="urn:schemas-microsoft-com:vml" xmlns:wp14="http://schemas.microsoft.com/office/word/2010/wordprocessingDrawing" xmlns:wp="http://schemas.openxmlformats.org/drawingml/2006/wordprocessingDrawing" xmlns:w10="urn:schemas-microsoft-com:office:word" xmlns:w="http://schemas.openxmlformats.org/wordprocessingml/2006/main" xmlns:w14="http://schemas.microsoft.com/office/word/2010/wordml" xmlns:w15="http://schemas.microsoft.com/office/word/2012/wordml" xmlns:w16cex="http://schemas.microsoft.com/office/word/2018/wordml/cex" xmlns:w16cid="http://schemas.microsoft.com/office/word/2016/wordml/cid" xmlns:w16="http://schemas.microsoft.com/office/word/2018/wordml" xmlns:w16du="http://schemas.microsoft.com/office/word/2023/wordml/word16du" xmlns:w16sdtdh="http://schemas.microsoft.com/office/word/2020/wordml/sdtdatahash" xmlns:w16sdtfl="http://schemas.microsoft.com/office/word/2024/wordml/sdtformatlock" xmlns:w16se="http://schemas.microsoft.com/office/word/2015/wordml/symex" xmlns:wpg="http://schemas.microsoft.com/office/word/2010/wordprocessingGroup" xmlns:wpi="http://schemas.microsoft.com/office/word/2010/wordprocessingInk" xmlns:wne="http://schemas.microsoft.com/office/word/2006/wordml" xmlns:wps="http://schemas.microsoft.com/office/word/2010/wordprocessingShape" mc:Ignorable="w14 w15 w16se w16cid w16 w16cex w16sdtdh w16sdtfl w16du wp14">
   <w:abstractNum w:abstractNumId="0" w15:restartNumberingAfterBreak="0">
-    <w:nsid w:val="094D0E11"/>
-    <w:multiLevelType w:val="hybridMultilevel"/>
-    <w:tmpl w:val="B5948698"/>
-    <w:lvl w:ilvl="0" w:tplc="08090001">
-      <w:start w:val="1"/>
-      <w:numFmt w:val="bullet"/>
-      <w:lvlText w:val=""/>
-      <w:lvlJc w:val="left"/>
-      <w:pPr>
-        <w:ind w:left="1060" w:hanging="360"/>
-      </w:pPr>
-      <w:rPr>
-        <w:rFonts w:ascii="Symbol" w:hAnsi="Symbol" w:hint="default"/>
-      </w:rPr>
-    </w:lvl>
-    <w:lvl w:ilvl="1" w:tplc="08090003" w:tentative="1">
-      <w:start w:val="1"/>
-      <w:numFmt w:val="bullet"/>
-      <w:lvlText w:val="o"/>
-      <w:lvlJc w:val="left"/>
-      <w:pPr>
-        <w:ind w:left="1780" w:hanging="360"/>
-      </w:pPr>
-      <w:rPr>
-        <w:rFonts w:ascii="Courier New" w:hAnsi="Courier New" w:cs="Courier New" w:hint="default"/>
-      </w:rPr>
-    </w:lvl>
-    <w:lvl w:ilvl="2" w:tplc="08090005" w:tentative="1">
-      <w:start w:val="1"/>
-      <w:numFmt w:val="bullet"/>
-      <w:lvlText w:val=""/>
-      <w:lvlJc w:val="left"/>
-      <w:pPr>
-        <w:ind w:left="2500" w:hanging="360"/>
-      </w:pPr>
-      <w:rPr>
-        <w:rFonts w:ascii="Wingdings" w:hAnsi="Wingdings" w:hint="default"/>
-      </w:rPr>
-    </w:lvl>
-    <w:lvl w:ilvl="3" w:tplc="08090001" w:tentative="1">
-      <w:start w:val="1"/>
-      <w:numFmt w:val="bullet"/>
-      <w:lvlText w:val=""/>
-      <w:lvlJc w:val="left"/>
-      <w:pPr>
-        <w:ind w:left="3220" w:hanging="360"/>
-      </w:pPr>
-      <w:rPr>
-        <w:rFonts w:ascii="Symbol" w:hAnsi="Symbol" w:hint="default"/>
-      </w:rPr>
-    </w:lvl>
-    <w:lvl w:ilvl="4" w:tplc="08090003" w:tentative="1">
-      <w:start w:val="1"/>
-      <w:numFmt w:val="bullet"/>
-      <w:lvlText w:val="o"/>
-      <w:lvlJc w:val="left"/>
-      <w:pPr>
-        <w:ind w:left="3940" w:hanging="360"/>
-      </w:pPr>
-      <w:rPr>
-        <w:rFonts w:ascii="Courier New" w:hAnsi="Courier New" w:cs="Courier New" w:hint="default"/>
-      </w:rPr>
-    </w:lvl>
-    <w:lvl w:ilvl="5" w:tplc="08090005" w:tentative="1">
-      <w:start w:val="1"/>
-      <w:numFmt w:val="bullet"/>
-      <w:lvlText w:val=""/>
-      <w:lvlJc w:val="left"/>
-      <w:pPr>
-        <w:ind w:left="4660" w:hanging="360"/>
-      </w:pPr>
-      <w:rPr>
-        <w:rFonts w:ascii="Wingdings" w:hAnsi="Wingdings" w:hint="default"/>
-      </w:rPr>
-    </w:lvl>
-    <w:lvl w:ilvl="6" w:tplc="08090001" w:tentative="1">
-      <w:start w:val="1"/>
-      <w:numFmt w:val="bullet"/>
-      <w:lvlText w:val=""/>
-      <w:lvlJc w:val="left"/>
-      <w:pPr>
-        <w:ind w:left="5380" w:hanging="360"/>
-      </w:pPr>
-      <w:rPr>
-        <w:rFonts w:ascii="Symbol" w:hAnsi="Symbol" w:hint="default"/>
-      </w:rPr>
-    </w:lvl>
-    <w:lvl w:ilvl="7" w:tplc="08090003" w:tentative="1">
-      <w:start w:val="1"/>
-      <w:numFmt w:val="bullet"/>
-      <w:lvlText w:val="o"/>
-      <w:lvlJc w:val="left"/>
-      <w:pPr>
-        <w:ind w:left="6100" w:hanging="360"/>
-      </w:pPr>
-      <w:rPr>
-        <w:rFonts w:ascii="Courier New" w:hAnsi="Courier New" w:cs="Courier New" w:hint="default"/>
-      </w:rPr>
-    </w:lvl>
-    <w:lvl w:ilvl="8" w:tplc="08090005" w:tentative="1">
-      <w:start w:val="1"/>
-      <w:numFmt w:val="bullet"/>
-      <w:lvlText w:val=""/>
-      <w:lvlJc w:val="left"/>
-      <w:pPr>
-        <w:ind w:left="6820" w:hanging="360"/>
-      </w:pPr>
-      <w:rPr>
-        <w:rFonts w:ascii="Wingdings" w:hAnsi="Wingdings" w:hint="default"/>
-      </w:rPr>
-    </w:lvl>
-  </w:abstractNum>
-  <w:abstractNum w:abstractNumId="1" w15:restartNumberingAfterBreak="0">
-    <w:nsid w:val="0D912241"/>
-    <w:multiLevelType w:val="hybridMultilevel"/>
-    <w:tmpl w:val="83827726"/>
-    <w:lvl w:ilvl="0" w:tplc="FFFFFFFF">
-      <w:start w:val="5"/>
-      <w:numFmt w:val="decimal"/>
-      <w:lvlText w:val="%1."/>
-      <w:lvlJc w:val="left"/>
-      <w:pPr>
-        <w:ind w:left="1514" w:hanging="360"/>
-      </w:pPr>
-      <w:rPr>
-        <w:rFonts w:hint="default"/>
-      </w:rPr>
-    </w:lvl>
-    <w:lvl w:ilvl="1" w:tplc="FFFFFFFF">
-      <w:start w:val="1"/>
-      <w:numFmt w:val="lowerLetter"/>
-      <w:lvlText w:val="%2."/>
-      <w:lvlJc w:val="left"/>
-      <w:pPr>
-        <w:ind w:left="1440" w:hanging="360"/>
-      </w:pPr>
-    </w:lvl>
-    <w:lvl w:ilvl="2" w:tplc="FFFFFFFF">
-      <w:start w:val="1"/>
-      <w:numFmt w:val="bullet"/>
-      <w:lvlText w:val=""/>
-      <w:lvlJc w:val="left"/>
-      <w:pPr>
-        <w:ind w:left="2340" w:hanging="360"/>
-      </w:pPr>
-      <w:rPr>
-        <w:rFonts w:ascii="Symbol" w:hAnsi="Symbol" w:hint="default"/>
-      </w:rPr>
-    </w:lvl>
-    <w:lvl w:ilvl="3" w:tplc="FFFFFFFF" w:tentative="1">
-      <w:start w:val="1"/>
-      <w:numFmt w:val="decimal"/>
-      <w:lvlText w:val="%4."/>
-      <w:lvlJc w:val="left"/>
-      <w:pPr>
-        <w:ind w:left="2880" w:hanging="360"/>
-      </w:pPr>
-    </w:lvl>
-    <w:lvl w:ilvl="4" w:tplc="FFFFFFFF" w:tentative="1">
-      <w:start w:val="1"/>
-      <w:numFmt w:val="lowerLetter"/>
-      <w:lvlText w:val="%5."/>
-      <w:lvlJc w:val="left"/>
-      <w:pPr>
-        <w:ind w:left="3600" w:hanging="360"/>
-      </w:pPr>
-    </w:lvl>
-    <w:lvl w:ilvl="5" w:tplc="FFFFFFFF" w:tentative="1">
-      <w:start w:val="1"/>
-      <w:numFmt w:val="lowerRoman"/>
-      <w:lvlText w:val="%6."/>
-      <w:lvlJc w:val="right"/>
-      <w:pPr>
-        <w:ind w:left="4320" w:hanging="180"/>
-      </w:pPr>
-    </w:lvl>
-    <w:lvl w:ilvl="6" w:tplc="FFFFFFFF" w:tentative="1">
-      <w:start w:val="1"/>
-      <w:numFmt w:val="decimal"/>
-      <w:lvlText w:val="%7."/>
-      <w:lvlJc w:val="left"/>
-      <w:pPr>
-        <w:ind w:left="5040" w:hanging="360"/>
-      </w:pPr>
-    </w:lvl>
-    <w:lvl w:ilvl="7" w:tplc="FFFFFFFF" w:tentative="1">
-      <w:start w:val="1"/>
-      <w:numFmt w:val="lowerLetter"/>
-      <w:lvlText w:val="%8."/>
-      <w:lvlJc w:val="left"/>
-      <w:pPr>
-        <w:ind w:left="5760" w:hanging="360"/>
-      </w:pPr>
-    </w:lvl>
-    <w:lvl w:ilvl="8" w:tplc="FFFFFFFF" w:tentative="1">
-      <w:start w:val="1"/>
-      <w:numFmt w:val="lowerRoman"/>
-      <w:lvlText w:val="%9."/>
-      <w:lvlJc w:val="right"/>
-      <w:pPr>
-        <w:ind w:left="6480" w:hanging="180"/>
-      </w:pPr>
-    </w:lvl>
-  </w:abstractNum>
-  <w:abstractNum w:abstractNumId="2" w15:restartNumberingAfterBreak="0">
-    <w:nsid w:val="13C22043"/>
-    <w:multiLevelType w:val="multilevel"/>
-    <w:tmpl w:val="561CEEFA"/>
-    <w:lvl w:ilvl="0">
-      <w:start w:val="1"/>
-      <w:numFmt w:val="decimal"/>
-      <w:lvlText w:val="%1)"/>
-      <w:lvlJc w:val="left"/>
-      <w:pPr>
-        <w:ind w:left="360" w:hanging="360"/>
-      </w:pPr>
-      <w:rPr>
-        <w:rFonts w:hint="default"/>
-      </w:rPr>
-    </w:lvl>
-    <w:lvl w:ilvl="1">
-      <w:start w:val="1"/>
-      <w:numFmt w:val="lowerLetter"/>
-      <w:lvlText w:val="%2)"/>
-      <w:lvlJc w:val="left"/>
-      <w:pPr>
-        <w:ind w:left="720" w:hanging="360"/>
-      </w:pPr>
-      <w:rPr>
-        <w:rFonts w:hint="default"/>
-      </w:rPr>
-    </w:lvl>
-    <w:lvl w:ilvl="2">
-      <w:start w:val="1"/>
-      <w:numFmt w:val="lowerRoman"/>
-      <w:lvlText w:val="%3)"/>
-      <w:lvlJc w:val="left"/>
-      <w:pPr>
-        <w:ind w:left="1080" w:hanging="360"/>
-      </w:pPr>
-      <w:rPr>
-        <w:rFonts w:hint="default"/>
-      </w:rPr>
-    </w:lvl>
-    <w:lvl w:ilvl="3">
-      <w:start w:val="1"/>
-      <w:numFmt w:val="decimal"/>
-      <w:lvlText w:val="(%4)"/>
-      <w:lvlJc w:val="left"/>
-      <w:pPr>
-        <w:ind w:left="1440" w:hanging="360"/>
-      </w:pPr>
-      <w:rPr>
-        <w:rFonts w:hint="default"/>
-      </w:rPr>
-    </w:lvl>
-    <w:lvl w:ilvl="4">
-      <w:start w:val="1"/>
-      <w:numFmt w:val="lowerLetter"/>
-      <w:lvlText w:val="(%5)"/>
-      <w:lvlJc w:val="left"/>
-      <w:pPr>
-        <w:ind w:left="1800" w:hanging="360"/>
-      </w:pPr>
-      <w:rPr>
-        <w:rFonts w:hint="default"/>
-      </w:rPr>
-    </w:lvl>
-    <w:lvl w:ilvl="5">
-      <w:start w:val="1"/>
-      <w:numFmt w:val="lowerRoman"/>
-      <w:lvlText w:val="(%6)"/>
-      <w:lvlJc w:val="left"/>
-      <w:pPr>
-        <w:ind w:left="2160" w:hanging="360"/>
-      </w:pPr>
-      <w:rPr>
-        <w:rFonts w:hint="default"/>
-      </w:rPr>
-    </w:lvl>
-    <w:lvl w:ilvl="6">
-      <w:start w:val="1"/>
-      <w:numFmt w:val="decimal"/>
-      <w:lvlText w:val="%7."/>
-      <w:lvlJc w:val="left"/>
-      <w:pPr>
-        <w:ind w:left="2520" w:hanging="360"/>
-      </w:pPr>
-      <w:rPr>
-        <w:rFonts w:hint="default"/>
-      </w:rPr>
-    </w:lvl>
-    <w:lvl w:ilvl="7">
-      <w:start w:val="1"/>
-      <w:numFmt w:val="lowerLetter"/>
-      <w:lvlText w:val="%8."/>
-      <w:lvlJc w:val="left"/>
-      <w:pPr>
-        <w:ind w:left="2880" w:hanging="360"/>
-      </w:pPr>
-      <w:rPr>
-        <w:rFonts w:hint="default"/>
-      </w:rPr>
-    </w:lvl>
-    <w:lvl w:ilvl="8">
-      <w:start w:val="1"/>
-      <w:numFmt w:val="lowerRoman"/>
-      <w:lvlText w:val="%9."/>
-      <w:lvlJc w:val="left"/>
-      <w:pPr>
-        <w:ind w:left="3240" w:hanging="360"/>
-      </w:pPr>
-      <w:rPr>
-        <w:rFonts w:hint="default"/>
-      </w:rPr>
-    </w:lvl>
-  </w:abstractNum>
-  <w:abstractNum w:abstractNumId="3" w15:restartNumberingAfterBreak="0">
-    <w:nsid w:val="15F933DE"/>
-    <w:multiLevelType w:val="hybridMultilevel"/>
-    <w:tmpl w:val="51129E04"/>
-    <w:lvl w:ilvl="0" w:tplc="FFFFFFFF">
-      <w:start w:val="1"/>
-      <w:numFmt w:val="decimal"/>
-      <w:lvlText w:val="%1."/>
-      <w:lvlJc w:val="left"/>
-      <w:pPr>
-        <w:ind w:left="1514" w:hanging="360"/>
-      </w:pPr>
-    </w:lvl>
-    <w:lvl w:ilvl="1" w:tplc="FFFFFFFF" w:tentative="1">
-      <w:start w:val="1"/>
-      <w:numFmt w:val="lowerLetter"/>
-      <w:lvlText w:val="%2."/>
-      <w:lvlJc w:val="left"/>
-      <w:pPr>
-        <w:ind w:left="2234" w:hanging="360"/>
-      </w:pPr>
-    </w:lvl>
-    <w:lvl w:ilvl="2" w:tplc="FFFFFFFF" w:tentative="1">
-      <w:start w:val="1"/>
-      <w:numFmt w:val="lowerRoman"/>
-      <w:lvlText w:val="%3."/>
-      <w:lvlJc w:val="right"/>
-      <w:pPr>
-        <w:ind w:left="2954" w:hanging="180"/>
-      </w:pPr>
-    </w:lvl>
-    <w:lvl w:ilvl="3" w:tplc="FFFFFFFF" w:tentative="1">
-      <w:start w:val="1"/>
-      <w:numFmt w:val="decimal"/>
-      <w:lvlText w:val="%4."/>
-      <w:lvlJc w:val="left"/>
-      <w:pPr>
-        <w:ind w:left="3674" w:hanging="360"/>
-      </w:pPr>
-    </w:lvl>
-    <w:lvl w:ilvl="4" w:tplc="FFFFFFFF" w:tentative="1">
-      <w:start w:val="1"/>
-      <w:numFmt w:val="lowerLetter"/>
-      <w:lvlText w:val="%5."/>
-      <w:lvlJc w:val="left"/>
-      <w:pPr>
-        <w:ind w:left="4394" w:hanging="360"/>
-      </w:pPr>
-    </w:lvl>
-    <w:lvl w:ilvl="5" w:tplc="FFFFFFFF" w:tentative="1">
-      <w:start w:val="1"/>
-      <w:numFmt w:val="lowerRoman"/>
-      <w:lvlText w:val="%6."/>
-      <w:lvlJc w:val="right"/>
-      <w:pPr>
-        <w:ind w:left="5114" w:hanging="180"/>
-      </w:pPr>
-    </w:lvl>
-    <w:lvl w:ilvl="6" w:tplc="FFFFFFFF" w:tentative="1">
-      <w:start w:val="1"/>
-      <w:numFmt w:val="decimal"/>
-      <w:lvlText w:val="%7."/>
-      <w:lvlJc w:val="left"/>
-      <w:pPr>
-        <w:ind w:left="5834" w:hanging="360"/>
-      </w:pPr>
-    </w:lvl>
-    <w:lvl w:ilvl="7" w:tplc="FFFFFFFF" w:tentative="1">
-      <w:start w:val="1"/>
-      <w:numFmt w:val="lowerLetter"/>
-      <w:lvlText w:val="%8."/>
-      <w:lvlJc w:val="left"/>
-      <w:pPr>
-        <w:ind w:left="6554" w:hanging="360"/>
-      </w:pPr>
-    </w:lvl>
-    <w:lvl w:ilvl="8" w:tplc="FFFFFFFF" w:tentative="1">
-      <w:start w:val="1"/>
-      <w:numFmt w:val="lowerRoman"/>
-      <w:lvlText w:val="%9."/>
-      <w:lvlJc w:val="right"/>
-      <w:pPr>
-        <w:ind w:left="7274" w:hanging="180"/>
-      </w:pPr>
-    </w:lvl>
-  </w:abstractNum>
-  <w:abstractNum w:abstractNumId="4" w15:restartNumberingAfterBreak="0">
-    <w:nsid w:val="17B103E7"/>
-    <w:multiLevelType w:val="hybridMultilevel"/>
-    <w:tmpl w:val="38DEE7DC"/>
-    <w:lvl w:ilvl="0" w:tplc="0809000F">
-      <w:start w:val="1"/>
-      <w:numFmt w:val="decimal"/>
-      <w:lvlText w:val="%1."/>
-      <w:lvlJc w:val="left"/>
-      <w:pPr>
-        <w:ind w:left="1514" w:hanging="360"/>
-      </w:pPr>
-    </w:lvl>
-    <w:lvl w:ilvl="1" w:tplc="08090019" w:tentative="1">
-      <w:start w:val="1"/>
-      <w:numFmt w:val="lowerLetter"/>
-      <w:lvlText w:val="%2."/>
-      <w:lvlJc w:val="left"/>
-      <w:pPr>
-        <w:ind w:left="2234" w:hanging="360"/>
-      </w:pPr>
-    </w:lvl>
-    <w:lvl w:ilvl="2" w:tplc="0809001B" w:tentative="1">
-      <w:start w:val="1"/>
-      <w:numFmt w:val="lowerRoman"/>
-      <w:lvlText w:val="%3."/>
-      <w:lvlJc w:val="right"/>
-      <w:pPr>
-        <w:ind w:left="2954" w:hanging="180"/>
-      </w:pPr>
-    </w:lvl>
-    <w:lvl w:ilvl="3" w:tplc="0809000F" w:tentative="1">
-      <w:start w:val="1"/>
-      <w:numFmt w:val="decimal"/>
-      <w:lvlText w:val="%4."/>
-      <w:lvlJc w:val="left"/>
-      <w:pPr>
-        <w:ind w:left="3674" w:hanging="360"/>
-      </w:pPr>
-    </w:lvl>
-    <w:lvl w:ilvl="4" w:tplc="08090019" w:tentative="1">
-      <w:start w:val="1"/>
-      <w:numFmt w:val="lowerLetter"/>
-      <w:lvlText w:val="%5."/>
-      <w:lvlJc w:val="left"/>
-      <w:pPr>
-        <w:ind w:left="4394" w:hanging="360"/>
-      </w:pPr>
-    </w:lvl>
-    <w:lvl w:ilvl="5" w:tplc="0809001B" w:tentative="1">
-      <w:start w:val="1"/>
-      <w:numFmt w:val="lowerRoman"/>
-      <w:lvlText w:val="%6."/>
-      <w:lvlJc w:val="right"/>
-      <w:pPr>
-        <w:ind w:left="5114" w:hanging="180"/>
-      </w:pPr>
-    </w:lvl>
-    <w:lvl w:ilvl="6" w:tplc="0809000F" w:tentative="1">
-      <w:start w:val="1"/>
-      <w:numFmt w:val="decimal"/>
-      <w:lvlText w:val="%7."/>
-      <w:lvlJc w:val="left"/>
-      <w:pPr>
-        <w:ind w:left="5834" w:hanging="360"/>
-      </w:pPr>
-    </w:lvl>
-    <w:lvl w:ilvl="7" w:tplc="08090019" w:tentative="1">
-      <w:start w:val="1"/>
-      <w:numFmt w:val="lowerLetter"/>
-      <w:lvlText w:val="%8."/>
-      <w:lvlJc w:val="left"/>
-      <w:pPr>
-        <w:ind w:left="6554" w:hanging="360"/>
-      </w:pPr>
-    </w:lvl>
-    <w:lvl w:ilvl="8" w:tplc="0809001B" w:tentative="1">
-      <w:start w:val="1"/>
-      <w:numFmt w:val="lowerRoman"/>
-      <w:lvlText w:val="%9."/>
-      <w:lvlJc w:val="right"/>
-      <w:pPr>
-        <w:ind w:left="7274" w:hanging="180"/>
-      </w:pPr>
-    </w:lvl>
-  </w:abstractNum>
-  <w:abstractNum w:abstractNumId="5" w15:restartNumberingAfterBreak="0">
     <w:nsid w:val="17CF0A7F"/>
     <w:multiLevelType w:val="hybridMultilevel"/>
     <w:tmpl w:val="83827726"/>
@@ -4133,1240 +3630,7 @@
       </w:pPr>
     </w:lvl>
   </w:abstractNum>
-  <w:abstractNum w:abstractNumId="6" w15:restartNumberingAfterBreak="0">
-    <w:nsid w:val="1D0A4EB5"/>
-    <w:multiLevelType w:val="hybridMultilevel"/>
-    <w:tmpl w:val="811A26C0"/>
-    <w:lvl w:ilvl="0" w:tplc="08090001">
-      <w:start w:val="1"/>
-      <w:numFmt w:val="bullet"/>
-      <w:lvlText w:val=""/>
-      <w:lvlJc w:val="left"/>
-      <w:pPr>
-        <w:ind w:left="1514" w:hanging="360"/>
-      </w:pPr>
-      <w:rPr>
-        <w:rFonts w:ascii="Symbol" w:hAnsi="Symbol" w:hint="default"/>
-      </w:rPr>
-    </w:lvl>
-    <w:lvl w:ilvl="1" w:tplc="08090003" w:tentative="1">
-      <w:start w:val="1"/>
-      <w:numFmt w:val="bullet"/>
-      <w:lvlText w:val="o"/>
-      <w:lvlJc w:val="left"/>
-      <w:pPr>
-        <w:ind w:left="2234" w:hanging="360"/>
-      </w:pPr>
-      <w:rPr>
-        <w:rFonts w:ascii="Courier New" w:hAnsi="Courier New" w:cs="Courier New" w:hint="default"/>
-      </w:rPr>
-    </w:lvl>
-    <w:lvl w:ilvl="2" w:tplc="08090005" w:tentative="1">
-      <w:start w:val="1"/>
-      <w:numFmt w:val="bullet"/>
-      <w:lvlText w:val=""/>
-      <w:lvlJc w:val="left"/>
-      <w:pPr>
-        <w:ind w:left="2954" w:hanging="360"/>
-      </w:pPr>
-      <w:rPr>
-        <w:rFonts w:ascii="Wingdings" w:hAnsi="Wingdings" w:hint="default"/>
-      </w:rPr>
-    </w:lvl>
-    <w:lvl w:ilvl="3" w:tplc="08090001" w:tentative="1">
-      <w:start w:val="1"/>
-      <w:numFmt w:val="bullet"/>
-      <w:lvlText w:val=""/>
-      <w:lvlJc w:val="left"/>
-      <w:pPr>
-        <w:ind w:left="3674" w:hanging="360"/>
-      </w:pPr>
-      <w:rPr>
-        <w:rFonts w:ascii="Symbol" w:hAnsi="Symbol" w:hint="default"/>
-      </w:rPr>
-    </w:lvl>
-    <w:lvl w:ilvl="4" w:tplc="08090003" w:tentative="1">
-      <w:start w:val="1"/>
-      <w:numFmt w:val="bullet"/>
-      <w:lvlText w:val="o"/>
-      <w:lvlJc w:val="left"/>
-      <w:pPr>
-        <w:ind w:left="4394" w:hanging="360"/>
-      </w:pPr>
-      <w:rPr>
-        <w:rFonts w:ascii="Courier New" w:hAnsi="Courier New" w:cs="Courier New" w:hint="default"/>
-      </w:rPr>
-    </w:lvl>
-    <w:lvl w:ilvl="5" w:tplc="08090005" w:tentative="1">
-      <w:start w:val="1"/>
-      <w:numFmt w:val="bullet"/>
-      <w:lvlText w:val=""/>
-      <w:lvlJc w:val="left"/>
-      <w:pPr>
-        <w:ind w:left="5114" w:hanging="360"/>
-      </w:pPr>
-      <w:rPr>
-        <w:rFonts w:ascii="Wingdings" w:hAnsi="Wingdings" w:hint="default"/>
-      </w:rPr>
-    </w:lvl>
-    <w:lvl w:ilvl="6" w:tplc="08090001" w:tentative="1">
-      <w:start w:val="1"/>
-      <w:numFmt w:val="bullet"/>
-      <w:lvlText w:val=""/>
-      <w:lvlJc w:val="left"/>
-      <w:pPr>
-        <w:ind w:left="5834" w:hanging="360"/>
-      </w:pPr>
-      <w:rPr>
-        <w:rFonts w:ascii="Symbol" w:hAnsi="Symbol" w:hint="default"/>
-      </w:rPr>
-    </w:lvl>
-    <w:lvl w:ilvl="7" w:tplc="08090003" w:tentative="1">
-      <w:start w:val="1"/>
-      <w:numFmt w:val="bullet"/>
-      <w:lvlText w:val="o"/>
-      <w:lvlJc w:val="left"/>
-      <w:pPr>
-        <w:ind w:left="6554" w:hanging="360"/>
-      </w:pPr>
-      <w:rPr>
-        <w:rFonts w:ascii="Courier New" w:hAnsi="Courier New" w:cs="Courier New" w:hint="default"/>
-      </w:rPr>
-    </w:lvl>
-    <w:lvl w:ilvl="8" w:tplc="08090005" w:tentative="1">
-      <w:start w:val="1"/>
-      <w:numFmt w:val="bullet"/>
-      <w:lvlText w:val=""/>
-      <w:lvlJc w:val="left"/>
-      <w:pPr>
-        <w:ind w:left="7274" w:hanging="360"/>
-      </w:pPr>
-      <w:rPr>
-        <w:rFonts w:ascii="Wingdings" w:hAnsi="Wingdings" w:hint="default"/>
-      </w:rPr>
-    </w:lvl>
-  </w:abstractNum>
-  <w:abstractNum w:abstractNumId="7" w15:restartNumberingAfterBreak="0">
-    <w:nsid w:val="1DAA2A35"/>
-    <w:multiLevelType w:val="hybridMultilevel"/>
-    <w:tmpl w:val="F09C599C"/>
-    <w:lvl w:ilvl="0" w:tplc="14AA35EE">
-      <w:start w:val="1"/>
-      <w:numFmt w:val="decimal"/>
-      <w:lvlText w:val="%1."/>
-      <w:lvlJc w:val="left"/>
-      <w:pPr>
-        <w:ind w:left="720" w:hanging="360"/>
-      </w:pPr>
-    </w:lvl>
-    <w:lvl w:ilvl="1" w:tplc="6F962934">
-      <w:numFmt w:val="decimal"/>
-      <w:lvlText w:val=""/>
-      <w:lvlJc w:val="left"/>
-      <w:pPr>
-        <w:ind w:left="0" w:firstLine="0"/>
-      </w:pPr>
-    </w:lvl>
-    <w:lvl w:ilvl="2" w:tplc="1FA67FB6">
-      <w:numFmt w:val="decimal"/>
-      <w:lvlText w:val=""/>
-      <w:lvlJc w:val="left"/>
-      <w:pPr>
-        <w:ind w:left="0" w:firstLine="0"/>
-      </w:pPr>
-    </w:lvl>
-    <w:lvl w:ilvl="3" w:tplc="F7DECA76">
-      <w:numFmt w:val="decimal"/>
-      <w:lvlText w:val=""/>
-      <w:lvlJc w:val="left"/>
-      <w:pPr>
-        <w:ind w:left="0" w:firstLine="0"/>
-      </w:pPr>
-    </w:lvl>
-    <w:lvl w:ilvl="4" w:tplc="B2423776">
-      <w:numFmt w:val="decimal"/>
-      <w:lvlText w:val=""/>
-      <w:lvlJc w:val="left"/>
-      <w:pPr>
-        <w:ind w:left="0" w:firstLine="0"/>
-      </w:pPr>
-    </w:lvl>
-    <w:lvl w:ilvl="5" w:tplc="007620F6">
-      <w:numFmt w:val="decimal"/>
-      <w:lvlText w:val=""/>
-      <w:lvlJc w:val="left"/>
-      <w:pPr>
-        <w:ind w:left="0" w:firstLine="0"/>
-      </w:pPr>
-    </w:lvl>
-    <w:lvl w:ilvl="6" w:tplc="07C20742">
-      <w:numFmt w:val="decimal"/>
-      <w:lvlText w:val=""/>
-      <w:lvlJc w:val="left"/>
-      <w:pPr>
-        <w:ind w:left="0" w:firstLine="0"/>
-      </w:pPr>
-    </w:lvl>
-    <w:lvl w:ilvl="7" w:tplc="DE10CA52">
-      <w:numFmt w:val="decimal"/>
-      <w:lvlText w:val=""/>
-      <w:lvlJc w:val="left"/>
-      <w:pPr>
-        <w:ind w:left="0" w:firstLine="0"/>
-      </w:pPr>
-    </w:lvl>
-    <w:lvl w:ilvl="8" w:tplc="31BA2384">
-      <w:numFmt w:val="decimal"/>
-      <w:lvlText w:val=""/>
-      <w:lvlJc w:val="left"/>
-      <w:pPr>
-        <w:ind w:left="0" w:firstLine="0"/>
-      </w:pPr>
-    </w:lvl>
-  </w:abstractNum>
-  <w:abstractNum w:abstractNumId="8" w15:restartNumberingAfterBreak="0">
-    <w:nsid w:val="1DDB1EEE"/>
-    <w:multiLevelType w:val="hybridMultilevel"/>
-    <w:tmpl w:val="9048C30A"/>
-    <w:lvl w:ilvl="0" w:tplc="08090001">
-      <w:start w:val="1"/>
-      <w:numFmt w:val="bullet"/>
-      <w:lvlText w:val=""/>
-      <w:lvlJc w:val="left"/>
-      <w:pPr>
-        <w:ind w:left="4398" w:hanging="360"/>
-      </w:pPr>
-      <w:rPr>
-        <w:rFonts w:ascii="Symbol" w:hAnsi="Symbol" w:hint="default"/>
-      </w:rPr>
-    </w:lvl>
-    <w:lvl w:ilvl="1" w:tplc="08090003" w:tentative="1">
-      <w:start w:val="1"/>
-      <w:numFmt w:val="bullet"/>
-      <w:lvlText w:val="o"/>
-      <w:lvlJc w:val="left"/>
-      <w:pPr>
-        <w:ind w:left="5118" w:hanging="360"/>
-      </w:pPr>
-      <w:rPr>
-        <w:rFonts w:ascii="Courier New" w:hAnsi="Courier New" w:cs="Courier New" w:hint="default"/>
-      </w:rPr>
-    </w:lvl>
-    <w:lvl w:ilvl="2" w:tplc="08090005" w:tentative="1">
-      <w:start w:val="1"/>
-      <w:numFmt w:val="bullet"/>
-      <w:lvlText w:val=""/>
-      <w:lvlJc w:val="left"/>
-      <w:pPr>
-        <w:ind w:left="5838" w:hanging="360"/>
-      </w:pPr>
-      <w:rPr>
-        <w:rFonts w:ascii="Wingdings" w:hAnsi="Wingdings" w:hint="default"/>
-      </w:rPr>
-    </w:lvl>
-    <w:lvl w:ilvl="3" w:tplc="08090001" w:tentative="1">
-      <w:start w:val="1"/>
-      <w:numFmt w:val="bullet"/>
-      <w:lvlText w:val=""/>
-      <w:lvlJc w:val="left"/>
-      <w:pPr>
-        <w:ind w:left="6558" w:hanging="360"/>
-      </w:pPr>
-      <w:rPr>
-        <w:rFonts w:ascii="Symbol" w:hAnsi="Symbol" w:hint="default"/>
-      </w:rPr>
-    </w:lvl>
-    <w:lvl w:ilvl="4" w:tplc="08090003" w:tentative="1">
-      <w:start w:val="1"/>
-      <w:numFmt w:val="bullet"/>
-      <w:lvlText w:val="o"/>
-      <w:lvlJc w:val="left"/>
-      <w:pPr>
-        <w:ind w:left="7278" w:hanging="360"/>
-      </w:pPr>
-      <w:rPr>
-        <w:rFonts w:ascii="Courier New" w:hAnsi="Courier New" w:cs="Courier New" w:hint="default"/>
-      </w:rPr>
-    </w:lvl>
-    <w:lvl w:ilvl="5" w:tplc="08090005" w:tentative="1">
-      <w:start w:val="1"/>
-      <w:numFmt w:val="bullet"/>
-      <w:lvlText w:val=""/>
-      <w:lvlJc w:val="left"/>
-      <w:pPr>
-        <w:ind w:left="7998" w:hanging="360"/>
-      </w:pPr>
-      <w:rPr>
-        <w:rFonts w:ascii="Wingdings" w:hAnsi="Wingdings" w:hint="default"/>
-      </w:rPr>
-    </w:lvl>
-    <w:lvl w:ilvl="6" w:tplc="08090001" w:tentative="1">
-      <w:start w:val="1"/>
-      <w:numFmt w:val="bullet"/>
-      <w:lvlText w:val=""/>
-      <w:lvlJc w:val="left"/>
-      <w:pPr>
-        <w:ind w:left="8718" w:hanging="360"/>
-      </w:pPr>
-      <w:rPr>
-        <w:rFonts w:ascii="Symbol" w:hAnsi="Symbol" w:hint="default"/>
-      </w:rPr>
-    </w:lvl>
-    <w:lvl w:ilvl="7" w:tplc="08090003" w:tentative="1">
-      <w:start w:val="1"/>
-      <w:numFmt w:val="bullet"/>
-      <w:lvlText w:val="o"/>
-      <w:lvlJc w:val="left"/>
-      <w:pPr>
-        <w:ind w:left="9438" w:hanging="360"/>
-      </w:pPr>
-      <w:rPr>
-        <w:rFonts w:ascii="Courier New" w:hAnsi="Courier New" w:cs="Courier New" w:hint="default"/>
-      </w:rPr>
-    </w:lvl>
-    <w:lvl w:ilvl="8" w:tplc="08090005" w:tentative="1">
-      <w:start w:val="1"/>
-      <w:numFmt w:val="bullet"/>
-      <w:lvlText w:val=""/>
-      <w:lvlJc w:val="left"/>
-      <w:pPr>
-        <w:ind w:left="10158" w:hanging="360"/>
-      </w:pPr>
-      <w:rPr>
-        <w:rFonts w:ascii="Wingdings" w:hAnsi="Wingdings" w:hint="default"/>
-      </w:rPr>
-    </w:lvl>
-  </w:abstractNum>
-  <w:abstractNum w:abstractNumId="9" w15:restartNumberingAfterBreak="0">
-    <w:nsid w:val="1DEC25B9"/>
-    <w:multiLevelType w:val="hybridMultilevel"/>
-    <w:tmpl w:val="00C4BFAC"/>
-    <w:lvl w:ilvl="0" w:tplc="FFFFFFFF">
-      <w:start w:val="1"/>
-      <w:numFmt w:val="decimal"/>
-      <w:lvlText w:val="%1."/>
-      <w:lvlJc w:val="left"/>
-      <w:pPr>
-        <w:ind w:left="1514" w:hanging="360"/>
-      </w:pPr>
-    </w:lvl>
-    <w:lvl w:ilvl="1" w:tplc="FFFFFFFF" w:tentative="1">
-      <w:start w:val="1"/>
-      <w:numFmt w:val="lowerLetter"/>
-      <w:lvlText w:val="%2."/>
-      <w:lvlJc w:val="left"/>
-      <w:pPr>
-        <w:ind w:left="2234" w:hanging="360"/>
-      </w:pPr>
-    </w:lvl>
-    <w:lvl w:ilvl="2" w:tplc="FFFFFFFF" w:tentative="1">
-      <w:start w:val="1"/>
-      <w:numFmt w:val="lowerRoman"/>
-      <w:lvlText w:val="%3."/>
-      <w:lvlJc w:val="right"/>
-      <w:pPr>
-        <w:ind w:left="2954" w:hanging="180"/>
-      </w:pPr>
-    </w:lvl>
-    <w:lvl w:ilvl="3" w:tplc="FFFFFFFF" w:tentative="1">
-      <w:start w:val="1"/>
-      <w:numFmt w:val="decimal"/>
-      <w:lvlText w:val="%4."/>
-      <w:lvlJc w:val="left"/>
-      <w:pPr>
-        <w:ind w:left="3674" w:hanging="360"/>
-      </w:pPr>
-    </w:lvl>
-    <w:lvl w:ilvl="4" w:tplc="FFFFFFFF" w:tentative="1">
-      <w:start w:val="1"/>
-      <w:numFmt w:val="lowerLetter"/>
-      <w:lvlText w:val="%5."/>
-      <w:lvlJc w:val="left"/>
-      <w:pPr>
-        <w:ind w:left="4394" w:hanging="360"/>
-      </w:pPr>
-    </w:lvl>
-    <w:lvl w:ilvl="5" w:tplc="FFFFFFFF" w:tentative="1">
-      <w:start w:val="1"/>
-      <w:numFmt w:val="lowerRoman"/>
-      <w:lvlText w:val="%6."/>
-      <w:lvlJc w:val="right"/>
-      <w:pPr>
-        <w:ind w:left="5114" w:hanging="180"/>
-      </w:pPr>
-    </w:lvl>
-    <w:lvl w:ilvl="6" w:tplc="FFFFFFFF" w:tentative="1">
-      <w:start w:val="1"/>
-      <w:numFmt w:val="decimal"/>
-      <w:lvlText w:val="%7."/>
-      <w:lvlJc w:val="left"/>
-      <w:pPr>
-        <w:ind w:left="5834" w:hanging="360"/>
-      </w:pPr>
-    </w:lvl>
-    <w:lvl w:ilvl="7" w:tplc="FFFFFFFF" w:tentative="1">
-      <w:start w:val="1"/>
-      <w:numFmt w:val="lowerLetter"/>
-      <w:lvlText w:val="%8."/>
-      <w:lvlJc w:val="left"/>
-      <w:pPr>
-        <w:ind w:left="6554" w:hanging="360"/>
-      </w:pPr>
-    </w:lvl>
-    <w:lvl w:ilvl="8" w:tplc="FFFFFFFF" w:tentative="1">
-      <w:start w:val="1"/>
-      <w:numFmt w:val="lowerRoman"/>
-      <w:lvlText w:val="%9."/>
-      <w:lvlJc w:val="right"/>
-      <w:pPr>
-        <w:ind w:left="7274" w:hanging="180"/>
-      </w:pPr>
-    </w:lvl>
-  </w:abstractNum>
-  <w:abstractNum w:abstractNumId="10" w15:restartNumberingAfterBreak="0">
-    <w:nsid w:val="1E153B1E"/>
-    <w:multiLevelType w:val="hybridMultilevel"/>
-    <w:tmpl w:val="E9949694"/>
-    <w:lvl w:ilvl="0" w:tplc="08090001">
-      <w:start w:val="1"/>
-      <w:numFmt w:val="bullet"/>
-      <w:lvlText w:val=""/>
-      <w:lvlJc w:val="left"/>
-      <w:pPr>
-        <w:ind w:left="720" w:hanging="360"/>
-      </w:pPr>
-      <w:rPr>
-        <w:rFonts w:ascii="Symbol" w:hAnsi="Symbol" w:hint="default"/>
-      </w:rPr>
-    </w:lvl>
-    <w:lvl w:ilvl="1" w:tplc="08090001">
-      <w:start w:val="1"/>
-      <w:numFmt w:val="bullet"/>
-      <w:lvlText w:val=""/>
-      <w:lvlJc w:val="left"/>
-      <w:pPr>
-        <w:ind w:left="1440" w:hanging="360"/>
-      </w:pPr>
-      <w:rPr>
-        <w:rFonts w:ascii="Symbol" w:hAnsi="Symbol" w:hint="default"/>
-      </w:rPr>
-    </w:lvl>
-    <w:lvl w:ilvl="2" w:tplc="08090005" w:tentative="1">
-      <w:start w:val="1"/>
-      <w:numFmt w:val="bullet"/>
-      <w:lvlText w:val=""/>
-      <w:lvlJc w:val="left"/>
-      <w:pPr>
-        <w:ind w:left="2160" w:hanging="360"/>
-      </w:pPr>
-      <w:rPr>
-        <w:rFonts w:ascii="Wingdings" w:hAnsi="Wingdings" w:hint="default"/>
-      </w:rPr>
-    </w:lvl>
-    <w:lvl w:ilvl="3" w:tplc="08090001" w:tentative="1">
-      <w:start w:val="1"/>
-      <w:numFmt w:val="bullet"/>
-      <w:lvlText w:val=""/>
-      <w:lvlJc w:val="left"/>
-      <w:pPr>
-        <w:ind w:left="2880" w:hanging="360"/>
-      </w:pPr>
-      <w:rPr>
-        <w:rFonts w:ascii="Symbol" w:hAnsi="Symbol" w:hint="default"/>
-      </w:rPr>
-    </w:lvl>
-    <w:lvl w:ilvl="4" w:tplc="08090003" w:tentative="1">
-      <w:start w:val="1"/>
-      <w:numFmt w:val="bullet"/>
-      <w:lvlText w:val="o"/>
-      <w:lvlJc w:val="left"/>
-      <w:pPr>
-        <w:ind w:left="3600" w:hanging="360"/>
-      </w:pPr>
-      <w:rPr>
-        <w:rFonts w:ascii="Courier New" w:hAnsi="Courier New" w:cs="Courier New" w:hint="default"/>
-      </w:rPr>
-    </w:lvl>
-    <w:lvl w:ilvl="5" w:tplc="08090005" w:tentative="1">
-      <w:start w:val="1"/>
-      <w:numFmt w:val="bullet"/>
-      <w:lvlText w:val=""/>
-      <w:lvlJc w:val="left"/>
-      <w:pPr>
-        <w:ind w:left="4320" w:hanging="360"/>
-      </w:pPr>
-      <w:rPr>
-        <w:rFonts w:ascii="Wingdings" w:hAnsi="Wingdings" w:hint="default"/>
-      </w:rPr>
-    </w:lvl>
-    <w:lvl w:ilvl="6" w:tplc="08090001" w:tentative="1">
-      <w:start w:val="1"/>
-      <w:numFmt w:val="bullet"/>
-      <w:lvlText w:val=""/>
-      <w:lvlJc w:val="left"/>
-      <w:pPr>
-        <w:ind w:left="5040" w:hanging="360"/>
-      </w:pPr>
-      <w:rPr>
-        <w:rFonts w:ascii="Symbol" w:hAnsi="Symbol" w:hint="default"/>
-      </w:rPr>
-    </w:lvl>
-    <w:lvl w:ilvl="7" w:tplc="08090003" w:tentative="1">
-      <w:start w:val="1"/>
-      <w:numFmt w:val="bullet"/>
-      <w:lvlText w:val="o"/>
-      <w:lvlJc w:val="left"/>
-      <w:pPr>
-        <w:ind w:left="5760" w:hanging="360"/>
-      </w:pPr>
-      <w:rPr>
-        <w:rFonts w:ascii="Courier New" w:hAnsi="Courier New" w:cs="Courier New" w:hint="default"/>
-      </w:rPr>
-    </w:lvl>
-    <w:lvl w:ilvl="8" w:tplc="08090005" w:tentative="1">
-      <w:start w:val="1"/>
-      <w:numFmt w:val="bullet"/>
-      <w:lvlText w:val=""/>
-      <w:lvlJc w:val="left"/>
-      <w:pPr>
-        <w:ind w:left="6480" w:hanging="360"/>
-      </w:pPr>
-      <w:rPr>
-        <w:rFonts w:ascii="Wingdings" w:hAnsi="Wingdings" w:hint="default"/>
-      </w:rPr>
-    </w:lvl>
-  </w:abstractNum>
-  <w:abstractNum w:abstractNumId="11" w15:restartNumberingAfterBreak="0">
-    <w:nsid w:val="1E611400"/>
-    <w:multiLevelType w:val="multilevel"/>
-    <w:tmpl w:val="5DDE704A"/>
-    <w:lvl w:ilvl="0">
-      <w:start w:val="1"/>
-      <w:numFmt w:val="decimal"/>
-      <w:lvlText w:val="%1."/>
-      <w:lvlJc w:val="left"/>
-      <w:pPr>
-        <w:ind w:left="360" w:hanging="360"/>
-      </w:pPr>
-      <w:rPr>
-        <w:rFonts w:hint="default"/>
-      </w:rPr>
-    </w:lvl>
-    <w:lvl w:ilvl="1">
-      <w:start w:val="1"/>
-      <w:numFmt w:val="decimal"/>
-      <w:suff w:val="space"/>
-      <w:lvlText w:val="%1.%2."/>
-      <w:lvlJc w:val="left"/>
-      <w:pPr>
-        <w:ind w:left="720" w:hanging="360"/>
-      </w:pPr>
-      <w:rPr>
-        <w:rFonts w:hint="default"/>
-      </w:rPr>
-    </w:lvl>
-    <w:lvl w:ilvl="2">
-      <w:start w:val="1"/>
-      <w:numFmt w:val="lowerRoman"/>
-      <w:lvlText w:val="%3)"/>
-      <w:lvlJc w:val="left"/>
-      <w:pPr>
-        <w:ind w:left="1080" w:hanging="360"/>
-      </w:pPr>
-      <w:rPr>
-        <w:rFonts w:hint="default"/>
-      </w:rPr>
-    </w:lvl>
-    <w:lvl w:ilvl="3">
-      <w:start w:val="1"/>
-      <w:numFmt w:val="decimal"/>
-      <w:lvlText w:val="(%4)"/>
-      <w:lvlJc w:val="left"/>
-      <w:pPr>
-        <w:ind w:left="1440" w:hanging="360"/>
-      </w:pPr>
-      <w:rPr>
-        <w:rFonts w:hint="default"/>
-      </w:rPr>
-    </w:lvl>
-    <w:lvl w:ilvl="4">
-      <w:start w:val="1"/>
-      <w:numFmt w:val="lowerLetter"/>
-      <w:lvlText w:val="(%5)"/>
-      <w:lvlJc w:val="left"/>
-      <w:pPr>
-        <w:ind w:left="1800" w:hanging="360"/>
-      </w:pPr>
-      <w:rPr>
-        <w:rFonts w:hint="default"/>
-      </w:rPr>
-    </w:lvl>
-    <w:lvl w:ilvl="5">
-      <w:start w:val="1"/>
-      <w:numFmt w:val="lowerRoman"/>
-      <w:lvlText w:val="(%6)"/>
-      <w:lvlJc w:val="left"/>
-      <w:pPr>
-        <w:ind w:left="2160" w:hanging="360"/>
-      </w:pPr>
-      <w:rPr>
-        <w:rFonts w:hint="default"/>
-      </w:rPr>
-    </w:lvl>
-    <w:lvl w:ilvl="6">
-      <w:start w:val="1"/>
-      <w:numFmt w:val="decimal"/>
-      <w:lvlText w:val="%7."/>
-      <w:lvlJc w:val="left"/>
-      <w:pPr>
-        <w:ind w:left="2520" w:hanging="360"/>
-      </w:pPr>
-      <w:rPr>
-        <w:rFonts w:hint="default"/>
-      </w:rPr>
-    </w:lvl>
-    <w:lvl w:ilvl="7">
-      <w:start w:val="1"/>
-      <w:numFmt w:val="lowerLetter"/>
-      <w:lvlText w:val="%8."/>
-      <w:lvlJc w:val="left"/>
-      <w:pPr>
-        <w:ind w:left="2880" w:hanging="360"/>
-      </w:pPr>
-      <w:rPr>
-        <w:rFonts w:hint="default"/>
-      </w:rPr>
-    </w:lvl>
-    <w:lvl w:ilvl="8">
-      <w:start w:val="1"/>
-      <w:numFmt w:val="lowerRoman"/>
-      <w:lvlText w:val="%9."/>
-      <w:lvlJc w:val="left"/>
-      <w:pPr>
-        <w:ind w:left="3240" w:hanging="360"/>
-      </w:pPr>
-      <w:rPr>
-        <w:rFonts w:hint="default"/>
-      </w:rPr>
-    </w:lvl>
-  </w:abstractNum>
-  <w:abstractNum w:abstractNumId="12" w15:restartNumberingAfterBreak="0">
-    <w:nsid w:val="213C24F7"/>
-    <w:multiLevelType w:val="hybridMultilevel"/>
-    <w:tmpl w:val="8B28F040"/>
-    <w:lvl w:ilvl="0" w:tplc="08090001">
-      <w:start w:val="1"/>
-      <w:numFmt w:val="bullet"/>
-      <w:lvlText w:val=""/>
-      <w:lvlJc w:val="left"/>
-      <w:pPr>
-        <w:ind w:left="1514" w:hanging="360"/>
-      </w:pPr>
-      <w:rPr>
-        <w:rFonts w:ascii="Symbol" w:hAnsi="Symbol" w:hint="default"/>
-      </w:rPr>
-    </w:lvl>
-    <w:lvl w:ilvl="1" w:tplc="08090003" w:tentative="1">
-      <w:start w:val="1"/>
-      <w:numFmt w:val="bullet"/>
-      <w:lvlText w:val="o"/>
-      <w:lvlJc w:val="left"/>
-      <w:pPr>
-        <w:ind w:left="2234" w:hanging="360"/>
-      </w:pPr>
-      <w:rPr>
-        <w:rFonts w:ascii="Courier New" w:hAnsi="Courier New" w:cs="Courier New" w:hint="default"/>
-      </w:rPr>
-    </w:lvl>
-    <w:lvl w:ilvl="2" w:tplc="08090005" w:tentative="1">
-      <w:start w:val="1"/>
-      <w:numFmt w:val="bullet"/>
-      <w:lvlText w:val=""/>
-      <w:lvlJc w:val="left"/>
-      <w:pPr>
-        <w:ind w:left="2954" w:hanging="360"/>
-      </w:pPr>
-      <w:rPr>
-        <w:rFonts w:ascii="Wingdings" w:hAnsi="Wingdings" w:hint="default"/>
-      </w:rPr>
-    </w:lvl>
-    <w:lvl w:ilvl="3" w:tplc="08090001" w:tentative="1">
-      <w:start w:val="1"/>
-      <w:numFmt w:val="bullet"/>
-      <w:lvlText w:val=""/>
-      <w:lvlJc w:val="left"/>
-      <w:pPr>
-        <w:ind w:left="3674" w:hanging="360"/>
-      </w:pPr>
-      <w:rPr>
-        <w:rFonts w:ascii="Symbol" w:hAnsi="Symbol" w:hint="default"/>
-      </w:rPr>
-    </w:lvl>
-    <w:lvl w:ilvl="4" w:tplc="08090003" w:tentative="1">
-      <w:start w:val="1"/>
-      <w:numFmt w:val="bullet"/>
-      <w:lvlText w:val="o"/>
-      <w:lvlJc w:val="left"/>
-      <w:pPr>
-        <w:ind w:left="4394" w:hanging="360"/>
-      </w:pPr>
-      <w:rPr>
-        <w:rFonts w:ascii="Courier New" w:hAnsi="Courier New" w:cs="Courier New" w:hint="default"/>
-      </w:rPr>
-    </w:lvl>
-    <w:lvl w:ilvl="5" w:tplc="08090005" w:tentative="1">
-      <w:start w:val="1"/>
-      <w:numFmt w:val="bullet"/>
-      <w:lvlText w:val=""/>
-      <w:lvlJc w:val="left"/>
-      <w:pPr>
-        <w:ind w:left="5114" w:hanging="360"/>
-      </w:pPr>
-      <w:rPr>
-        <w:rFonts w:ascii="Wingdings" w:hAnsi="Wingdings" w:hint="default"/>
-      </w:rPr>
-    </w:lvl>
-    <w:lvl w:ilvl="6" w:tplc="08090001" w:tentative="1">
-      <w:start w:val="1"/>
-      <w:numFmt w:val="bullet"/>
-      <w:lvlText w:val=""/>
-      <w:lvlJc w:val="left"/>
-      <w:pPr>
-        <w:ind w:left="5834" w:hanging="360"/>
-      </w:pPr>
-      <w:rPr>
-        <w:rFonts w:ascii="Symbol" w:hAnsi="Symbol" w:hint="default"/>
-      </w:rPr>
-    </w:lvl>
-    <w:lvl w:ilvl="7" w:tplc="08090003" w:tentative="1">
-      <w:start w:val="1"/>
-      <w:numFmt w:val="bullet"/>
-      <w:lvlText w:val="o"/>
-      <w:lvlJc w:val="left"/>
-      <w:pPr>
-        <w:ind w:left="6554" w:hanging="360"/>
-      </w:pPr>
-      <w:rPr>
-        <w:rFonts w:ascii="Courier New" w:hAnsi="Courier New" w:cs="Courier New" w:hint="default"/>
-      </w:rPr>
-    </w:lvl>
-    <w:lvl w:ilvl="8" w:tplc="08090005" w:tentative="1">
-      <w:start w:val="1"/>
-      <w:numFmt w:val="bullet"/>
-      <w:lvlText w:val=""/>
-      <w:lvlJc w:val="left"/>
-      <w:pPr>
-        <w:ind w:left="7274" w:hanging="360"/>
-      </w:pPr>
-      <w:rPr>
-        <w:rFonts w:ascii="Wingdings" w:hAnsi="Wingdings" w:hint="default"/>
-      </w:rPr>
-    </w:lvl>
-  </w:abstractNum>
-  <w:abstractNum w:abstractNumId="13" w15:restartNumberingAfterBreak="0">
-    <w:nsid w:val="21F97CFE"/>
-    <w:multiLevelType w:val="hybridMultilevel"/>
-    <w:tmpl w:val="F73A358A"/>
-    <w:lvl w:ilvl="0" w:tplc="5134C814">
-      <w:start w:val="1"/>
-      <w:numFmt w:val="decimal"/>
-      <w:lvlText w:val="%1."/>
-      <w:lvlJc w:val="left"/>
-      <w:pPr>
-        <w:ind w:left="720" w:hanging="360"/>
-      </w:pPr>
-    </w:lvl>
-    <w:lvl w:ilvl="1" w:tplc="384037DE">
-      <w:numFmt w:val="decimal"/>
-      <w:lvlText w:val=""/>
-      <w:lvlJc w:val="left"/>
-      <w:pPr>
-        <w:ind w:left="0" w:firstLine="0"/>
-      </w:pPr>
-    </w:lvl>
-    <w:lvl w:ilvl="2" w:tplc="BE124EB0">
-      <w:numFmt w:val="decimal"/>
-      <w:lvlText w:val=""/>
-      <w:lvlJc w:val="left"/>
-      <w:pPr>
-        <w:ind w:left="0" w:firstLine="0"/>
-      </w:pPr>
-    </w:lvl>
-    <w:lvl w:ilvl="3" w:tplc="322040CE">
-      <w:numFmt w:val="decimal"/>
-      <w:lvlText w:val=""/>
-      <w:lvlJc w:val="left"/>
-      <w:pPr>
-        <w:ind w:left="0" w:firstLine="0"/>
-      </w:pPr>
-    </w:lvl>
-    <w:lvl w:ilvl="4" w:tplc="A078C8DA">
-      <w:numFmt w:val="decimal"/>
-      <w:lvlText w:val=""/>
-      <w:lvlJc w:val="left"/>
-      <w:pPr>
-        <w:ind w:left="0" w:firstLine="0"/>
-      </w:pPr>
-    </w:lvl>
-    <w:lvl w:ilvl="5" w:tplc="FD1A649A">
-      <w:numFmt w:val="decimal"/>
-      <w:lvlText w:val=""/>
-      <w:lvlJc w:val="left"/>
-      <w:pPr>
-        <w:ind w:left="0" w:firstLine="0"/>
-      </w:pPr>
-    </w:lvl>
-    <w:lvl w:ilvl="6" w:tplc="FFBC5FC2">
-      <w:numFmt w:val="decimal"/>
-      <w:lvlText w:val=""/>
-      <w:lvlJc w:val="left"/>
-      <w:pPr>
-        <w:ind w:left="0" w:firstLine="0"/>
-      </w:pPr>
-    </w:lvl>
-    <w:lvl w:ilvl="7" w:tplc="03F29958">
-      <w:numFmt w:val="decimal"/>
-      <w:lvlText w:val=""/>
-      <w:lvlJc w:val="left"/>
-      <w:pPr>
-        <w:ind w:left="0" w:firstLine="0"/>
-      </w:pPr>
-    </w:lvl>
-    <w:lvl w:ilvl="8" w:tplc="3DC28AA2">
-      <w:numFmt w:val="decimal"/>
-      <w:lvlText w:val=""/>
-      <w:lvlJc w:val="left"/>
-      <w:pPr>
-        <w:ind w:left="0" w:firstLine="0"/>
-      </w:pPr>
-    </w:lvl>
-  </w:abstractNum>
-  <w:abstractNum w:abstractNumId="14" w15:restartNumberingAfterBreak="0">
-    <w:nsid w:val="222343DF"/>
-    <w:multiLevelType w:val="hybridMultilevel"/>
-    <w:tmpl w:val="FE267EC0"/>
-    <w:lvl w:ilvl="0" w:tplc="0809000F">
-      <w:start w:val="1"/>
-      <w:numFmt w:val="decimal"/>
-      <w:lvlText w:val="%1."/>
-      <w:lvlJc w:val="left"/>
-      <w:pPr>
-        <w:ind w:left="720" w:hanging="360"/>
-      </w:pPr>
-    </w:lvl>
-    <w:lvl w:ilvl="1" w:tplc="08090019" w:tentative="1">
-      <w:start w:val="1"/>
-      <w:numFmt w:val="lowerLetter"/>
-      <w:lvlText w:val="%2."/>
-      <w:lvlJc w:val="left"/>
-      <w:pPr>
-        <w:ind w:left="1440" w:hanging="360"/>
-      </w:pPr>
-    </w:lvl>
-    <w:lvl w:ilvl="2" w:tplc="0809001B" w:tentative="1">
-      <w:start w:val="1"/>
-      <w:numFmt w:val="lowerRoman"/>
-      <w:lvlText w:val="%3."/>
-      <w:lvlJc w:val="right"/>
-      <w:pPr>
-        <w:ind w:left="2160" w:hanging="180"/>
-      </w:pPr>
-    </w:lvl>
-    <w:lvl w:ilvl="3" w:tplc="0809000F" w:tentative="1">
-      <w:start w:val="1"/>
-      <w:numFmt w:val="decimal"/>
-      <w:lvlText w:val="%4."/>
-      <w:lvlJc w:val="left"/>
-      <w:pPr>
-        <w:ind w:left="2880" w:hanging="360"/>
-      </w:pPr>
-    </w:lvl>
-    <w:lvl w:ilvl="4" w:tplc="08090019" w:tentative="1">
-      <w:start w:val="1"/>
-      <w:numFmt w:val="lowerLetter"/>
-      <w:lvlText w:val="%5."/>
-      <w:lvlJc w:val="left"/>
-      <w:pPr>
-        <w:ind w:left="3600" w:hanging="360"/>
-      </w:pPr>
-    </w:lvl>
-    <w:lvl w:ilvl="5" w:tplc="0809001B" w:tentative="1">
-      <w:start w:val="1"/>
-      <w:numFmt w:val="lowerRoman"/>
-      <w:lvlText w:val="%6."/>
-      <w:lvlJc w:val="right"/>
-      <w:pPr>
-        <w:ind w:left="4320" w:hanging="180"/>
-      </w:pPr>
-    </w:lvl>
-    <w:lvl w:ilvl="6" w:tplc="0809000F" w:tentative="1">
-      <w:start w:val="1"/>
-      <w:numFmt w:val="decimal"/>
-      <w:lvlText w:val="%7."/>
-      <w:lvlJc w:val="left"/>
-      <w:pPr>
-        <w:ind w:left="5040" w:hanging="360"/>
-      </w:pPr>
-    </w:lvl>
-    <w:lvl w:ilvl="7" w:tplc="08090019" w:tentative="1">
-      <w:start w:val="1"/>
-      <w:numFmt w:val="lowerLetter"/>
-      <w:lvlText w:val="%8."/>
-      <w:lvlJc w:val="left"/>
-      <w:pPr>
-        <w:ind w:left="5760" w:hanging="360"/>
-      </w:pPr>
-    </w:lvl>
-    <w:lvl w:ilvl="8" w:tplc="0809001B" w:tentative="1">
-      <w:start w:val="1"/>
-      <w:numFmt w:val="lowerRoman"/>
-      <w:lvlText w:val="%9."/>
-      <w:lvlJc w:val="right"/>
-      <w:pPr>
-        <w:ind w:left="6480" w:hanging="180"/>
-      </w:pPr>
-    </w:lvl>
-  </w:abstractNum>
-  <w:abstractNum w:abstractNumId="15" w15:restartNumberingAfterBreak="0">
-    <w:nsid w:val="25294F05"/>
-    <w:multiLevelType w:val="hybridMultilevel"/>
-    <w:tmpl w:val="40B6E830"/>
-    <w:lvl w:ilvl="0" w:tplc="DAA4777C">
-      <w:start w:val="4"/>
-      <w:numFmt w:val="bullet"/>
-      <w:lvlText w:val="-"/>
-      <w:lvlJc w:val="left"/>
-      <w:pPr>
-        <w:ind w:left="720" w:hanging="360"/>
-      </w:pPr>
-      <w:rPr>
-        <w:rFonts w:ascii="Space Grotesk" w:eastAsiaTheme="minorHAnsi" w:hAnsi="Space Grotesk" w:cstheme="minorBidi" w:hint="default"/>
-      </w:rPr>
-    </w:lvl>
-    <w:lvl w:ilvl="1" w:tplc="08090003" w:tentative="1">
-      <w:start w:val="1"/>
-      <w:numFmt w:val="bullet"/>
-      <w:lvlText w:val="o"/>
-      <w:lvlJc w:val="left"/>
-      <w:pPr>
-        <w:ind w:left="1440" w:hanging="360"/>
-      </w:pPr>
-      <w:rPr>
-        <w:rFonts w:ascii="Courier New" w:hAnsi="Courier New" w:cs="Courier New" w:hint="default"/>
-      </w:rPr>
-    </w:lvl>
-    <w:lvl w:ilvl="2" w:tplc="08090005" w:tentative="1">
-      <w:start w:val="1"/>
-      <w:numFmt w:val="bullet"/>
-      <w:lvlText w:val=""/>
-      <w:lvlJc w:val="left"/>
-      <w:pPr>
-        <w:ind w:left="2160" w:hanging="360"/>
-      </w:pPr>
-      <w:rPr>
-        <w:rFonts w:ascii="Wingdings" w:hAnsi="Wingdings" w:hint="default"/>
-      </w:rPr>
-    </w:lvl>
-    <w:lvl w:ilvl="3" w:tplc="08090001" w:tentative="1">
-      <w:start w:val="1"/>
-      <w:numFmt w:val="bullet"/>
-      <w:lvlText w:val=""/>
-      <w:lvlJc w:val="left"/>
-      <w:pPr>
-        <w:ind w:left="2880" w:hanging="360"/>
-      </w:pPr>
-      <w:rPr>
-        <w:rFonts w:ascii="Symbol" w:hAnsi="Symbol" w:hint="default"/>
-      </w:rPr>
-    </w:lvl>
-    <w:lvl w:ilvl="4" w:tplc="08090003" w:tentative="1">
-      <w:start w:val="1"/>
-      <w:numFmt w:val="bullet"/>
-      <w:lvlText w:val="o"/>
-      <w:lvlJc w:val="left"/>
-      <w:pPr>
-        <w:ind w:left="3600" w:hanging="360"/>
-      </w:pPr>
-      <w:rPr>
-        <w:rFonts w:ascii="Courier New" w:hAnsi="Courier New" w:cs="Courier New" w:hint="default"/>
-      </w:rPr>
-    </w:lvl>
-    <w:lvl w:ilvl="5" w:tplc="08090005" w:tentative="1">
-      <w:start w:val="1"/>
-      <w:numFmt w:val="bullet"/>
-      <w:lvlText w:val=""/>
-      <w:lvlJc w:val="left"/>
-      <w:pPr>
-        <w:ind w:left="4320" w:hanging="360"/>
-      </w:pPr>
-      <w:rPr>
-        <w:rFonts w:ascii="Wingdings" w:hAnsi="Wingdings" w:hint="default"/>
-      </w:rPr>
-    </w:lvl>
-    <w:lvl w:ilvl="6" w:tplc="08090001" w:tentative="1">
-      <w:start w:val="1"/>
-      <w:numFmt w:val="bullet"/>
-      <w:lvlText w:val=""/>
-      <w:lvlJc w:val="left"/>
-      <w:pPr>
-        <w:ind w:left="5040" w:hanging="360"/>
-      </w:pPr>
-      <w:rPr>
-        <w:rFonts w:ascii="Symbol" w:hAnsi="Symbol" w:hint="default"/>
-      </w:rPr>
-    </w:lvl>
-    <w:lvl w:ilvl="7" w:tplc="08090003" w:tentative="1">
-      <w:start w:val="1"/>
-      <w:numFmt w:val="bullet"/>
-      <w:lvlText w:val="o"/>
-      <w:lvlJc w:val="left"/>
-      <w:pPr>
-        <w:ind w:left="5760" w:hanging="360"/>
-      </w:pPr>
-      <w:rPr>
-        <w:rFonts w:ascii="Courier New" w:hAnsi="Courier New" w:cs="Courier New" w:hint="default"/>
-      </w:rPr>
-    </w:lvl>
-    <w:lvl w:ilvl="8" w:tplc="08090005" w:tentative="1">
-      <w:start w:val="1"/>
-      <w:numFmt w:val="bullet"/>
-      <w:lvlText w:val=""/>
-      <w:lvlJc w:val="left"/>
-      <w:pPr>
-        <w:ind w:left="6480" w:hanging="360"/>
-      </w:pPr>
-      <w:rPr>
-        <w:rFonts w:ascii="Wingdings" w:hAnsi="Wingdings" w:hint="default"/>
-      </w:rPr>
-    </w:lvl>
-  </w:abstractNum>
-  <w:abstractNum w:abstractNumId="16" w15:restartNumberingAfterBreak="0">
-    <w:nsid w:val="25446B5A"/>
-    <w:multiLevelType w:val="hybridMultilevel"/>
-    <w:tmpl w:val="40C8AF46"/>
-    <w:lvl w:ilvl="0" w:tplc="08090001">
-      <w:start w:val="1"/>
-      <w:numFmt w:val="bullet"/>
-      <w:lvlText w:val=""/>
-      <w:lvlJc w:val="left"/>
-      <w:pPr>
-        <w:ind w:left="1514" w:hanging="360"/>
-      </w:pPr>
-      <w:rPr>
-        <w:rFonts w:ascii="Symbol" w:hAnsi="Symbol" w:hint="default"/>
-      </w:rPr>
-    </w:lvl>
-    <w:lvl w:ilvl="1" w:tplc="08090003" w:tentative="1">
-      <w:start w:val="1"/>
-      <w:numFmt w:val="bullet"/>
-      <w:lvlText w:val="o"/>
-      <w:lvlJc w:val="left"/>
-      <w:pPr>
-        <w:ind w:left="2234" w:hanging="360"/>
-      </w:pPr>
-      <w:rPr>
-        <w:rFonts w:ascii="Courier New" w:hAnsi="Courier New" w:cs="Courier New" w:hint="default"/>
-      </w:rPr>
-    </w:lvl>
-    <w:lvl w:ilvl="2" w:tplc="08090005" w:tentative="1">
-      <w:start w:val="1"/>
-      <w:numFmt w:val="bullet"/>
-      <w:lvlText w:val=""/>
-      <w:lvlJc w:val="left"/>
-      <w:pPr>
-        <w:ind w:left="2954" w:hanging="360"/>
-      </w:pPr>
-      <w:rPr>
-        <w:rFonts w:ascii="Wingdings" w:hAnsi="Wingdings" w:hint="default"/>
-      </w:rPr>
-    </w:lvl>
-    <w:lvl w:ilvl="3" w:tplc="08090001" w:tentative="1">
-      <w:start w:val="1"/>
-      <w:numFmt w:val="bullet"/>
-      <w:lvlText w:val=""/>
-      <w:lvlJc w:val="left"/>
-      <w:pPr>
-        <w:ind w:left="3674" w:hanging="360"/>
-      </w:pPr>
-      <w:rPr>
-        <w:rFonts w:ascii="Symbol" w:hAnsi="Symbol" w:hint="default"/>
-      </w:rPr>
-    </w:lvl>
-    <w:lvl w:ilvl="4" w:tplc="08090003" w:tentative="1">
-      <w:start w:val="1"/>
-      <w:numFmt w:val="bullet"/>
-      <w:lvlText w:val="o"/>
-      <w:lvlJc w:val="left"/>
-      <w:pPr>
-        <w:ind w:left="4394" w:hanging="360"/>
-      </w:pPr>
-      <w:rPr>
-        <w:rFonts w:ascii="Courier New" w:hAnsi="Courier New" w:cs="Courier New" w:hint="default"/>
-      </w:rPr>
-    </w:lvl>
-    <w:lvl w:ilvl="5" w:tplc="08090005" w:tentative="1">
-      <w:start w:val="1"/>
-      <w:numFmt w:val="bullet"/>
-      <w:lvlText w:val=""/>
-      <w:lvlJc w:val="left"/>
-      <w:pPr>
-        <w:ind w:left="5114" w:hanging="360"/>
-      </w:pPr>
-      <w:rPr>
-        <w:rFonts w:ascii="Wingdings" w:hAnsi="Wingdings" w:hint="default"/>
-      </w:rPr>
-    </w:lvl>
-    <w:lvl w:ilvl="6" w:tplc="08090001" w:tentative="1">
-      <w:start w:val="1"/>
-      <w:numFmt w:val="bullet"/>
-      <w:lvlText w:val=""/>
-      <w:lvlJc w:val="left"/>
-      <w:pPr>
-        <w:ind w:left="5834" w:hanging="360"/>
-      </w:pPr>
-      <w:rPr>
-        <w:rFonts w:ascii="Symbol" w:hAnsi="Symbol" w:hint="default"/>
-      </w:rPr>
-    </w:lvl>
-    <w:lvl w:ilvl="7" w:tplc="08090003" w:tentative="1">
-      <w:start w:val="1"/>
-      <w:numFmt w:val="bullet"/>
-      <w:lvlText w:val="o"/>
-      <w:lvlJc w:val="left"/>
-      <w:pPr>
-        <w:ind w:left="6554" w:hanging="360"/>
-      </w:pPr>
-      <w:rPr>
-        <w:rFonts w:ascii="Courier New" w:hAnsi="Courier New" w:cs="Courier New" w:hint="default"/>
-      </w:rPr>
-    </w:lvl>
-    <w:lvl w:ilvl="8" w:tplc="08090005" w:tentative="1">
-      <w:start w:val="1"/>
-      <w:numFmt w:val="bullet"/>
-      <w:lvlText w:val=""/>
-      <w:lvlJc w:val="left"/>
-      <w:pPr>
-        <w:ind w:left="7274" w:hanging="360"/>
-      </w:pPr>
-      <w:rPr>
-        <w:rFonts w:ascii="Wingdings" w:hAnsi="Wingdings" w:hint="default"/>
-      </w:rPr>
-    </w:lvl>
-  </w:abstractNum>
-  <w:abstractNum w:abstractNumId="17" w15:restartNumberingAfterBreak="0">
-    <w:nsid w:val="2F4C2A02"/>
-    <w:multiLevelType w:val="hybridMultilevel"/>
-    <w:tmpl w:val="858A8B7C"/>
-    <w:lvl w:ilvl="0" w:tplc="08090001">
-      <w:start w:val="1"/>
-      <w:numFmt w:val="bullet"/>
-      <w:lvlText w:val=""/>
-      <w:lvlJc w:val="left"/>
-      <w:pPr>
-        <w:ind w:left="1514" w:hanging="360"/>
-      </w:pPr>
-      <w:rPr>
-        <w:rFonts w:ascii="Symbol" w:hAnsi="Symbol" w:hint="default"/>
-      </w:rPr>
-    </w:lvl>
-    <w:lvl w:ilvl="1" w:tplc="08090003">
-      <w:start w:val="1"/>
-      <w:numFmt w:val="bullet"/>
-      <w:lvlText w:val="o"/>
-      <w:lvlJc w:val="left"/>
-      <w:pPr>
-        <w:ind w:left="2234" w:hanging="360"/>
-      </w:pPr>
-      <w:rPr>
-        <w:rFonts w:ascii="Courier New" w:hAnsi="Courier New" w:cs="Courier New" w:hint="default"/>
-      </w:rPr>
-    </w:lvl>
-    <w:lvl w:ilvl="2" w:tplc="08090005" w:tentative="1">
-      <w:start w:val="1"/>
-      <w:numFmt w:val="bullet"/>
-      <w:lvlText w:val=""/>
-      <w:lvlJc w:val="left"/>
-      <w:pPr>
-        <w:ind w:left="2954" w:hanging="360"/>
-      </w:pPr>
-      <w:rPr>
-        <w:rFonts w:ascii="Wingdings" w:hAnsi="Wingdings" w:hint="default"/>
-      </w:rPr>
-    </w:lvl>
-    <w:lvl w:ilvl="3" w:tplc="08090001" w:tentative="1">
-      <w:start w:val="1"/>
-      <w:numFmt w:val="bullet"/>
-      <w:lvlText w:val=""/>
-      <w:lvlJc w:val="left"/>
-      <w:pPr>
-        <w:ind w:left="3674" w:hanging="360"/>
-      </w:pPr>
-      <w:rPr>
-        <w:rFonts w:ascii="Symbol" w:hAnsi="Symbol" w:hint="default"/>
-      </w:rPr>
-    </w:lvl>
-    <w:lvl w:ilvl="4" w:tplc="08090003" w:tentative="1">
-      <w:start w:val="1"/>
-      <w:numFmt w:val="bullet"/>
-      <w:lvlText w:val="o"/>
-      <w:lvlJc w:val="left"/>
-      <w:pPr>
-        <w:ind w:left="4394" w:hanging="360"/>
-      </w:pPr>
-      <w:rPr>
-        <w:rFonts w:ascii="Courier New" w:hAnsi="Courier New" w:cs="Courier New" w:hint="default"/>
-      </w:rPr>
-    </w:lvl>
-    <w:lvl w:ilvl="5" w:tplc="08090005" w:tentative="1">
-      <w:start w:val="1"/>
-      <w:numFmt w:val="bullet"/>
-      <w:lvlText w:val=""/>
-      <w:lvlJc w:val="left"/>
-      <w:pPr>
-        <w:ind w:left="5114" w:hanging="360"/>
-      </w:pPr>
-      <w:rPr>
-        <w:rFonts w:ascii="Wingdings" w:hAnsi="Wingdings" w:hint="default"/>
-      </w:rPr>
-    </w:lvl>
-    <w:lvl w:ilvl="6" w:tplc="08090001" w:tentative="1">
-      <w:start w:val="1"/>
-      <w:numFmt w:val="bullet"/>
-      <w:lvlText w:val=""/>
-      <w:lvlJc w:val="left"/>
-      <w:pPr>
-        <w:ind w:left="5834" w:hanging="360"/>
-      </w:pPr>
-      <w:rPr>
-        <w:rFonts w:ascii="Symbol" w:hAnsi="Symbol" w:hint="default"/>
-      </w:rPr>
-    </w:lvl>
-    <w:lvl w:ilvl="7" w:tplc="08090003" w:tentative="1">
-      <w:start w:val="1"/>
-      <w:numFmt w:val="bullet"/>
-      <w:lvlText w:val="o"/>
-      <w:lvlJc w:val="left"/>
-      <w:pPr>
-        <w:ind w:left="6554" w:hanging="360"/>
-      </w:pPr>
-      <w:rPr>
-        <w:rFonts w:ascii="Courier New" w:hAnsi="Courier New" w:cs="Courier New" w:hint="default"/>
-      </w:rPr>
-    </w:lvl>
-    <w:lvl w:ilvl="8" w:tplc="08090005" w:tentative="1">
-      <w:start w:val="1"/>
-      <w:numFmt w:val="bullet"/>
-      <w:lvlText w:val=""/>
-      <w:lvlJc w:val="left"/>
-      <w:pPr>
-        <w:ind w:left="7274" w:hanging="360"/>
-      </w:pPr>
-      <w:rPr>
-        <w:rFonts w:ascii="Wingdings" w:hAnsi="Wingdings" w:hint="default"/>
-      </w:rPr>
-    </w:lvl>
-  </w:abstractNum>
-  <w:abstractNum w:abstractNumId="18" w15:restartNumberingAfterBreak="0">
+  <w:abstractNum w:abstractNumId="1" w15:restartNumberingAfterBreak="0">
     <w:nsid w:val="2F5053C7"/>
     <w:multiLevelType w:val="hybridMultilevel"/>
     <w:tmpl w:val="F808CBF0"/>
@@ -5452,260 +3716,7 @@
       </w:pPr>
     </w:lvl>
   </w:abstractNum>
-  <w:abstractNum w:abstractNumId="19" w15:restartNumberingAfterBreak="0">
-    <w:nsid w:val="30C5360C"/>
-    <w:multiLevelType w:val="hybridMultilevel"/>
-    <w:tmpl w:val="4900FC74"/>
-    <w:lvl w:ilvl="0" w:tplc="08090001">
-      <w:start w:val="1"/>
-      <w:numFmt w:val="bullet"/>
-      <w:lvlText w:val=""/>
-      <w:lvlJc w:val="left"/>
-      <w:pPr>
-        <w:ind w:left="1514" w:hanging="360"/>
-      </w:pPr>
-      <w:rPr>
-        <w:rFonts w:ascii="Symbol" w:hAnsi="Symbol" w:hint="default"/>
-      </w:rPr>
-    </w:lvl>
-    <w:lvl w:ilvl="1" w:tplc="08090003" w:tentative="1">
-      <w:start w:val="1"/>
-      <w:numFmt w:val="bullet"/>
-      <w:lvlText w:val="o"/>
-      <w:lvlJc w:val="left"/>
-      <w:pPr>
-        <w:ind w:left="2234" w:hanging="360"/>
-      </w:pPr>
-      <w:rPr>
-        <w:rFonts w:ascii="Courier New" w:hAnsi="Courier New" w:cs="Courier New" w:hint="default"/>
-      </w:rPr>
-    </w:lvl>
-    <w:lvl w:ilvl="2" w:tplc="08090005" w:tentative="1">
-      <w:start w:val="1"/>
-      <w:numFmt w:val="bullet"/>
-      <w:lvlText w:val=""/>
-      <w:lvlJc w:val="left"/>
-      <w:pPr>
-        <w:ind w:left="2954" w:hanging="360"/>
-      </w:pPr>
-      <w:rPr>
-        <w:rFonts w:ascii="Wingdings" w:hAnsi="Wingdings" w:hint="default"/>
-      </w:rPr>
-    </w:lvl>
-    <w:lvl w:ilvl="3" w:tplc="08090001" w:tentative="1">
-      <w:start w:val="1"/>
-      <w:numFmt w:val="bullet"/>
-      <w:lvlText w:val=""/>
-      <w:lvlJc w:val="left"/>
-      <w:pPr>
-        <w:ind w:left="3674" w:hanging="360"/>
-      </w:pPr>
-      <w:rPr>
-        <w:rFonts w:ascii="Symbol" w:hAnsi="Symbol" w:hint="default"/>
-      </w:rPr>
-    </w:lvl>
-    <w:lvl w:ilvl="4" w:tplc="08090003" w:tentative="1">
-      <w:start w:val="1"/>
-      <w:numFmt w:val="bullet"/>
-      <w:lvlText w:val="o"/>
-      <w:lvlJc w:val="left"/>
-      <w:pPr>
-        <w:ind w:left="4394" w:hanging="360"/>
-      </w:pPr>
-      <w:rPr>
-        <w:rFonts w:ascii="Courier New" w:hAnsi="Courier New" w:cs="Courier New" w:hint="default"/>
-      </w:rPr>
-    </w:lvl>
-    <w:lvl w:ilvl="5" w:tplc="08090005" w:tentative="1">
-      <w:start w:val="1"/>
-      <w:numFmt w:val="bullet"/>
-      <w:lvlText w:val=""/>
-      <w:lvlJc w:val="left"/>
-      <w:pPr>
-        <w:ind w:left="5114" w:hanging="360"/>
-      </w:pPr>
-      <w:rPr>
-        <w:rFonts w:ascii="Wingdings" w:hAnsi="Wingdings" w:hint="default"/>
-      </w:rPr>
-    </w:lvl>
-    <w:lvl w:ilvl="6" w:tplc="08090001" w:tentative="1">
-      <w:start w:val="1"/>
-      <w:numFmt w:val="bullet"/>
-      <w:lvlText w:val=""/>
-      <w:lvlJc w:val="left"/>
-      <w:pPr>
-        <w:ind w:left="5834" w:hanging="360"/>
-      </w:pPr>
-      <w:rPr>
-        <w:rFonts w:ascii="Symbol" w:hAnsi="Symbol" w:hint="default"/>
-      </w:rPr>
-    </w:lvl>
-    <w:lvl w:ilvl="7" w:tplc="08090003" w:tentative="1">
-      <w:start w:val="1"/>
-      <w:numFmt w:val="bullet"/>
-      <w:lvlText w:val="o"/>
-      <w:lvlJc w:val="left"/>
-      <w:pPr>
-        <w:ind w:left="6554" w:hanging="360"/>
-      </w:pPr>
-      <w:rPr>
-        <w:rFonts w:ascii="Courier New" w:hAnsi="Courier New" w:cs="Courier New" w:hint="default"/>
-      </w:rPr>
-    </w:lvl>
-    <w:lvl w:ilvl="8" w:tplc="08090005" w:tentative="1">
-      <w:start w:val="1"/>
-      <w:numFmt w:val="bullet"/>
-      <w:lvlText w:val=""/>
-      <w:lvlJc w:val="left"/>
-      <w:pPr>
-        <w:ind w:left="7274" w:hanging="360"/>
-      </w:pPr>
-      <w:rPr>
-        <w:rFonts w:ascii="Wingdings" w:hAnsi="Wingdings" w:hint="default"/>
-      </w:rPr>
-    </w:lvl>
-  </w:abstractNum>
-  <w:abstractNum w:abstractNumId="20" w15:restartNumberingAfterBreak="0">
-    <w:nsid w:val="33476BD1"/>
-    <w:multiLevelType w:val="hybridMultilevel"/>
-    <w:tmpl w:val="882448D8"/>
-    <w:lvl w:ilvl="0" w:tplc="FFFFFFFF">
-      <w:start w:val="1"/>
-      <w:numFmt w:val="decimal"/>
-      <w:lvlText w:val="%1."/>
-      <w:lvlJc w:val="left"/>
-      <w:pPr>
-        <w:ind w:left="1514" w:hanging="360"/>
-      </w:pPr>
-    </w:lvl>
-    <w:lvl w:ilvl="1" w:tplc="FFFFFFFF" w:tentative="1">
-      <w:start w:val="1"/>
-      <w:numFmt w:val="lowerLetter"/>
-      <w:lvlText w:val="%2."/>
-      <w:lvlJc w:val="left"/>
-      <w:pPr>
-        <w:ind w:left="2234" w:hanging="360"/>
-      </w:pPr>
-    </w:lvl>
-    <w:lvl w:ilvl="2" w:tplc="FFFFFFFF" w:tentative="1">
-      <w:start w:val="1"/>
-      <w:numFmt w:val="lowerRoman"/>
-      <w:lvlText w:val="%3."/>
-      <w:lvlJc w:val="right"/>
-      <w:pPr>
-        <w:ind w:left="2954" w:hanging="180"/>
-      </w:pPr>
-    </w:lvl>
-    <w:lvl w:ilvl="3" w:tplc="FFFFFFFF" w:tentative="1">
-      <w:start w:val="1"/>
-      <w:numFmt w:val="decimal"/>
-      <w:lvlText w:val="%4."/>
-      <w:lvlJc w:val="left"/>
-      <w:pPr>
-        <w:ind w:left="3674" w:hanging="360"/>
-      </w:pPr>
-    </w:lvl>
-    <w:lvl w:ilvl="4" w:tplc="FFFFFFFF" w:tentative="1">
-      <w:start w:val="1"/>
-      <w:numFmt w:val="lowerLetter"/>
-      <w:lvlText w:val="%5."/>
-      <w:lvlJc w:val="left"/>
-      <w:pPr>
-        <w:ind w:left="4394" w:hanging="360"/>
-      </w:pPr>
-    </w:lvl>
-    <w:lvl w:ilvl="5" w:tplc="FFFFFFFF" w:tentative="1">
-      <w:start w:val="1"/>
-      <w:numFmt w:val="lowerRoman"/>
-      <w:lvlText w:val="%6."/>
-      <w:lvlJc w:val="right"/>
-      <w:pPr>
-        <w:ind w:left="5114" w:hanging="180"/>
-      </w:pPr>
-    </w:lvl>
-    <w:lvl w:ilvl="6" w:tplc="FFFFFFFF" w:tentative="1">
-      <w:start w:val="1"/>
-      <w:numFmt w:val="decimal"/>
-      <w:lvlText w:val="%7."/>
-      <w:lvlJc w:val="left"/>
-      <w:pPr>
-        <w:ind w:left="5834" w:hanging="360"/>
-      </w:pPr>
-    </w:lvl>
-    <w:lvl w:ilvl="7" w:tplc="FFFFFFFF" w:tentative="1">
-      <w:start w:val="1"/>
-      <w:numFmt w:val="lowerLetter"/>
-      <w:lvlText w:val="%8."/>
-      <w:lvlJc w:val="left"/>
-      <w:pPr>
-        <w:ind w:left="6554" w:hanging="360"/>
-      </w:pPr>
-    </w:lvl>
-    <w:lvl w:ilvl="8" w:tplc="FFFFFFFF" w:tentative="1">
-      <w:start w:val="1"/>
-      <w:numFmt w:val="lowerRoman"/>
-      <w:lvlText w:val="%9."/>
-      <w:lvlJc w:val="right"/>
-      <w:pPr>
-        <w:ind w:left="7274" w:hanging="180"/>
-      </w:pPr>
-    </w:lvl>
-  </w:abstractNum>
-  <w:abstractNum w:abstractNumId="21" w15:restartNumberingAfterBreak="0">
-    <w:nsid w:val="367A2940"/>
-    <w:multiLevelType w:val="hybridMultilevel"/>
-    <w:tmpl w:val="6C8CB2A0"/>
-    <w:lvl w:ilvl="0" w:tplc="30D271FA">
-      <w:start w:val="1"/>
-      <w:numFmt w:val="decimal"/>
-      <w:lvlText w:val="%1."/>
-      <w:lvlJc w:val="left"/>
-      <w:pPr>
-        <w:ind w:left="720" w:hanging="360"/>
-      </w:pPr>
-    </w:lvl>
-    <w:lvl w:ilvl="1" w:tplc="0A826698">
-      <w:numFmt w:val="decimal"/>
-      <w:lvlText w:val=""/>
-      <w:lvlJc w:val="left"/>
-    </w:lvl>
-    <w:lvl w:ilvl="2" w:tplc="34924846">
-      <w:numFmt w:val="decimal"/>
-      <w:lvlText w:val=""/>
-      <w:lvlJc w:val="left"/>
-    </w:lvl>
-    <w:lvl w:ilvl="3" w:tplc="F8186110">
-      <w:numFmt w:val="decimal"/>
-      <w:lvlText w:val=""/>
-      <w:lvlJc w:val="left"/>
-    </w:lvl>
-    <w:lvl w:ilvl="4" w:tplc="2F240666">
-      <w:numFmt w:val="decimal"/>
-      <w:lvlText w:val=""/>
-      <w:lvlJc w:val="left"/>
-    </w:lvl>
-    <w:lvl w:ilvl="5" w:tplc="EBE69D70">
-      <w:numFmt w:val="decimal"/>
-      <w:lvlText w:val=""/>
-      <w:lvlJc w:val="left"/>
-    </w:lvl>
-    <w:lvl w:ilvl="6" w:tplc="38B27AA2">
-      <w:numFmt w:val="decimal"/>
-      <w:lvlText w:val=""/>
-      <w:lvlJc w:val="left"/>
-    </w:lvl>
-    <w:lvl w:ilvl="7" w:tplc="3DD6A8FA">
-      <w:numFmt w:val="decimal"/>
-      <w:lvlText w:val=""/>
-      <w:lvlJc w:val="left"/>
-    </w:lvl>
-    <w:lvl w:ilvl="8" w:tplc="055C15B8">
-      <w:numFmt w:val="decimal"/>
-      <w:lvlText w:val=""/>
-      <w:lvlJc w:val="left"/>
-    </w:lvl>
-  </w:abstractNum>
-  <w:abstractNum w:abstractNumId="22" w15:restartNumberingAfterBreak="0">
+  <w:abstractNum w:abstractNumId="2" w15:restartNumberingAfterBreak="0">
     <w:nsid w:val="36FC208D"/>
     <w:multiLevelType w:val="hybridMultilevel"/>
     <w:tmpl w:val="00C4BFAC"/>
@@ -5791,7 +3802,7 @@
       </w:pPr>
     </w:lvl>
   </w:abstractNum>
-  <w:abstractNum w:abstractNumId="23" w15:restartNumberingAfterBreak="0">
+  <w:abstractNum w:abstractNumId="3" w15:restartNumberingAfterBreak="0">
     <w:nsid w:val="3804219C"/>
     <w:multiLevelType w:val="hybridMultilevel"/>
     <w:tmpl w:val="06D46D86"/>
@@ -5904,752 +3915,7 @@
       </w:rPr>
     </w:lvl>
   </w:abstractNum>
-  <w:abstractNum w:abstractNumId="24" w15:restartNumberingAfterBreak="0">
-    <w:nsid w:val="382C3807"/>
-    <w:multiLevelType w:val="hybridMultilevel"/>
-    <w:tmpl w:val="223802B6"/>
-    <w:lvl w:ilvl="0" w:tplc="FFFFFFFF">
-      <w:start w:val="5"/>
-      <w:numFmt w:val="decimal"/>
-      <w:lvlText w:val="%1."/>
-      <w:lvlJc w:val="left"/>
-      <w:pPr>
-        <w:ind w:left="1514" w:hanging="360"/>
-      </w:pPr>
-      <w:rPr>
-        <w:rFonts w:hint="default"/>
-      </w:rPr>
-    </w:lvl>
-    <w:lvl w:ilvl="1" w:tplc="FFFFFFFF" w:tentative="1">
-      <w:start w:val="1"/>
-      <w:numFmt w:val="lowerLetter"/>
-      <w:lvlText w:val="%2."/>
-      <w:lvlJc w:val="left"/>
-      <w:pPr>
-        <w:ind w:left="1440" w:hanging="360"/>
-      </w:pPr>
-    </w:lvl>
-    <w:lvl w:ilvl="2" w:tplc="FFFFFFFF" w:tentative="1">
-      <w:start w:val="1"/>
-      <w:numFmt w:val="lowerRoman"/>
-      <w:lvlText w:val="%3."/>
-      <w:lvlJc w:val="right"/>
-      <w:pPr>
-        <w:ind w:left="2160" w:hanging="180"/>
-      </w:pPr>
-    </w:lvl>
-    <w:lvl w:ilvl="3" w:tplc="FFFFFFFF" w:tentative="1">
-      <w:start w:val="1"/>
-      <w:numFmt w:val="decimal"/>
-      <w:lvlText w:val="%4."/>
-      <w:lvlJc w:val="left"/>
-      <w:pPr>
-        <w:ind w:left="2880" w:hanging="360"/>
-      </w:pPr>
-    </w:lvl>
-    <w:lvl w:ilvl="4" w:tplc="FFFFFFFF" w:tentative="1">
-      <w:start w:val="1"/>
-      <w:numFmt w:val="lowerLetter"/>
-      <w:lvlText w:val="%5."/>
-      <w:lvlJc w:val="left"/>
-      <w:pPr>
-        <w:ind w:left="3600" w:hanging="360"/>
-      </w:pPr>
-    </w:lvl>
-    <w:lvl w:ilvl="5" w:tplc="FFFFFFFF" w:tentative="1">
-      <w:start w:val="1"/>
-      <w:numFmt w:val="lowerRoman"/>
-      <w:lvlText w:val="%6."/>
-      <w:lvlJc w:val="right"/>
-      <w:pPr>
-        <w:ind w:left="4320" w:hanging="180"/>
-      </w:pPr>
-    </w:lvl>
-    <w:lvl w:ilvl="6" w:tplc="FFFFFFFF" w:tentative="1">
-      <w:start w:val="1"/>
-      <w:numFmt w:val="decimal"/>
-      <w:lvlText w:val="%7."/>
-      <w:lvlJc w:val="left"/>
-      <w:pPr>
-        <w:ind w:left="5040" w:hanging="360"/>
-      </w:pPr>
-    </w:lvl>
-    <w:lvl w:ilvl="7" w:tplc="FFFFFFFF" w:tentative="1">
-      <w:start w:val="1"/>
-      <w:numFmt w:val="lowerLetter"/>
-      <w:lvlText w:val="%8."/>
-      <w:lvlJc w:val="left"/>
-      <w:pPr>
-        <w:ind w:left="5760" w:hanging="360"/>
-      </w:pPr>
-    </w:lvl>
-    <w:lvl w:ilvl="8" w:tplc="FFFFFFFF" w:tentative="1">
-      <w:start w:val="1"/>
-      <w:numFmt w:val="lowerRoman"/>
-      <w:lvlText w:val="%9."/>
-      <w:lvlJc w:val="right"/>
-      <w:pPr>
-        <w:ind w:left="6480" w:hanging="180"/>
-      </w:pPr>
-    </w:lvl>
-  </w:abstractNum>
-  <w:abstractNum w:abstractNumId="25" w15:restartNumberingAfterBreak="0">
-    <w:nsid w:val="3B5A3486"/>
-    <w:multiLevelType w:val="hybridMultilevel"/>
-    <w:tmpl w:val="00C4BFAC"/>
-    <w:lvl w:ilvl="0" w:tplc="FFFFFFFF">
-      <w:start w:val="1"/>
-      <w:numFmt w:val="decimal"/>
-      <w:lvlText w:val="%1."/>
-      <w:lvlJc w:val="left"/>
-      <w:pPr>
-        <w:ind w:left="1514" w:hanging="360"/>
-      </w:pPr>
-    </w:lvl>
-    <w:lvl w:ilvl="1" w:tplc="FFFFFFFF" w:tentative="1">
-      <w:start w:val="1"/>
-      <w:numFmt w:val="lowerLetter"/>
-      <w:lvlText w:val="%2."/>
-      <w:lvlJc w:val="left"/>
-      <w:pPr>
-        <w:ind w:left="2234" w:hanging="360"/>
-      </w:pPr>
-    </w:lvl>
-    <w:lvl w:ilvl="2" w:tplc="FFFFFFFF" w:tentative="1">
-      <w:start w:val="1"/>
-      <w:numFmt w:val="lowerRoman"/>
-      <w:lvlText w:val="%3."/>
-      <w:lvlJc w:val="right"/>
-      <w:pPr>
-        <w:ind w:left="2954" w:hanging="180"/>
-      </w:pPr>
-    </w:lvl>
-    <w:lvl w:ilvl="3" w:tplc="FFFFFFFF" w:tentative="1">
-      <w:start w:val="1"/>
-      <w:numFmt w:val="decimal"/>
-      <w:lvlText w:val="%4."/>
-      <w:lvlJc w:val="left"/>
-      <w:pPr>
-        <w:ind w:left="3674" w:hanging="360"/>
-      </w:pPr>
-    </w:lvl>
-    <w:lvl w:ilvl="4" w:tplc="FFFFFFFF" w:tentative="1">
-      <w:start w:val="1"/>
-      <w:numFmt w:val="lowerLetter"/>
-      <w:lvlText w:val="%5."/>
-      <w:lvlJc w:val="left"/>
-      <w:pPr>
-        <w:ind w:left="4394" w:hanging="360"/>
-      </w:pPr>
-    </w:lvl>
-    <w:lvl w:ilvl="5" w:tplc="FFFFFFFF" w:tentative="1">
-      <w:start w:val="1"/>
-      <w:numFmt w:val="lowerRoman"/>
-      <w:lvlText w:val="%6."/>
-      <w:lvlJc w:val="right"/>
-      <w:pPr>
-        <w:ind w:left="5114" w:hanging="180"/>
-      </w:pPr>
-    </w:lvl>
-    <w:lvl w:ilvl="6" w:tplc="FFFFFFFF" w:tentative="1">
-      <w:start w:val="1"/>
-      <w:numFmt w:val="decimal"/>
-      <w:lvlText w:val="%7."/>
-      <w:lvlJc w:val="left"/>
-      <w:pPr>
-        <w:ind w:left="5834" w:hanging="360"/>
-      </w:pPr>
-    </w:lvl>
-    <w:lvl w:ilvl="7" w:tplc="FFFFFFFF" w:tentative="1">
-      <w:start w:val="1"/>
-      <w:numFmt w:val="lowerLetter"/>
-      <w:lvlText w:val="%8."/>
-      <w:lvlJc w:val="left"/>
-      <w:pPr>
-        <w:ind w:left="6554" w:hanging="360"/>
-      </w:pPr>
-    </w:lvl>
-    <w:lvl w:ilvl="8" w:tplc="FFFFFFFF" w:tentative="1">
-      <w:start w:val="1"/>
-      <w:numFmt w:val="lowerRoman"/>
-      <w:lvlText w:val="%9."/>
-      <w:lvlJc w:val="right"/>
-      <w:pPr>
-        <w:ind w:left="7274" w:hanging="180"/>
-      </w:pPr>
-    </w:lvl>
-  </w:abstractNum>
-  <w:abstractNum w:abstractNumId="26" w15:restartNumberingAfterBreak="0">
-    <w:nsid w:val="3C35743E"/>
-    <w:multiLevelType w:val="hybridMultilevel"/>
-    <w:tmpl w:val="8D0A22B2"/>
-    <w:lvl w:ilvl="0" w:tplc="0809000F">
-      <w:start w:val="1"/>
-      <w:numFmt w:val="decimal"/>
-      <w:lvlText w:val="%1."/>
-      <w:lvlJc w:val="left"/>
-      <w:pPr>
-        <w:ind w:left="1514" w:hanging="360"/>
-      </w:pPr>
-    </w:lvl>
-    <w:lvl w:ilvl="1" w:tplc="08090019" w:tentative="1">
-      <w:start w:val="1"/>
-      <w:numFmt w:val="lowerLetter"/>
-      <w:lvlText w:val="%2."/>
-      <w:lvlJc w:val="left"/>
-      <w:pPr>
-        <w:ind w:left="2234" w:hanging="360"/>
-      </w:pPr>
-    </w:lvl>
-    <w:lvl w:ilvl="2" w:tplc="0809001B" w:tentative="1">
-      <w:start w:val="1"/>
-      <w:numFmt w:val="lowerRoman"/>
-      <w:lvlText w:val="%3."/>
-      <w:lvlJc w:val="right"/>
-      <w:pPr>
-        <w:ind w:left="2954" w:hanging="180"/>
-      </w:pPr>
-    </w:lvl>
-    <w:lvl w:ilvl="3" w:tplc="0809000F" w:tentative="1">
-      <w:start w:val="1"/>
-      <w:numFmt w:val="decimal"/>
-      <w:lvlText w:val="%4."/>
-      <w:lvlJc w:val="left"/>
-      <w:pPr>
-        <w:ind w:left="3674" w:hanging="360"/>
-      </w:pPr>
-    </w:lvl>
-    <w:lvl w:ilvl="4" w:tplc="08090019" w:tentative="1">
-      <w:start w:val="1"/>
-      <w:numFmt w:val="lowerLetter"/>
-      <w:lvlText w:val="%5."/>
-      <w:lvlJc w:val="left"/>
-      <w:pPr>
-        <w:ind w:left="4394" w:hanging="360"/>
-      </w:pPr>
-    </w:lvl>
-    <w:lvl w:ilvl="5" w:tplc="0809001B" w:tentative="1">
-      <w:start w:val="1"/>
-      <w:numFmt w:val="lowerRoman"/>
-      <w:lvlText w:val="%6."/>
-      <w:lvlJc w:val="right"/>
-      <w:pPr>
-        <w:ind w:left="5114" w:hanging="180"/>
-      </w:pPr>
-    </w:lvl>
-    <w:lvl w:ilvl="6" w:tplc="0809000F" w:tentative="1">
-      <w:start w:val="1"/>
-      <w:numFmt w:val="decimal"/>
-      <w:lvlText w:val="%7."/>
-      <w:lvlJc w:val="left"/>
-      <w:pPr>
-        <w:ind w:left="5834" w:hanging="360"/>
-      </w:pPr>
-    </w:lvl>
-    <w:lvl w:ilvl="7" w:tplc="08090019" w:tentative="1">
-      <w:start w:val="1"/>
-      <w:numFmt w:val="lowerLetter"/>
-      <w:lvlText w:val="%8."/>
-      <w:lvlJc w:val="left"/>
-      <w:pPr>
-        <w:ind w:left="6554" w:hanging="360"/>
-      </w:pPr>
-    </w:lvl>
-    <w:lvl w:ilvl="8" w:tplc="0809001B" w:tentative="1">
-      <w:start w:val="1"/>
-      <w:numFmt w:val="lowerRoman"/>
-      <w:lvlText w:val="%9."/>
-      <w:lvlJc w:val="right"/>
-      <w:pPr>
-        <w:ind w:left="7274" w:hanging="180"/>
-      </w:pPr>
-    </w:lvl>
-  </w:abstractNum>
-  <w:abstractNum w:abstractNumId="27" w15:restartNumberingAfterBreak="0">
-    <w:nsid w:val="3DC6215A"/>
-    <w:multiLevelType w:val="hybridMultilevel"/>
-    <w:tmpl w:val="C1F0AFF2"/>
-    <w:lvl w:ilvl="0" w:tplc="FB0A5BF4">
-      <w:start w:val="1"/>
-      <w:numFmt w:val="decimal"/>
-      <w:lvlText w:val="%1."/>
-      <w:lvlJc w:val="left"/>
-      <w:pPr>
-        <w:ind w:left="720" w:hanging="360"/>
-      </w:pPr>
-    </w:lvl>
-    <w:lvl w:ilvl="1" w:tplc="08090019">
-      <w:start w:val="1"/>
-      <w:numFmt w:val="lowerLetter"/>
-      <w:lvlText w:val="%2."/>
-      <w:lvlJc w:val="left"/>
-      <w:pPr>
-        <w:ind w:left="1440" w:hanging="360"/>
-      </w:pPr>
-    </w:lvl>
-    <w:lvl w:ilvl="2" w:tplc="0809001B" w:tentative="1">
-      <w:start w:val="1"/>
-      <w:numFmt w:val="lowerRoman"/>
-      <w:lvlText w:val="%3."/>
-      <w:lvlJc w:val="right"/>
-      <w:pPr>
-        <w:ind w:left="2160" w:hanging="180"/>
-      </w:pPr>
-    </w:lvl>
-    <w:lvl w:ilvl="3" w:tplc="0809000F" w:tentative="1">
-      <w:start w:val="1"/>
-      <w:numFmt w:val="decimal"/>
-      <w:lvlText w:val="%4."/>
-      <w:lvlJc w:val="left"/>
-      <w:pPr>
-        <w:ind w:left="2880" w:hanging="360"/>
-      </w:pPr>
-    </w:lvl>
-    <w:lvl w:ilvl="4" w:tplc="08090019" w:tentative="1">
-      <w:start w:val="1"/>
-      <w:numFmt w:val="lowerLetter"/>
-      <w:lvlText w:val="%5."/>
-      <w:lvlJc w:val="left"/>
-      <w:pPr>
-        <w:ind w:left="3600" w:hanging="360"/>
-      </w:pPr>
-    </w:lvl>
-    <w:lvl w:ilvl="5" w:tplc="0809001B" w:tentative="1">
-      <w:start w:val="1"/>
-      <w:numFmt w:val="lowerRoman"/>
-      <w:lvlText w:val="%6."/>
-      <w:lvlJc w:val="right"/>
-      <w:pPr>
-        <w:ind w:left="4320" w:hanging="180"/>
-      </w:pPr>
-    </w:lvl>
-    <w:lvl w:ilvl="6" w:tplc="0809000F" w:tentative="1">
-      <w:start w:val="1"/>
-      <w:numFmt w:val="decimal"/>
-      <w:lvlText w:val="%7."/>
-      <w:lvlJc w:val="left"/>
-      <w:pPr>
-        <w:ind w:left="5040" w:hanging="360"/>
-      </w:pPr>
-    </w:lvl>
-    <w:lvl w:ilvl="7" w:tplc="08090019" w:tentative="1">
-      <w:start w:val="1"/>
-      <w:numFmt w:val="lowerLetter"/>
-      <w:lvlText w:val="%8."/>
-      <w:lvlJc w:val="left"/>
-      <w:pPr>
-        <w:ind w:left="5760" w:hanging="360"/>
-      </w:pPr>
-    </w:lvl>
-    <w:lvl w:ilvl="8" w:tplc="0809001B" w:tentative="1">
-      <w:start w:val="1"/>
-      <w:numFmt w:val="lowerRoman"/>
-      <w:lvlText w:val="%9."/>
-      <w:lvlJc w:val="right"/>
-      <w:pPr>
-        <w:ind w:left="6480" w:hanging="180"/>
-      </w:pPr>
-    </w:lvl>
-  </w:abstractNum>
-  <w:abstractNum w:abstractNumId="28" w15:restartNumberingAfterBreak="0">
-    <w:nsid w:val="42EC1BE1"/>
-    <w:multiLevelType w:val="hybridMultilevel"/>
-    <w:tmpl w:val="025CC792"/>
-    <w:lvl w:ilvl="0" w:tplc="FFFFFFFF">
-      <w:start w:val="1"/>
-      <w:numFmt w:val="decimal"/>
-      <w:lvlText w:val="%1."/>
-      <w:lvlJc w:val="left"/>
-      <w:pPr>
-        <w:ind w:left="1514" w:hanging="360"/>
-      </w:pPr>
-    </w:lvl>
-    <w:lvl w:ilvl="1" w:tplc="FFFFFFFF" w:tentative="1">
-      <w:start w:val="1"/>
-      <w:numFmt w:val="lowerLetter"/>
-      <w:lvlText w:val="%2."/>
-      <w:lvlJc w:val="left"/>
-      <w:pPr>
-        <w:ind w:left="2234" w:hanging="360"/>
-      </w:pPr>
-    </w:lvl>
-    <w:lvl w:ilvl="2" w:tplc="FFFFFFFF" w:tentative="1">
-      <w:start w:val="1"/>
-      <w:numFmt w:val="lowerRoman"/>
-      <w:lvlText w:val="%3."/>
-      <w:lvlJc w:val="right"/>
-      <w:pPr>
-        <w:ind w:left="2954" w:hanging="180"/>
-      </w:pPr>
-    </w:lvl>
-    <w:lvl w:ilvl="3" w:tplc="FFFFFFFF" w:tentative="1">
-      <w:start w:val="1"/>
-      <w:numFmt w:val="decimal"/>
-      <w:lvlText w:val="%4."/>
-      <w:lvlJc w:val="left"/>
-      <w:pPr>
-        <w:ind w:left="3674" w:hanging="360"/>
-      </w:pPr>
-    </w:lvl>
-    <w:lvl w:ilvl="4" w:tplc="FFFFFFFF" w:tentative="1">
-      <w:start w:val="1"/>
-      <w:numFmt w:val="lowerLetter"/>
-      <w:lvlText w:val="%5."/>
-      <w:lvlJc w:val="left"/>
-      <w:pPr>
-        <w:ind w:left="4394" w:hanging="360"/>
-      </w:pPr>
-    </w:lvl>
-    <w:lvl w:ilvl="5" w:tplc="FFFFFFFF" w:tentative="1">
-      <w:start w:val="1"/>
-      <w:numFmt w:val="lowerRoman"/>
-      <w:lvlText w:val="%6."/>
-      <w:lvlJc w:val="right"/>
-      <w:pPr>
-        <w:ind w:left="5114" w:hanging="180"/>
-      </w:pPr>
-    </w:lvl>
-    <w:lvl w:ilvl="6" w:tplc="FFFFFFFF" w:tentative="1">
-      <w:start w:val="1"/>
-      <w:numFmt w:val="decimal"/>
-      <w:lvlText w:val="%7."/>
-      <w:lvlJc w:val="left"/>
-      <w:pPr>
-        <w:ind w:left="5834" w:hanging="360"/>
-      </w:pPr>
-    </w:lvl>
-    <w:lvl w:ilvl="7" w:tplc="FFFFFFFF" w:tentative="1">
-      <w:start w:val="1"/>
-      <w:numFmt w:val="lowerLetter"/>
-      <w:lvlText w:val="%8."/>
-      <w:lvlJc w:val="left"/>
-      <w:pPr>
-        <w:ind w:left="6554" w:hanging="360"/>
-      </w:pPr>
-    </w:lvl>
-    <w:lvl w:ilvl="8" w:tplc="FFFFFFFF" w:tentative="1">
-      <w:start w:val="1"/>
-      <w:numFmt w:val="lowerRoman"/>
-      <w:lvlText w:val="%9."/>
-      <w:lvlJc w:val="right"/>
-      <w:pPr>
-        <w:ind w:left="7274" w:hanging="180"/>
-      </w:pPr>
-    </w:lvl>
-  </w:abstractNum>
-  <w:abstractNum w:abstractNumId="29" w15:restartNumberingAfterBreak="0">
-    <w:nsid w:val="443F55C5"/>
-    <w:multiLevelType w:val="hybridMultilevel"/>
-    <w:tmpl w:val="51129E04"/>
-    <w:lvl w:ilvl="0" w:tplc="FFFFFFFF">
-      <w:start w:val="1"/>
-      <w:numFmt w:val="decimal"/>
-      <w:lvlText w:val="%1."/>
-      <w:lvlJc w:val="left"/>
-      <w:pPr>
-        <w:ind w:left="1514" w:hanging="360"/>
-      </w:pPr>
-    </w:lvl>
-    <w:lvl w:ilvl="1" w:tplc="FFFFFFFF" w:tentative="1">
-      <w:start w:val="1"/>
-      <w:numFmt w:val="lowerLetter"/>
-      <w:lvlText w:val="%2."/>
-      <w:lvlJc w:val="left"/>
-      <w:pPr>
-        <w:ind w:left="2234" w:hanging="360"/>
-      </w:pPr>
-    </w:lvl>
-    <w:lvl w:ilvl="2" w:tplc="FFFFFFFF" w:tentative="1">
-      <w:start w:val="1"/>
-      <w:numFmt w:val="lowerRoman"/>
-      <w:lvlText w:val="%3."/>
-      <w:lvlJc w:val="right"/>
-      <w:pPr>
-        <w:ind w:left="2954" w:hanging="180"/>
-      </w:pPr>
-    </w:lvl>
-    <w:lvl w:ilvl="3" w:tplc="FFFFFFFF" w:tentative="1">
-      <w:start w:val="1"/>
-      <w:numFmt w:val="decimal"/>
-      <w:lvlText w:val="%4."/>
-      <w:lvlJc w:val="left"/>
-      <w:pPr>
-        <w:ind w:left="3674" w:hanging="360"/>
-      </w:pPr>
-    </w:lvl>
-    <w:lvl w:ilvl="4" w:tplc="FFFFFFFF" w:tentative="1">
-      <w:start w:val="1"/>
-      <w:numFmt w:val="lowerLetter"/>
-      <w:lvlText w:val="%5."/>
-      <w:lvlJc w:val="left"/>
-      <w:pPr>
-        <w:ind w:left="4394" w:hanging="360"/>
-      </w:pPr>
-    </w:lvl>
-    <w:lvl w:ilvl="5" w:tplc="FFFFFFFF" w:tentative="1">
-      <w:start w:val="1"/>
-      <w:numFmt w:val="lowerRoman"/>
-      <w:lvlText w:val="%6."/>
-      <w:lvlJc w:val="right"/>
-      <w:pPr>
-        <w:ind w:left="5114" w:hanging="180"/>
-      </w:pPr>
-    </w:lvl>
-    <w:lvl w:ilvl="6" w:tplc="FFFFFFFF" w:tentative="1">
-      <w:start w:val="1"/>
-      <w:numFmt w:val="decimal"/>
-      <w:lvlText w:val="%7."/>
-      <w:lvlJc w:val="left"/>
-      <w:pPr>
-        <w:ind w:left="5834" w:hanging="360"/>
-      </w:pPr>
-    </w:lvl>
-    <w:lvl w:ilvl="7" w:tplc="FFFFFFFF" w:tentative="1">
-      <w:start w:val="1"/>
-      <w:numFmt w:val="lowerLetter"/>
-      <w:lvlText w:val="%8."/>
-      <w:lvlJc w:val="left"/>
-      <w:pPr>
-        <w:ind w:left="6554" w:hanging="360"/>
-      </w:pPr>
-    </w:lvl>
-    <w:lvl w:ilvl="8" w:tplc="FFFFFFFF" w:tentative="1">
-      <w:start w:val="1"/>
-      <w:numFmt w:val="lowerRoman"/>
-      <w:lvlText w:val="%9."/>
-      <w:lvlJc w:val="right"/>
-      <w:pPr>
-        <w:ind w:left="7274" w:hanging="180"/>
-      </w:pPr>
-    </w:lvl>
-  </w:abstractNum>
-  <w:abstractNum w:abstractNumId="30" w15:restartNumberingAfterBreak="0">
-    <w:nsid w:val="46BA7F74"/>
-    <w:multiLevelType w:val="hybridMultilevel"/>
-    <w:tmpl w:val="562657E4"/>
-    <w:lvl w:ilvl="0" w:tplc="FFFFFFFF">
-      <w:start w:val="1"/>
-      <w:numFmt w:val="bullet"/>
-      <w:lvlText w:val=""/>
-      <w:lvlJc w:val="left"/>
-      <w:pPr>
-        <w:ind w:left="720" w:hanging="360"/>
-      </w:pPr>
-      <w:rPr>
-        <w:rFonts w:ascii="Symbol" w:hAnsi="Symbol" w:hint="default"/>
-      </w:rPr>
-    </w:lvl>
-    <w:lvl w:ilvl="1" w:tplc="08090001">
-      <w:start w:val="1"/>
-      <w:numFmt w:val="bullet"/>
-      <w:lvlText w:val=""/>
-      <w:lvlJc w:val="left"/>
-      <w:pPr>
-        <w:ind w:left="1440" w:hanging="360"/>
-      </w:pPr>
-      <w:rPr>
-        <w:rFonts w:ascii="Symbol" w:hAnsi="Symbol" w:hint="default"/>
-      </w:rPr>
-    </w:lvl>
-    <w:lvl w:ilvl="2" w:tplc="FFFFFFFF" w:tentative="1">
-      <w:start w:val="1"/>
-      <w:numFmt w:val="bullet"/>
-      <w:lvlText w:val=""/>
-      <w:lvlJc w:val="left"/>
-      <w:pPr>
-        <w:ind w:left="2160" w:hanging="360"/>
-      </w:pPr>
-      <w:rPr>
-        <w:rFonts w:ascii="Wingdings" w:hAnsi="Wingdings" w:hint="default"/>
-      </w:rPr>
-    </w:lvl>
-    <w:lvl w:ilvl="3" w:tplc="FFFFFFFF" w:tentative="1">
-      <w:start w:val="1"/>
-      <w:numFmt w:val="bullet"/>
-      <w:lvlText w:val=""/>
-      <w:lvlJc w:val="left"/>
-      <w:pPr>
-        <w:ind w:left="2880" w:hanging="360"/>
-      </w:pPr>
-      <w:rPr>
-        <w:rFonts w:ascii="Symbol" w:hAnsi="Symbol" w:hint="default"/>
-      </w:rPr>
-    </w:lvl>
-    <w:lvl w:ilvl="4" w:tplc="FFFFFFFF" w:tentative="1">
-      <w:start w:val="1"/>
-      <w:numFmt w:val="bullet"/>
-      <w:lvlText w:val="o"/>
-      <w:lvlJc w:val="left"/>
-      <w:pPr>
-        <w:ind w:left="3600" w:hanging="360"/>
-      </w:pPr>
-      <w:rPr>
-        <w:rFonts w:ascii="Courier New" w:hAnsi="Courier New" w:cs="Courier New" w:hint="default"/>
-      </w:rPr>
-    </w:lvl>
-    <w:lvl w:ilvl="5" w:tplc="FFFFFFFF" w:tentative="1">
-      <w:start w:val="1"/>
-      <w:numFmt w:val="bullet"/>
-      <w:lvlText w:val=""/>
-      <w:lvlJc w:val="left"/>
-      <w:pPr>
-        <w:ind w:left="4320" w:hanging="360"/>
-      </w:pPr>
-      <w:rPr>
-        <w:rFonts w:ascii="Wingdings" w:hAnsi="Wingdings" w:hint="default"/>
-      </w:rPr>
-    </w:lvl>
-    <w:lvl w:ilvl="6" w:tplc="FFFFFFFF" w:tentative="1">
-      <w:start w:val="1"/>
-      <w:numFmt w:val="bullet"/>
-      <w:lvlText w:val=""/>
-      <w:lvlJc w:val="left"/>
-      <w:pPr>
-        <w:ind w:left="5040" w:hanging="360"/>
-      </w:pPr>
-      <w:rPr>
-        <w:rFonts w:ascii="Symbol" w:hAnsi="Symbol" w:hint="default"/>
-      </w:rPr>
-    </w:lvl>
-    <w:lvl w:ilvl="7" w:tplc="FFFFFFFF" w:tentative="1">
-      <w:start w:val="1"/>
-      <w:numFmt w:val="bullet"/>
-      <w:lvlText w:val="o"/>
-      <w:lvlJc w:val="left"/>
-      <w:pPr>
-        <w:ind w:left="5760" w:hanging="360"/>
-      </w:pPr>
-      <w:rPr>
-        <w:rFonts w:ascii="Courier New" w:hAnsi="Courier New" w:cs="Courier New" w:hint="default"/>
-      </w:rPr>
-    </w:lvl>
-    <w:lvl w:ilvl="8" w:tplc="FFFFFFFF" w:tentative="1">
-      <w:start w:val="1"/>
-      <w:numFmt w:val="bullet"/>
-      <w:lvlText w:val=""/>
-      <w:lvlJc w:val="left"/>
-      <w:pPr>
-        <w:ind w:left="6480" w:hanging="360"/>
-      </w:pPr>
-      <w:rPr>
-        <w:rFonts w:ascii="Wingdings" w:hAnsi="Wingdings" w:hint="default"/>
-      </w:rPr>
-    </w:lvl>
-  </w:abstractNum>
-  <w:abstractNum w:abstractNumId="31" w15:restartNumberingAfterBreak="0">
-    <w:nsid w:val="46E16587"/>
-    <w:multiLevelType w:val="multilevel"/>
-    <w:tmpl w:val="6D4C937C"/>
-    <w:lvl w:ilvl="0">
-      <w:start w:val="1"/>
-      <w:numFmt w:val="decimal"/>
-      <w:lvlText w:val="%1."/>
-      <w:lvlJc w:val="left"/>
-      <w:pPr>
-        <w:ind w:left="360" w:hanging="360"/>
-      </w:pPr>
-      <w:rPr>
-        <w:rFonts w:hint="default"/>
-      </w:rPr>
-    </w:lvl>
-    <w:lvl w:ilvl="1">
-      <w:start w:val="1"/>
-      <w:numFmt w:val="decimal"/>
-      <w:lvlText w:val="%1.%2."/>
-      <w:lvlJc w:val="left"/>
-      <w:pPr>
-        <w:ind w:left="720" w:hanging="360"/>
-      </w:pPr>
-      <w:rPr>
-        <w:rFonts w:hint="default"/>
-      </w:rPr>
-    </w:lvl>
-    <w:lvl w:ilvl="2">
-      <w:start w:val="1"/>
-      <w:numFmt w:val="lowerRoman"/>
-      <w:lvlText w:val="%3)"/>
-      <w:lvlJc w:val="left"/>
-      <w:pPr>
-        <w:ind w:left="1080" w:hanging="360"/>
-      </w:pPr>
-      <w:rPr>
-        <w:rFonts w:hint="default"/>
-      </w:rPr>
-    </w:lvl>
-    <w:lvl w:ilvl="3">
-      <w:start w:val="1"/>
-      <w:numFmt w:val="decimal"/>
-      <w:lvlText w:val="(%4)"/>
-      <w:lvlJc w:val="left"/>
-      <w:pPr>
-        <w:ind w:left="1440" w:hanging="360"/>
-      </w:pPr>
-      <w:rPr>
-        <w:rFonts w:hint="default"/>
-      </w:rPr>
-    </w:lvl>
-    <w:lvl w:ilvl="4">
-      <w:start w:val="1"/>
-      <w:numFmt w:val="lowerLetter"/>
-      <w:lvlText w:val="(%5)"/>
-      <w:lvlJc w:val="left"/>
-      <w:pPr>
-        <w:ind w:left="1800" w:hanging="360"/>
-      </w:pPr>
-      <w:rPr>
-        <w:rFonts w:hint="default"/>
-      </w:rPr>
-    </w:lvl>
-    <w:lvl w:ilvl="5">
-      <w:start w:val="1"/>
-      <w:numFmt w:val="lowerRoman"/>
-      <w:lvlText w:val="(%6)"/>
-      <w:lvlJc w:val="left"/>
-      <w:pPr>
-        <w:ind w:left="2160" w:hanging="360"/>
-      </w:pPr>
-      <w:rPr>
-        <w:rFonts w:hint="default"/>
-      </w:rPr>
-    </w:lvl>
-    <w:lvl w:ilvl="6">
-      <w:start w:val="1"/>
-      <w:numFmt w:val="decimal"/>
-      <w:lvlText w:val="%7."/>
-      <w:lvlJc w:val="left"/>
-      <w:pPr>
-        <w:ind w:left="2520" w:hanging="360"/>
-      </w:pPr>
-      <w:rPr>
-        <w:rFonts w:hint="default"/>
-      </w:rPr>
-    </w:lvl>
-    <w:lvl w:ilvl="7">
-      <w:start w:val="1"/>
-      <w:numFmt w:val="lowerLetter"/>
-      <w:lvlText w:val="%8."/>
-      <w:lvlJc w:val="left"/>
-      <w:pPr>
-        <w:ind w:left="2880" w:hanging="360"/>
-      </w:pPr>
-      <w:rPr>
-        <w:rFonts w:hint="default"/>
-      </w:rPr>
-    </w:lvl>
-    <w:lvl w:ilvl="8">
-      <w:start w:val="1"/>
-      <w:numFmt w:val="lowerRoman"/>
-      <w:lvlText w:val="%9."/>
-      <w:lvlJc w:val="left"/>
-      <w:pPr>
-        <w:ind w:left="3240" w:hanging="360"/>
-      </w:pPr>
-      <w:rPr>
-        <w:rFonts w:hint="default"/>
-      </w:rPr>
-    </w:lvl>
-  </w:abstractNum>
-  <w:abstractNum w:abstractNumId="32" w15:restartNumberingAfterBreak="0">
+  <w:abstractNum w:abstractNumId="4" w15:restartNumberingAfterBreak="0">
     <w:nsid w:val="499D591B"/>
     <w:multiLevelType w:val="hybridMultilevel"/>
     <w:tmpl w:val="56C2AB62"/>
@@ -6735,985 +4001,7 @@
       </w:pPr>
     </w:lvl>
   </w:abstractNum>
-  <w:abstractNum w:abstractNumId="33" w15:restartNumberingAfterBreak="0">
-    <w:nsid w:val="4BDA3FBD"/>
-    <w:multiLevelType w:val="hybridMultilevel"/>
-    <w:tmpl w:val="882448D8"/>
-    <w:lvl w:ilvl="0" w:tplc="FFFFFFFF">
-      <w:start w:val="1"/>
-      <w:numFmt w:val="decimal"/>
-      <w:lvlText w:val="%1."/>
-      <w:lvlJc w:val="left"/>
-      <w:pPr>
-        <w:ind w:left="1514" w:hanging="360"/>
-      </w:pPr>
-    </w:lvl>
-    <w:lvl w:ilvl="1" w:tplc="FFFFFFFF" w:tentative="1">
-      <w:start w:val="1"/>
-      <w:numFmt w:val="lowerLetter"/>
-      <w:lvlText w:val="%2."/>
-      <w:lvlJc w:val="left"/>
-      <w:pPr>
-        <w:ind w:left="2234" w:hanging="360"/>
-      </w:pPr>
-    </w:lvl>
-    <w:lvl w:ilvl="2" w:tplc="FFFFFFFF" w:tentative="1">
-      <w:start w:val="1"/>
-      <w:numFmt w:val="lowerRoman"/>
-      <w:lvlText w:val="%3."/>
-      <w:lvlJc w:val="right"/>
-      <w:pPr>
-        <w:ind w:left="2954" w:hanging="180"/>
-      </w:pPr>
-    </w:lvl>
-    <w:lvl w:ilvl="3" w:tplc="FFFFFFFF" w:tentative="1">
-      <w:start w:val="1"/>
-      <w:numFmt w:val="decimal"/>
-      <w:lvlText w:val="%4."/>
-      <w:lvlJc w:val="left"/>
-      <w:pPr>
-        <w:ind w:left="3674" w:hanging="360"/>
-      </w:pPr>
-    </w:lvl>
-    <w:lvl w:ilvl="4" w:tplc="FFFFFFFF" w:tentative="1">
-      <w:start w:val="1"/>
-      <w:numFmt w:val="lowerLetter"/>
-      <w:lvlText w:val="%5."/>
-      <w:lvlJc w:val="left"/>
-      <w:pPr>
-        <w:ind w:left="4394" w:hanging="360"/>
-      </w:pPr>
-    </w:lvl>
-    <w:lvl w:ilvl="5" w:tplc="FFFFFFFF" w:tentative="1">
-      <w:start w:val="1"/>
-      <w:numFmt w:val="lowerRoman"/>
-      <w:lvlText w:val="%6."/>
-      <w:lvlJc w:val="right"/>
-      <w:pPr>
-        <w:ind w:left="5114" w:hanging="180"/>
-      </w:pPr>
-    </w:lvl>
-    <w:lvl w:ilvl="6" w:tplc="FFFFFFFF" w:tentative="1">
-      <w:start w:val="1"/>
-      <w:numFmt w:val="decimal"/>
-      <w:lvlText w:val="%7."/>
-      <w:lvlJc w:val="left"/>
-      <w:pPr>
-        <w:ind w:left="5834" w:hanging="360"/>
-      </w:pPr>
-    </w:lvl>
-    <w:lvl w:ilvl="7" w:tplc="FFFFFFFF" w:tentative="1">
-      <w:start w:val="1"/>
-      <w:numFmt w:val="lowerLetter"/>
-      <w:lvlText w:val="%8."/>
-      <w:lvlJc w:val="left"/>
-      <w:pPr>
-        <w:ind w:left="6554" w:hanging="360"/>
-      </w:pPr>
-    </w:lvl>
-    <w:lvl w:ilvl="8" w:tplc="FFFFFFFF" w:tentative="1">
-      <w:start w:val="1"/>
-      <w:numFmt w:val="lowerRoman"/>
-      <w:lvlText w:val="%9."/>
-      <w:lvlJc w:val="right"/>
-      <w:pPr>
-        <w:ind w:left="7274" w:hanging="180"/>
-      </w:pPr>
-    </w:lvl>
-  </w:abstractNum>
-  <w:abstractNum w:abstractNumId="34" w15:restartNumberingAfterBreak="0">
-    <w:nsid w:val="4DE87AD4"/>
-    <w:multiLevelType w:val="hybridMultilevel"/>
-    <w:tmpl w:val="BC105A9C"/>
-    <w:lvl w:ilvl="0" w:tplc="08090001">
-      <w:start w:val="1"/>
-      <w:numFmt w:val="bullet"/>
-      <w:lvlText w:val=""/>
-      <w:lvlJc w:val="left"/>
-      <w:pPr>
-        <w:ind w:left="720" w:hanging="360"/>
-      </w:pPr>
-      <w:rPr>
-        <w:rFonts w:ascii="Symbol" w:hAnsi="Symbol" w:hint="default"/>
-      </w:rPr>
-    </w:lvl>
-    <w:lvl w:ilvl="1" w:tplc="08090003">
-      <w:start w:val="1"/>
-      <w:numFmt w:val="bullet"/>
-      <w:lvlText w:val="o"/>
-      <w:lvlJc w:val="left"/>
-      <w:pPr>
-        <w:ind w:left="1440" w:hanging="360"/>
-      </w:pPr>
-      <w:rPr>
-        <w:rFonts w:ascii="Courier New" w:hAnsi="Courier New" w:cs="Courier New" w:hint="default"/>
-      </w:rPr>
-    </w:lvl>
-    <w:lvl w:ilvl="2" w:tplc="08090005" w:tentative="1">
-      <w:start w:val="1"/>
-      <w:numFmt w:val="bullet"/>
-      <w:lvlText w:val=""/>
-      <w:lvlJc w:val="left"/>
-      <w:pPr>
-        <w:ind w:left="2160" w:hanging="360"/>
-      </w:pPr>
-      <w:rPr>
-        <w:rFonts w:ascii="Wingdings" w:hAnsi="Wingdings" w:hint="default"/>
-      </w:rPr>
-    </w:lvl>
-    <w:lvl w:ilvl="3" w:tplc="08090001" w:tentative="1">
-      <w:start w:val="1"/>
-      <w:numFmt w:val="bullet"/>
-      <w:lvlText w:val=""/>
-      <w:lvlJc w:val="left"/>
-      <w:pPr>
-        <w:ind w:left="2880" w:hanging="360"/>
-      </w:pPr>
-      <w:rPr>
-        <w:rFonts w:ascii="Symbol" w:hAnsi="Symbol" w:hint="default"/>
-      </w:rPr>
-    </w:lvl>
-    <w:lvl w:ilvl="4" w:tplc="08090003" w:tentative="1">
-      <w:start w:val="1"/>
-      <w:numFmt w:val="bullet"/>
-      <w:lvlText w:val="o"/>
-      <w:lvlJc w:val="left"/>
-      <w:pPr>
-        <w:ind w:left="3600" w:hanging="360"/>
-      </w:pPr>
-      <w:rPr>
-        <w:rFonts w:ascii="Courier New" w:hAnsi="Courier New" w:cs="Courier New" w:hint="default"/>
-      </w:rPr>
-    </w:lvl>
-    <w:lvl w:ilvl="5" w:tplc="08090005" w:tentative="1">
-      <w:start w:val="1"/>
-      <w:numFmt w:val="bullet"/>
-      <w:lvlText w:val=""/>
-      <w:lvlJc w:val="left"/>
-      <w:pPr>
-        <w:ind w:left="4320" w:hanging="360"/>
-      </w:pPr>
-      <w:rPr>
-        <w:rFonts w:ascii="Wingdings" w:hAnsi="Wingdings" w:hint="default"/>
-      </w:rPr>
-    </w:lvl>
-    <w:lvl w:ilvl="6" w:tplc="08090001" w:tentative="1">
-      <w:start w:val="1"/>
-      <w:numFmt w:val="bullet"/>
-      <w:lvlText w:val=""/>
-      <w:lvlJc w:val="left"/>
-      <w:pPr>
-        <w:ind w:left="5040" w:hanging="360"/>
-      </w:pPr>
-      <w:rPr>
-        <w:rFonts w:ascii="Symbol" w:hAnsi="Symbol" w:hint="default"/>
-      </w:rPr>
-    </w:lvl>
-    <w:lvl w:ilvl="7" w:tplc="08090003" w:tentative="1">
-      <w:start w:val="1"/>
-      <w:numFmt w:val="bullet"/>
-      <w:lvlText w:val="o"/>
-      <w:lvlJc w:val="left"/>
-      <w:pPr>
-        <w:ind w:left="5760" w:hanging="360"/>
-      </w:pPr>
-      <w:rPr>
-        <w:rFonts w:ascii="Courier New" w:hAnsi="Courier New" w:cs="Courier New" w:hint="default"/>
-      </w:rPr>
-    </w:lvl>
-    <w:lvl w:ilvl="8" w:tplc="08090005" w:tentative="1">
-      <w:start w:val="1"/>
-      <w:numFmt w:val="bullet"/>
-      <w:lvlText w:val=""/>
-      <w:lvlJc w:val="left"/>
-      <w:pPr>
-        <w:ind w:left="6480" w:hanging="360"/>
-      </w:pPr>
-      <w:rPr>
-        <w:rFonts w:ascii="Wingdings" w:hAnsi="Wingdings" w:hint="default"/>
-      </w:rPr>
-    </w:lvl>
-  </w:abstractNum>
-  <w:abstractNum w:abstractNumId="35" w15:restartNumberingAfterBreak="0">
-    <w:nsid w:val="4ED9112D"/>
-    <w:multiLevelType w:val="hybridMultilevel"/>
-    <w:tmpl w:val="77686270"/>
-    <w:lvl w:ilvl="0" w:tplc="77CEB290">
-      <w:start w:val="1"/>
-      <w:numFmt w:val="decimal"/>
-      <w:lvlText w:val="%1."/>
-      <w:lvlJc w:val="left"/>
-      <w:pPr>
-        <w:ind w:left="947" w:hanging="360"/>
-      </w:pPr>
-    </w:lvl>
-    <w:lvl w:ilvl="1" w:tplc="08090019" w:tentative="1">
-      <w:start w:val="1"/>
-      <w:numFmt w:val="lowerLetter"/>
-      <w:lvlText w:val="%2."/>
-      <w:lvlJc w:val="left"/>
-      <w:pPr>
-        <w:ind w:left="1667" w:hanging="360"/>
-      </w:pPr>
-    </w:lvl>
-    <w:lvl w:ilvl="2" w:tplc="0809001B" w:tentative="1">
-      <w:start w:val="1"/>
-      <w:numFmt w:val="lowerRoman"/>
-      <w:lvlText w:val="%3."/>
-      <w:lvlJc w:val="right"/>
-      <w:pPr>
-        <w:ind w:left="2387" w:hanging="180"/>
-      </w:pPr>
-    </w:lvl>
-    <w:lvl w:ilvl="3" w:tplc="0809000F" w:tentative="1">
-      <w:start w:val="1"/>
-      <w:numFmt w:val="decimal"/>
-      <w:lvlText w:val="%4."/>
-      <w:lvlJc w:val="left"/>
-      <w:pPr>
-        <w:ind w:left="3107" w:hanging="360"/>
-      </w:pPr>
-    </w:lvl>
-    <w:lvl w:ilvl="4" w:tplc="08090019" w:tentative="1">
-      <w:start w:val="1"/>
-      <w:numFmt w:val="lowerLetter"/>
-      <w:lvlText w:val="%5."/>
-      <w:lvlJc w:val="left"/>
-      <w:pPr>
-        <w:ind w:left="3827" w:hanging="360"/>
-      </w:pPr>
-    </w:lvl>
-    <w:lvl w:ilvl="5" w:tplc="0809001B" w:tentative="1">
-      <w:start w:val="1"/>
-      <w:numFmt w:val="lowerRoman"/>
-      <w:lvlText w:val="%6."/>
-      <w:lvlJc w:val="right"/>
-      <w:pPr>
-        <w:ind w:left="4547" w:hanging="180"/>
-      </w:pPr>
-    </w:lvl>
-    <w:lvl w:ilvl="6" w:tplc="0809000F" w:tentative="1">
-      <w:start w:val="1"/>
-      <w:numFmt w:val="decimal"/>
-      <w:lvlText w:val="%7."/>
-      <w:lvlJc w:val="left"/>
-      <w:pPr>
-        <w:ind w:left="5267" w:hanging="360"/>
-      </w:pPr>
-    </w:lvl>
-    <w:lvl w:ilvl="7" w:tplc="08090019" w:tentative="1">
-      <w:start w:val="1"/>
-      <w:numFmt w:val="lowerLetter"/>
-      <w:lvlText w:val="%8."/>
-      <w:lvlJc w:val="left"/>
-      <w:pPr>
-        <w:ind w:left="5987" w:hanging="360"/>
-      </w:pPr>
-    </w:lvl>
-    <w:lvl w:ilvl="8" w:tplc="0809001B" w:tentative="1">
-      <w:start w:val="1"/>
-      <w:numFmt w:val="lowerRoman"/>
-      <w:lvlText w:val="%9."/>
-      <w:lvlJc w:val="right"/>
-      <w:pPr>
-        <w:ind w:left="6707" w:hanging="180"/>
-      </w:pPr>
-    </w:lvl>
-  </w:abstractNum>
-  <w:abstractNum w:abstractNumId="36" w15:restartNumberingAfterBreak="0">
-    <w:nsid w:val="53954D63"/>
-    <w:multiLevelType w:val="hybridMultilevel"/>
-    <w:tmpl w:val="38686616"/>
-    <w:lvl w:ilvl="0" w:tplc="08090001">
-      <w:start w:val="1"/>
-      <w:numFmt w:val="bullet"/>
-      <w:lvlText w:val=""/>
-      <w:lvlJc w:val="left"/>
-      <w:pPr>
-        <w:ind w:left="1447" w:hanging="360"/>
-      </w:pPr>
-      <w:rPr>
-        <w:rFonts w:ascii="Symbol" w:hAnsi="Symbol" w:hint="default"/>
-      </w:rPr>
-    </w:lvl>
-    <w:lvl w:ilvl="1" w:tplc="08090003" w:tentative="1">
-      <w:start w:val="1"/>
-      <w:numFmt w:val="bullet"/>
-      <w:lvlText w:val="o"/>
-      <w:lvlJc w:val="left"/>
-      <w:pPr>
-        <w:ind w:left="2167" w:hanging="360"/>
-      </w:pPr>
-      <w:rPr>
-        <w:rFonts w:ascii="Courier New" w:hAnsi="Courier New" w:cs="Courier New" w:hint="default"/>
-      </w:rPr>
-    </w:lvl>
-    <w:lvl w:ilvl="2" w:tplc="08090005" w:tentative="1">
-      <w:start w:val="1"/>
-      <w:numFmt w:val="bullet"/>
-      <w:lvlText w:val=""/>
-      <w:lvlJc w:val="left"/>
-      <w:pPr>
-        <w:ind w:left="2887" w:hanging="360"/>
-      </w:pPr>
-      <w:rPr>
-        <w:rFonts w:ascii="Wingdings" w:hAnsi="Wingdings" w:hint="default"/>
-      </w:rPr>
-    </w:lvl>
-    <w:lvl w:ilvl="3" w:tplc="08090001" w:tentative="1">
-      <w:start w:val="1"/>
-      <w:numFmt w:val="bullet"/>
-      <w:lvlText w:val=""/>
-      <w:lvlJc w:val="left"/>
-      <w:pPr>
-        <w:ind w:left="3607" w:hanging="360"/>
-      </w:pPr>
-      <w:rPr>
-        <w:rFonts w:ascii="Symbol" w:hAnsi="Symbol" w:hint="default"/>
-      </w:rPr>
-    </w:lvl>
-    <w:lvl w:ilvl="4" w:tplc="08090003" w:tentative="1">
-      <w:start w:val="1"/>
-      <w:numFmt w:val="bullet"/>
-      <w:lvlText w:val="o"/>
-      <w:lvlJc w:val="left"/>
-      <w:pPr>
-        <w:ind w:left="4327" w:hanging="360"/>
-      </w:pPr>
-      <w:rPr>
-        <w:rFonts w:ascii="Courier New" w:hAnsi="Courier New" w:cs="Courier New" w:hint="default"/>
-      </w:rPr>
-    </w:lvl>
-    <w:lvl w:ilvl="5" w:tplc="08090005" w:tentative="1">
-      <w:start w:val="1"/>
-      <w:numFmt w:val="bullet"/>
-      <w:lvlText w:val=""/>
-      <w:lvlJc w:val="left"/>
-      <w:pPr>
-        <w:ind w:left="5047" w:hanging="360"/>
-      </w:pPr>
-      <w:rPr>
-        <w:rFonts w:ascii="Wingdings" w:hAnsi="Wingdings" w:hint="default"/>
-      </w:rPr>
-    </w:lvl>
-    <w:lvl w:ilvl="6" w:tplc="08090001" w:tentative="1">
-      <w:start w:val="1"/>
-      <w:numFmt w:val="bullet"/>
-      <w:lvlText w:val=""/>
-      <w:lvlJc w:val="left"/>
-      <w:pPr>
-        <w:ind w:left="5767" w:hanging="360"/>
-      </w:pPr>
-      <w:rPr>
-        <w:rFonts w:ascii="Symbol" w:hAnsi="Symbol" w:hint="default"/>
-      </w:rPr>
-    </w:lvl>
-    <w:lvl w:ilvl="7" w:tplc="08090003" w:tentative="1">
-      <w:start w:val="1"/>
-      <w:numFmt w:val="bullet"/>
-      <w:lvlText w:val="o"/>
-      <w:lvlJc w:val="left"/>
-      <w:pPr>
-        <w:ind w:left="6487" w:hanging="360"/>
-      </w:pPr>
-      <w:rPr>
-        <w:rFonts w:ascii="Courier New" w:hAnsi="Courier New" w:cs="Courier New" w:hint="default"/>
-      </w:rPr>
-    </w:lvl>
-    <w:lvl w:ilvl="8" w:tplc="08090005" w:tentative="1">
-      <w:start w:val="1"/>
-      <w:numFmt w:val="bullet"/>
-      <w:lvlText w:val=""/>
-      <w:lvlJc w:val="left"/>
-      <w:pPr>
-        <w:ind w:left="7207" w:hanging="360"/>
-      </w:pPr>
-      <w:rPr>
-        <w:rFonts w:ascii="Wingdings" w:hAnsi="Wingdings" w:hint="default"/>
-      </w:rPr>
-    </w:lvl>
-  </w:abstractNum>
-  <w:abstractNum w:abstractNumId="37" w15:restartNumberingAfterBreak="0">
-    <w:nsid w:val="548650DE"/>
-    <w:multiLevelType w:val="hybridMultilevel"/>
-    <w:tmpl w:val="5AB2D90C"/>
-    <w:lvl w:ilvl="0" w:tplc="08090001">
-      <w:start w:val="1"/>
-      <w:numFmt w:val="bullet"/>
-      <w:lvlText w:val=""/>
-      <w:lvlJc w:val="left"/>
-      <w:pPr>
-        <w:ind w:left="3600" w:hanging="360"/>
-      </w:pPr>
-      <w:rPr>
-        <w:rFonts w:ascii="Symbol" w:hAnsi="Symbol" w:hint="default"/>
-      </w:rPr>
-    </w:lvl>
-    <w:lvl w:ilvl="1" w:tplc="08090003" w:tentative="1">
-      <w:start w:val="1"/>
-      <w:numFmt w:val="bullet"/>
-      <w:lvlText w:val="o"/>
-      <w:lvlJc w:val="left"/>
-      <w:pPr>
-        <w:ind w:left="4320" w:hanging="360"/>
-      </w:pPr>
-      <w:rPr>
-        <w:rFonts w:ascii="Courier New" w:hAnsi="Courier New" w:cs="Courier New" w:hint="default"/>
-      </w:rPr>
-    </w:lvl>
-    <w:lvl w:ilvl="2" w:tplc="08090005" w:tentative="1">
-      <w:start w:val="1"/>
-      <w:numFmt w:val="bullet"/>
-      <w:lvlText w:val=""/>
-      <w:lvlJc w:val="left"/>
-      <w:pPr>
-        <w:ind w:left="5040" w:hanging="360"/>
-      </w:pPr>
-      <w:rPr>
-        <w:rFonts w:ascii="Wingdings" w:hAnsi="Wingdings" w:hint="default"/>
-      </w:rPr>
-    </w:lvl>
-    <w:lvl w:ilvl="3" w:tplc="08090001" w:tentative="1">
-      <w:start w:val="1"/>
-      <w:numFmt w:val="bullet"/>
-      <w:lvlText w:val=""/>
-      <w:lvlJc w:val="left"/>
-      <w:pPr>
-        <w:ind w:left="5760" w:hanging="360"/>
-      </w:pPr>
-      <w:rPr>
-        <w:rFonts w:ascii="Symbol" w:hAnsi="Symbol" w:hint="default"/>
-      </w:rPr>
-    </w:lvl>
-    <w:lvl w:ilvl="4" w:tplc="08090003" w:tentative="1">
-      <w:start w:val="1"/>
-      <w:numFmt w:val="bullet"/>
-      <w:lvlText w:val="o"/>
-      <w:lvlJc w:val="left"/>
-      <w:pPr>
-        <w:ind w:left="6480" w:hanging="360"/>
-      </w:pPr>
-      <w:rPr>
-        <w:rFonts w:ascii="Courier New" w:hAnsi="Courier New" w:cs="Courier New" w:hint="default"/>
-      </w:rPr>
-    </w:lvl>
-    <w:lvl w:ilvl="5" w:tplc="08090005" w:tentative="1">
-      <w:start w:val="1"/>
-      <w:numFmt w:val="bullet"/>
-      <w:lvlText w:val=""/>
-      <w:lvlJc w:val="left"/>
-      <w:pPr>
-        <w:ind w:left="7200" w:hanging="360"/>
-      </w:pPr>
-      <w:rPr>
-        <w:rFonts w:ascii="Wingdings" w:hAnsi="Wingdings" w:hint="default"/>
-      </w:rPr>
-    </w:lvl>
-    <w:lvl w:ilvl="6" w:tplc="08090001" w:tentative="1">
-      <w:start w:val="1"/>
-      <w:numFmt w:val="bullet"/>
-      <w:lvlText w:val=""/>
-      <w:lvlJc w:val="left"/>
-      <w:pPr>
-        <w:ind w:left="7920" w:hanging="360"/>
-      </w:pPr>
-      <w:rPr>
-        <w:rFonts w:ascii="Symbol" w:hAnsi="Symbol" w:hint="default"/>
-      </w:rPr>
-    </w:lvl>
-    <w:lvl w:ilvl="7" w:tplc="08090003" w:tentative="1">
-      <w:start w:val="1"/>
-      <w:numFmt w:val="bullet"/>
-      <w:lvlText w:val="o"/>
-      <w:lvlJc w:val="left"/>
-      <w:pPr>
-        <w:ind w:left="8640" w:hanging="360"/>
-      </w:pPr>
-      <w:rPr>
-        <w:rFonts w:ascii="Courier New" w:hAnsi="Courier New" w:cs="Courier New" w:hint="default"/>
-      </w:rPr>
-    </w:lvl>
-    <w:lvl w:ilvl="8" w:tplc="08090005" w:tentative="1">
-      <w:start w:val="1"/>
-      <w:numFmt w:val="bullet"/>
-      <w:lvlText w:val=""/>
-      <w:lvlJc w:val="left"/>
-      <w:pPr>
-        <w:ind w:left="9360" w:hanging="360"/>
-      </w:pPr>
-      <w:rPr>
-        <w:rFonts w:ascii="Wingdings" w:hAnsi="Wingdings" w:hint="default"/>
-      </w:rPr>
-    </w:lvl>
-  </w:abstractNum>
-  <w:abstractNum w:abstractNumId="38" w15:restartNumberingAfterBreak="0">
-    <w:nsid w:val="57E533DF"/>
-    <w:multiLevelType w:val="multilevel"/>
-    <w:tmpl w:val="4366FB26"/>
-    <w:lvl w:ilvl="0">
-      <w:start w:val="1"/>
-      <w:numFmt w:val="decimal"/>
-      <w:lvlText w:val="%1."/>
-      <w:lvlJc w:val="left"/>
-      <w:pPr>
-        <w:ind w:left="360" w:hanging="360"/>
-      </w:pPr>
-      <w:rPr>
-        <w:rFonts w:hint="default"/>
-      </w:rPr>
-    </w:lvl>
-    <w:lvl w:ilvl="1">
-      <w:start w:val="1"/>
-      <w:numFmt w:val="decimal"/>
-      <w:suff w:val="space"/>
-      <w:lvlText w:val="%1.%2."/>
-      <w:lvlJc w:val="left"/>
-      <w:pPr>
-        <w:ind w:left="720" w:hanging="360"/>
-      </w:pPr>
-      <w:rPr>
-        <w:rFonts w:hint="default"/>
-      </w:rPr>
-    </w:lvl>
-    <w:lvl w:ilvl="2">
-      <w:start w:val="1"/>
-      <w:numFmt w:val="lowerRoman"/>
-      <w:lvlText w:val="%3)"/>
-      <w:lvlJc w:val="left"/>
-      <w:pPr>
-        <w:ind w:left="1080" w:hanging="360"/>
-      </w:pPr>
-      <w:rPr>
-        <w:rFonts w:hint="default"/>
-      </w:rPr>
-    </w:lvl>
-    <w:lvl w:ilvl="3">
-      <w:start w:val="1"/>
-      <w:numFmt w:val="decimal"/>
-      <w:lvlText w:val="(%4)"/>
-      <w:lvlJc w:val="left"/>
-      <w:pPr>
-        <w:ind w:left="1440" w:hanging="360"/>
-      </w:pPr>
-      <w:rPr>
-        <w:rFonts w:hint="default"/>
-      </w:rPr>
-    </w:lvl>
-    <w:lvl w:ilvl="4">
-      <w:start w:val="1"/>
-      <w:numFmt w:val="lowerLetter"/>
-      <w:lvlText w:val="(%5)"/>
-      <w:lvlJc w:val="left"/>
-      <w:pPr>
-        <w:ind w:left="1800" w:hanging="360"/>
-      </w:pPr>
-      <w:rPr>
-        <w:rFonts w:hint="default"/>
-      </w:rPr>
-    </w:lvl>
-    <w:lvl w:ilvl="5">
-      <w:start w:val="1"/>
-      <w:numFmt w:val="lowerRoman"/>
-      <w:lvlText w:val="(%6)"/>
-      <w:lvlJc w:val="left"/>
-      <w:pPr>
-        <w:ind w:left="2160" w:hanging="360"/>
-      </w:pPr>
-      <w:rPr>
-        <w:rFonts w:hint="default"/>
-      </w:rPr>
-    </w:lvl>
-    <w:lvl w:ilvl="6">
-      <w:start w:val="1"/>
-      <w:numFmt w:val="decimal"/>
-      <w:lvlText w:val="%7."/>
-      <w:lvlJc w:val="left"/>
-      <w:pPr>
-        <w:ind w:left="2520" w:hanging="360"/>
-      </w:pPr>
-      <w:rPr>
-        <w:rFonts w:hint="default"/>
-      </w:rPr>
-    </w:lvl>
-    <w:lvl w:ilvl="7">
-      <w:start w:val="1"/>
-      <w:numFmt w:val="lowerLetter"/>
-      <w:lvlText w:val="%8."/>
-      <w:lvlJc w:val="left"/>
-      <w:pPr>
-        <w:ind w:left="2880" w:hanging="360"/>
-      </w:pPr>
-      <w:rPr>
-        <w:rFonts w:hint="default"/>
-      </w:rPr>
-    </w:lvl>
-    <w:lvl w:ilvl="8">
-      <w:start w:val="1"/>
-      <w:numFmt w:val="lowerRoman"/>
-      <w:lvlText w:val="%9."/>
-      <w:lvlJc w:val="left"/>
-      <w:pPr>
-        <w:ind w:left="3240" w:hanging="360"/>
-      </w:pPr>
-      <w:rPr>
-        <w:rFonts w:hint="default"/>
-      </w:rPr>
-    </w:lvl>
-  </w:abstractNum>
-  <w:abstractNum w:abstractNumId="39" w15:restartNumberingAfterBreak="0">
-    <w:nsid w:val="5ADB4617"/>
-    <w:multiLevelType w:val="hybridMultilevel"/>
-    <w:tmpl w:val="33826F5A"/>
-    <w:lvl w:ilvl="0" w:tplc="C7B878B0">
-      <w:start w:val="3"/>
-      <w:numFmt w:val="decimal"/>
-      <w:lvlText w:val="%1."/>
-      <w:lvlJc w:val="left"/>
-      <w:pPr>
-        <w:ind w:left="1514" w:hanging="360"/>
-      </w:pPr>
-      <w:rPr>
-        <w:rFonts w:hint="default"/>
-      </w:rPr>
-    </w:lvl>
-    <w:lvl w:ilvl="1" w:tplc="08090019" w:tentative="1">
-      <w:start w:val="1"/>
-      <w:numFmt w:val="lowerLetter"/>
-      <w:lvlText w:val="%2."/>
-      <w:lvlJc w:val="left"/>
-      <w:pPr>
-        <w:ind w:left="1440" w:hanging="360"/>
-      </w:pPr>
-    </w:lvl>
-    <w:lvl w:ilvl="2" w:tplc="0809001B" w:tentative="1">
-      <w:start w:val="1"/>
-      <w:numFmt w:val="lowerRoman"/>
-      <w:lvlText w:val="%3."/>
-      <w:lvlJc w:val="right"/>
-      <w:pPr>
-        <w:ind w:left="2160" w:hanging="180"/>
-      </w:pPr>
-    </w:lvl>
-    <w:lvl w:ilvl="3" w:tplc="0809000F" w:tentative="1">
-      <w:start w:val="1"/>
-      <w:numFmt w:val="decimal"/>
-      <w:lvlText w:val="%4."/>
-      <w:lvlJc w:val="left"/>
-      <w:pPr>
-        <w:ind w:left="2880" w:hanging="360"/>
-      </w:pPr>
-    </w:lvl>
-    <w:lvl w:ilvl="4" w:tplc="08090019" w:tentative="1">
-      <w:start w:val="1"/>
-      <w:numFmt w:val="lowerLetter"/>
-      <w:lvlText w:val="%5."/>
-      <w:lvlJc w:val="left"/>
-      <w:pPr>
-        <w:ind w:left="3600" w:hanging="360"/>
-      </w:pPr>
-    </w:lvl>
-    <w:lvl w:ilvl="5" w:tplc="0809001B" w:tentative="1">
-      <w:start w:val="1"/>
-      <w:numFmt w:val="lowerRoman"/>
-      <w:lvlText w:val="%6."/>
-      <w:lvlJc w:val="right"/>
-      <w:pPr>
-        <w:ind w:left="4320" w:hanging="180"/>
-      </w:pPr>
-    </w:lvl>
-    <w:lvl w:ilvl="6" w:tplc="0809000F" w:tentative="1">
-      <w:start w:val="1"/>
-      <w:numFmt w:val="decimal"/>
-      <w:lvlText w:val="%7."/>
-      <w:lvlJc w:val="left"/>
-      <w:pPr>
-        <w:ind w:left="5040" w:hanging="360"/>
-      </w:pPr>
-    </w:lvl>
-    <w:lvl w:ilvl="7" w:tplc="08090019" w:tentative="1">
-      <w:start w:val="1"/>
-      <w:numFmt w:val="lowerLetter"/>
-      <w:lvlText w:val="%8."/>
-      <w:lvlJc w:val="left"/>
-      <w:pPr>
-        <w:ind w:left="5760" w:hanging="360"/>
-      </w:pPr>
-    </w:lvl>
-    <w:lvl w:ilvl="8" w:tplc="0809001B" w:tentative="1">
-      <w:start w:val="1"/>
-      <w:numFmt w:val="lowerRoman"/>
-      <w:lvlText w:val="%9."/>
-      <w:lvlJc w:val="right"/>
-      <w:pPr>
-        <w:ind w:left="6480" w:hanging="180"/>
-      </w:pPr>
-    </w:lvl>
-  </w:abstractNum>
-  <w:abstractNum w:abstractNumId="40" w15:restartNumberingAfterBreak="0">
-    <w:nsid w:val="5C545D31"/>
-    <w:multiLevelType w:val="hybridMultilevel"/>
-    <w:tmpl w:val="882448D8"/>
-    <w:lvl w:ilvl="0" w:tplc="FFFFFFFF">
-      <w:start w:val="1"/>
-      <w:numFmt w:val="decimal"/>
-      <w:lvlText w:val="%1."/>
-      <w:lvlJc w:val="left"/>
-      <w:pPr>
-        <w:ind w:left="1514" w:hanging="360"/>
-      </w:pPr>
-    </w:lvl>
-    <w:lvl w:ilvl="1" w:tplc="FFFFFFFF" w:tentative="1">
-      <w:start w:val="1"/>
-      <w:numFmt w:val="lowerLetter"/>
-      <w:lvlText w:val="%2."/>
-      <w:lvlJc w:val="left"/>
-      <w:pPr>
-        <w:ind w:left="2234" w:hanging="360"/>
-      </w:pPr>
-    </w:lvl>
-    <w:lvl w:ilvl="2" w:tplc="FFFFFFFF" w:tentative="1">
-      <w:start w:val="1"/>
-      <w:numFmt w:val="lowerRoman"/>
-      <w:lvlText w:val="%3."/>
-      <w:lvlJc w:val="right"/>
-      <w:pPr>
-        <w:ind w:left="2954" w:hanging="180"/>
-      </w:pPr>
-    </w:lvl>
-    <w:lvl w:ilvl="3" w:tplc="FFFFFFFF" w:tentative="1">
-      <w:start w:val="1"/>
-      <w:numFmt w:val="decimal"/>
-      <w:lvlText w:val="%4."/>
-      <w:lvlJc w:val="left"/>
-      <w:pPr>
-        <w:ind w:left="3674" w:hanging="360"/>
-      </w:pPr>
-    </w:lvl>
-    <w:lvl w:ilvl="4" w:tplc="FFFFFFFF" w:tentative="1">
-      <w:start w:val="1"/>
-      <w:numFmt w:val="lowerLetter"/>
-      <w:lvlText w:val="%5."/>
-      <w:lvlJc w:val="left"/>
-      <w:pPr>
-        <w:ind w:left="4394" w:hanging="360"/>
-      </w:pPr>
-    </w:lvl>
-    <w:lvl w:ilvl="5" w:tplc="FFFFFFFF" w:tentative="1">
-      <w:start w:val="1"/>
-      <w:numFmt w:val="lowerRoman"/>
-      <w:lvlText w:val="%6."/>
-      <w:lvlJc w:val="right"/>
-      <w:pPr>
-        <w:ind w:left="5114" w:hanging="180"/>
-      </w:pPr>
-    </w:lvl>
-    <w:lvl w:ilvl="6" w:tplc="FFFFFFFF" w:tentative="1">
-      <w:start w:val="1"/>
-      <w:numFmt w:val="decimal"/>
-      <w:lvlText w:val="%7."/>
-      <w:lvlJc w:val="left"/>
-      <w:pPr>
-        <w:ind w:left="5834" w:hanging="360"/>
-      </w:pPr>
-    </w:lvl>
-    <w:lvl w:ilvl="7" w:tplc="FFFFFFFF" w:tentative="1">
-      <w:start w:val="1"/>
-      <w:numFmt w:val="lowerLetter"/>
-      <w:lvlText w:val="%8."/>
-      <w:lvlJc w:val="left"/>
-      <w:pPr>
-        <w:ind w:left="6554" w:hanging="360"/>
-      </w:pPr>
-    </w:lvl>
-    <w:lvl w:ilvl="8" w:tplc="FFFFFFFF" w:tentative="1">
-      <w:start w:val="1"/>
-      <w:numFmt w:val="lowerRoman"/>
-      <w:lvlText w:val="%9."/>
-      <w:lvlJc w:val="right"/>
-      <w:pPr>
-        <w:ind w:left="7274" w:hanging="180"/>
-      </w:pPr>
-    </w:lvl>
-  </w:abstractNum>
-  <w:abstractNum w:abstractNumId="41" w15:restartNumberingAfterBreak="0">
-    <w:nsid w:val="60514D57"/>
-    <w:multiLevelType w:val="hybridMultilevel"/>
-    <w:tmpl w:val="845E6CA2"/>
-    <w:lvl w:ilvl="0" w:tplc="5A248908">
-      <w:start w:val="5"/>
-      <w:numFmt w:val="decimal"/>
-      <w:lvlText w:val="%1."/>
-      <w:lvlJc w:val="left"/>
-      <w:pPr>
-        <w:ind w:left="1514" w:hanging="360"/>
-      </w:pPr>
-      <w:rPr>
-        <w:rFonts w:hint="default"/>
-      </w:rPr>
-    </w:lvl>
-    <w:lvl w:ilvl="1" w:tplc="08090019" w:tentative="1">
-      <w:start w:val="1"/>
-      <w:numFmt w:val="lowerLetter"/>
-      <w:lvlText w:val="%2."/>
-      <w:lvlJc w:val="left"/>
-      <w:pPr>
-        <w:ind w:left="1440" w:hanging="360"/>
-      </w:pPr>
-    </w:lvl>
-    <w:lvl w:ilvl="2" w:tplc="0809001B" w:tentative="1">
-      <w:start w:val="1"/>
-      <w:numFmt w:val="lowerRoman"/>
-      <w:lvlText w:val="%3."/>
-      <w:lvlJc w:val="right"/>
-      <w:pPr>
-        <w:ind w:left="2160" w:hanging="180"/>
-      </w:pPr>
-    </w:lvl>
-    <w:lvl w:ilvl="3" w:tplc="0809000F" w:tentative="1">
-      <w:start w:val="1"/>
-      <w:numFmt w:val="decimal"/>
-      <w:lvlText w:val="%4."/>
-      <w:lvlJc w:val="left"/>
-      <w:pPr>
-        <w:ind w:left="2880" w:hanging="360"/>
-      </w:pPr>
-    </w:lvl>
-    <w:lvl w:ilvl="4" w:tplc="08090019" w:tentative="1">
-      <w:start w:val="1"/>
-      <w:numFmt w:val="lowerLetter"/>
-      <w:lvlText w:val="%5."/>
-      <w:lvlJc w:val="left"/>
-      <w:pPr>
-        <w:ind w:left="3600" w:hanging="360"/>
-      </w:pPr>
-    </w:lvl>
-    <w:lvl w:ilvl="5" w:tplc="0809001B" w:tentative="1">
-      <w:start w:val="1"/>
-      <w:numFmt w:val="lowerRoman"/>
-      <w:lvlText w:val="%6."/>
-      <w:lvlJc w:val="right"/>
-      <w:pPr>
-        <w:ind w:left="4320" w:hanging="180"/>
-      </w:pPr>
-    </w:lvl>
-    <w:lvl w:ilvl="6" w:tplc="0809000F" w:tentative="1">
-      <w:start w:val="1"/>
-      <w:numFmt w:val="decimal"/>
-      <w:lvlText w:val="%7."/>
-      <w:lvlJc w:val="left"/>
-      <w:pPr>
-        <w:ind w:left="5040" w:hanging="360"/>
-      </w:pPr>
-    </w:lvl>
-    <w:lvl w:ilvl="7" w:tplc="08090019" w:tentative="1">
-      <w:start w:val="1"/>
-      <w:numFmt w:val="lowerLetter"/>
-      <w:lvlText w:val="%8."/>
-      <w:lvlJc w:val="left"/>
-      <w:pPr>
-        <w:ind w:left="5760" w:hanging="360"/>
-      </w:pPr>
-    </w:lvl>
-    <w:lvl w:ilvl="8" w:tplc="0809001B" w:tentative="1">
-      <w:start w:val="1"/>
-      <w:numFmt w:val="lowerRoman"/>
-      <w:lvlText w:val="%9."/>
-      <w:lvlJc w:val="right"/>
-      <w:pPr>
-        <w:ind w:left="6480" w:hanging="180"/>
-      </w:pPr>
-    </w:lvl>
-  </w:abstractNum>
-  <w:abstractNum w:abstractNumId="42" w15:restartNumberingAfterBreak="0">
-    <w:nsid w:val="647D6B1A"/>
-    <w:multiLevelType w:val="hybridMultilevel"/>
-    <w:tmpl w:val="19006376"/>
-    <w:lvl w:ilvl="0" w:tplc="1212BB72">
-      <w:start w:val="3"/>
-      <w:numFmt w:val="decimal"/>
-      <w:lvlText w:val="%1."/>
-      <w:lvlJc w:val="left"/>
-      <w:pPr>
-        <w:ind w:left="1514" w:hanging="360"/>
-      </w:pPr>
-      <w:rPr>
-        <w:rFonts w:hint="default"/>
-      </w:rPr>
-    </w:lvl>
-    <w:lvl w:ilvl="1" w:tplc="08090019" w:tentative="1">
-      <w:start w:val="1"/>
-      <w:numFmt w:val="lowerLetter"/>
-      <w:lvlText w:val="%2."/>
-      <w:lvlJc w:val="left"/>
-      <w:pPr>
-        <w:ind w:left="1440" w:hanging="360"/>
-      </w:pPr>
-    </w:lvl>
-    <w:lvl w:ilvl="2" w:tplc="0809001B" w:tentative="1">
-      <w:start w:val="1"/>
-      <w:numFmt w:val="lowerRoman"/>
-      <w:lvlText w:val="%3."/>
-      <w:lvlJc w:val="right"/>
-      <w:pPr>
-        <w:ind w:left="2160" w:hanging="180"/>
-      </w:pPr>
-    </w:lvl>
-    <w:lvl w:ilvl="3" w:tplc="0809000F" w:tentative="1">
-      <w:start w:val="1"/>
-      <w:numFmt w:val="decimal"/>
-      <w:lvlText w:val="%4."/>
-      <w:lvlJc w:val="left"/>
-      <w:pPr>
-        <w:ind w:left="2880" w:hanging="360"/>
-      </w:pPr>
-    </w:lvl>
-    <w:lvl w:ilvl="4" w:tplc="08090019" w:tentative="1">
-      <w:start w:val="1"/>
-      <w:numFmt w:val="lowerLetter"/>
-      <w:lvlText w:val="%5."/>
-      <w:lvlJc w:val="left"/>
-      <w:pPr>
-        <w:ind w:left="3600" w:hanging="360"/>
-      </w:pPr>
-    </w:lvl>
-    <w:lvl w:ilvl="5" w:tplc="0809001B" w:tentative="1">
-      <w:start w:val="1"/>
-      <w:numFmt w:val="lowerRoman"/>
-      <w:lvlText w:val="%6."/>
-      <w:lvlJc w:val="right"/>
-      <w:pPr>
-        <w:ind w:left="4320" w:hanging="180"/>
-      </w:pPr>
-    </w:lvl>
-    <w:lvl w:ilvl="6" w:tplc="0809000F" w:tentative="1">
-      <w:start w:val="1"/>
-      <w:numFmt w:val="decimal"/>
-      <w:lvlText w:val="%7."/>
-      <w:lvlJc w:val="left"/>
-      <w:pPr>
-        <w:ind w:left="5040" w:hanging="360"/>
-      </w:pPr>
-    </w:lvl>
-    <w:lvl w:ilvl="7" w:tplc="08090019" w:tentative="1">
-      <w:start w:val="1"/>
-      <w:numFmt w:val="lowerLetter"/>
-      <w:lvlText w:val="%8."/>
-      <w:lvlJc w:val="left"/>
-      <w:pPr>
-        <w:ind w:left="5760" w:hanging="360"/>
-      </w:pPr>
-    </w:lvl>
-    <w:lvl w:ilvl="8" w:tplc="0809001B" w:tentative="1">
-      <w:start w:val="1"/>
-      <w:numFmt w:val="lowerRoman"/>
-      <w:lvlText w:val="%9."/>
-      <w:lvlJc w:val="right"/>
-      <w:pPr>
-        <w:ind w:left="6480" w:hanging="180"/>
-      </w:pPr>
-    </w:lvl>
-  </w:abstractNum>
-  <w:abstractNum w:abstractNumId="43" w15:restartNumberingAfterBreak="0">
+  <w:abstractNum w:abstractNumId="5" w15:restartNumberingAfterBreak="0">
     <w:nsid w:val="66A769B5"/>
     <w:multiLevelType w:val="hybridMultilevel"/>
     <w:tmpl w:val="4860181A"/>
@@ -7799,7 +4087,7 @@
       </w:pPr>
     </w:lvl>
   </w:abstractNum>
-  <w:abstractNum w:abstractNumId="44" w15:restartNumberingAfterBreak="0">
+  <w:abstractNum w:abstractNumId="6" w15:restartNumberingAfterBreak="0">
     <w:nsid w:val="69261747"/>
     <w:multiLevelType w:val="hybridMultilevel"/>
     <w:tmpl w:val="5FB4FC54"/>
@@ -7885,7 +4173,7 @@
       </w:pPr>
     </w:lvl>
   </w:abstractNum>
-  <w:abstractNum w:abstractNumId="45" w15:restartNumberingAfterBreak="0">
+  <w:abstractNum w:abstractNumId="7" w15:restartNumberingAfterBreak="0">
     <w:nsid w:val="6F65495A"/>
     <w:multiLevelType w:val="multilevel"/>
     <w:tmpl w:val="A44A597A"/>
@@ -7998,370 +4286,32 @@
       </w:rPr>
     </w:lvl>
   </w:abstractNum>
-  <w:abstractNum w:abstractNumId="46" w15:restartNumberingAfterBreak="0">
-    <w:nsid w:val="6FDD4D2A"/>
-    <w:multiLevelType w:val="hybridMultilevel"/>
-    <w:tmpl w:val="38DEE7DC"/>
-    <w:lvl w:ilvl="0" w:tplc="FFFFFFFF">
-      <w:start w:val="1"/>
-      <w:numFmt w:val="decimal"/>
-      <w:lvlText w:val="%1."/>
-      <w:lvlJc w:val="left"/>
-      <w:pPr>
-        <w:ind w:left="1514" w:hanging="360"/>
-      </w:pPr>
-    </w:lvl>
-    <w:lvl w:ilvl="1" w:tplc="FFFFFFFF" w:tentative="1">
-      <w:start w:val="1"/>
-      <w:numFmt w:val="lowerLetter"/>
-      <w:lvlText w:val="%2."/>
-      <w:lvlJc w:val="left"/>
-      <w:pPr>
-        <w:ind w:left="2234" w:hanging="360"/>
-      </w:pPr>
-    </w:lvl>
-    <w:lvl w:ilvl="2" w:tplc="FFFFFFFF" w:tentative="1">
-      <w:start w:val="1"/>
-      <w:numFmt w:val="lowerRoman"/>
-      <w:lvlText w:val="%3."/>
-      <w:lvlJc w:val="right"/>
-      <w:pPr>
-        <w:ind w:left="2954" w:hanging="180"/>
-      </w:pPr>
-    </w:lvl>
-    <w:lvl w:ilvl="3" w:tplc="FFFFFFFF" w:tentative="1">
-      <w:start w:val="1"/>
-      <w:numFmt w:val="decimal"/>
-      <w:lvlText w:val="%4."/>
-      <w:lvlJc w:val="left"/>
-      <w:pPr>
-        <w:ind w:left="3674" w:hanging="360"/>
-      </w:pPr>
-    </w:lvl>
-    <w:lvl w:ilvl="4" w:tplc="FFFFFFFF" w:tentative="1">
-      <w:start w:val="1"/>
-      <w:numFmt w:val="lowerLetter"/>
-      <w:lvlText w:val="%5."/>
-      <w:lvlJc w:val="left"/>
-      <w:pPr>
-        <w:ind w:left="4394" w:hanging="360"/>
-      </w:pPr>
-    </w:lvl>
-    <w:lvl w:ilvl="5" w:tplc="FFFFFFFF" w:tentative="1">
-      <w:start w:val="1"/>
-      <w:numFmt w:val="lowerRoman"/>
-      <w:lvlText w:val="%6."/>
-      <w:lvlJc w:val="right"/>
-      <w:pPr>
-        <w:ind w:left="5114" w:hanging="180"/>
-      </w:pPr>
-    </w:lvl>
-    <w:lvl w:ilvl="6" w:tplc="FFFFFFFF" w:tentative="1">
-      <w:start w:val="1"/>
-      <w:numFmt w:val="decimal"/>
-      <w:lvlText w:val="%7."/>
-      <w:lvlJc w:val="left"/>
-      <w:pPr>
-        <w:ind w:left="5834" w:hanging="360"/>
-      </w:pPr>
-    </w:lvl>
-    <w:lvl w:ilvl="7" w:tplc="FFFFFFFF" w:tentative="1">
-      <w:start w:val="1"/>
-      <w:numFmt w:val="lowerLetter"/>
-      <w:lvlText w:val="%8."/>
-      <w:lvlJc w:val="left"/>
-      <w:pPr>
-        <w:ind w:left="6554" w:hanging="360"/>
-      </w:pPr>
-    </w:lvl>
-    <w:lvl w:ilvl="8" w:tplc="FFFFFFFF" w:tentative="1">
-      <w:start w:val="1"/>
-      <w:numFmt w:val="lowerRoman"/>
-      <w:lvlText w:val="%9."/>
-      <w:lvlJc w:val="right"/>
-      <w:pPr>
-        <w:ind w:left="7274" w:hanging="180"/>
-      </w:pPr>
-    </w:lvl>
-  </w:abstractNum>
-  <w:abstractNum w:abstractNumId="47" w15:restartNumberingAfterBreak="0">
-    <w:nsid w:val="7081660F"/>
-    <w:multiLevelType w:val="hybridMultilevel"/>
-    <w:tmpl w:val="223802B6"/>
-    <w:lvl w:ilvl="0" w:tplc="56C2C9B0">
-      <w:start w:val="5"/>
-      <w:numFmt w:val="decimal"/>
-      <w:lvlText w:val="%1."/>
-      <w:lvlJc w:val="left"/>
-      <w:pPr>
-        <w:ind w:left="1514" w:hanging="360"/>
-      </w:pPr>
-      <w:rPr>
-        <w:rFonts w:hint="default"/>
-      </w:rPr>
-    </w:lvl>
-    <w:lvl w:ilvl="1" w:tplc="08090019" w:tentative="1">
-      <w:start w:val="1"/>
-      <w:numFmt w:val="lowerLetter"/>
-      <w:lvlText w:val="%2."/>
-      <w:lvlJc w:val="left"/>
-      <w:pPr>
-        <w:ind w:left="1440" w:hanging="360"/>
-      </w:pPr>
-    </w:lvl>
-    <w:lvl w:ilvl="2" w:tplc="0809001B" w:tentative="1">
-      <w:start w:val="1"/>
-      <w:numFmt w:val="lowerRoman"/>
-      <w:lvlText w:val="%3."/>
-      <w:lvlJc w:val="right"/>
-      <w:pPr>
-        <w:ind w:left="2160" w:hanging="180"/>
-      </w:pPr>
-    </w:lvl>
-    <w:lvl w:ilvl="3" w:tplc="0809000F" w:tentative="1">
-      <w:start w:val="1"/>
-      <w:numFmt w:val="decimal"/>
-      <w:lvlText w:val="%4."/>
-      <w:lvlJc w:val="left"/>
-      <w:pPr>
-        <w:ind w:left="2880" w:hanging="360"/>
-      </w:pPr>
-    </w:lvl>
-    <w:lvl w:ilvl="4" w:tplc="08090019" w:tentative="1">
-      <w:start w:val="1"/>
-      <w:numFmt w:val="lowerLetter"/>
-      <w:lvlText w:val="%5."/>
-      <w:lvlJc w:val="left"/>
-      <w:pPr>
-        <w:ind w:left="3600" w:hanging="360"/>
-      </w:pPr>
-    </w:lvl>
-    <w:lvl w:ilvl="5" w:tplc="0809001B" w:tentative="1">
-      <w:start w:val="1"/>
-      <w:numFmt w:val="lowerRoman"/>
-      <w:lvlText w:val="%6."/>
-      <w:lvlJc w:val="right"/>
-      <w:pPr>
-        <w:ind w:left="4320" w:hanging="180"/>
-      </w:pPr>
-    </w:lvl>
-    <w:lvl w:ilvl="6" w:tplc="0809000F" w:tentative="1">
-      <w:start w:val="1"/>
-      <w:numFmt w:val="decimal"/>
-      <w:lvlText w:val="%7."/>
-      <w:lvlJc w:val="left"/>
-      <w:pPr>
-        <w:ind w:left="5040" w:hanging="360"/>
-      </w:pPr>
-    </w:lvl>
-    <w:lvl w:ilvl="7" w:tplc="08090019" w:tentative="1">
-      <w:start w:val="1"/>
-      <w:numFmt w:val="lowerLetter"/>
-      <w:lvlText w:val="%8."/>
-      <w:lvlJc w:val="left"/>
-      <w:pPr>
-        <w:ind w:left="5760" w:hanging="360"/>
-      </w:pPr>
-    </w:lvl>
-    <w:lvl w:ilvl="8" w:tplc="0809001B" w:tentative="1">
-      <w:start w:val="1"/>
-      <w:numFmt w:val="lowerRoman"/>
-      <w:lvlText w:val="%9."/>
-      <w:lvlJc w:val="right"/>
-      <w:pPr>
-        <w:ind w:left="6480" w:hanging="180"/>
-      </w:pPr>
-    </w:lvl>
-  </w:abstractNum>
-  <w:abstractNum w:abstractNumId="48" w15:restartNumberingAfterBreak="0">
-    <w:nsid w:val="717B4DF9"/>
-    <w:multiLevelType w:val="hybridMultilevel"/>
-    <w:tmpl w:val="2C345000"/>
-    <w:lvl w:ilvl="0" w:tplc="0809000F">
-      <w:start w:val="1"/>
-      <w:numFmt w:val="decimal"/>
-      <w:lvlText w:val="%1."/>
-      <w:lvlJc w:val="left"/>
-      <w:pPr>
-        <w:ind w:left="1514" w:hanging="360"/>
-      </w:pPr>
-    </w:lvl>
-    <w:lvl w:ilvl="1" w:tplc="08090019" w:tentative="1">
-      <w:start w:val="1"/>
-      <w:numFmt w:val="lowerLetter"/>
-      <w:lvlText w:val="%2."/>
-      <w:lvlJc w:val="left"/>
-      <w:pPr>
-        <w:ind w:left="2234" w:hanging="360"/>
-      </w:pPr>
-    </w:lvl>
-    <w:lvl w:ilvl="2" w:tplc="0809001B" w:tentative="1">
-      <w:start w:val="1"/>
-      <w:numFmt w:val="lowerRoman"/>
-      <w:lvlText w:val="%3."/>
-      <w:lvlJc w:val="right"/>
-      <w:pPr>
-        <w:ind w:left="2954" w:hanging="180"/>
-      </w:pPr>
-    </w:lvl>
-    <w:lvl w:ilvl="3" w:tplc="0809000F" w:tentative="1">
-      <w:start w:val="1"/>
-      <w:numFmt w:val="decimal"/>
-      <w:lvlText w:val="%4."/>
-      <w:lvlJc w:val="left"/>
-      <w:pPr>
-        <w:ind w:left="3674" w:hanging="360"/>
-      </w:pPr>
-    </w:lvl>
-    <w:lvl w:ilvl="4" w:tplc="08090019" w:tentative="1">
-      <w:start w:val="1"/>
-      <w:numFmt w:val="lowerLetter"/>
-      <w:lvlText w:val="%5."/>
-      <w:lvlJc w:val="left"/>
-      <w:pPr>
-        <w:ind w:left="4394" w:hanging="360"/>
-      </w:pPr>
-    </w:lvl>
-    <w:lvl w:ilvl="5" w:tplc="0809001B" w:tentative="1">
-      <w:start w:val="1"/>
-      <w:numFmt w:val="lowerRoman"/>
-      <w:lvlText w:val="%6."/>
-      <w:lvlJc w:val="right"/>
-      <w:pPr>
-        <w:ind w:left="5114" w:hanging="180"/>
-      </w:pPr>
-    </w:lvl>
-    <w:lvl w:ilvl="6" w:tplc="0809000F" w:tentative="1">
-      <w:start w:val="1"/>
-      <w:numFmt w:val="decimal"/>
-      <w:lvlText w:val="%7."/>
-      <w:lvlJc w:val="left"/>
-      <w:pPr>
-        <w:ind w:left="5834" w:hanging="360"/>
-      </w:pPr>
-    </w:lvl>
-    <w:lvl w:ilvl="7" w:tplc="08090019" w:tentative="1">
-      <w:start w:val="1"/>
-      <w:numFmt w:val="lowerLetter"/>
-      <w:lvlText w:val="%8."/>
-      <w:lvlJc w:val="left"/>
-      <w:pPr>
-        <w:ind w:left="6554" w:hanging="360"/>
-      </w:pPr>
-    </w:lvl>
-    <w:lvl w:ilvl="8" w:tplc="0809001B" w:tentative="1">
-      <w:start w:val="1"/>
-      <w:numFmt w:val="lowerRoman"/>
-      <w:lvlText w:val="%9."/>
-      <w:lvlJc w:val="right"/>
-      <w:pPr>
-        <w:ind w:left="7274" w:hanging="180"/>
-      </w:pPr>
-    </w:lvl>
-  </w:abstractNum>
-  <w:abstractNum w:abstractNumId="49" w15:restartNumberingAfterBreak="0">
-    <w:nsid w:val="7895447E"/>
-    <w:multiLevelType w:val="hybridMultilevel"/>
-    <w:tmpl w:val="5546C820"/>
-    <w:lvl w:ilvl="0" w:tplc="23444526">
-      <w:start w:val="1"/>
-      <w:numFmt w:val="decimal"/>
-      <w:lvlText w:val="%1."/>
-      <w:lvlJc w:val="left"/>
-      <w:pPr>
-        <w:ind w:left="720" w:hanging="360"/>
-      </w:pPr>
-      <w:rPr>
-        <w:rFonts w:eastAsiaTheme="minorHAnsi" w:hint="default"/>
-      </w:rPr>
-    </w:lvl>
-    <w:lvl w:ilvl="1" w:tplc="08090019" w:tentative="1">
-      <w:start w:val="1"/>
-      <w:numFmt w:val="lowerLetter"/>
-      <w:lvlText w:val="%2."/>
-      <w:lvlJc w:val="left"/>
-      <w:pPr>
-        <w:ind w:left="1440" w:hanging="360"/>
-      </w:pPr>
-    </w:lvl>
-    <w:lvl w:ilvl="2" w:tplc="0809001B" w:tentative="1">
-      <w:start w:val="1"/>
-      <w:numFmt w:val="lowerRoman"/>
-      <w:lvlText w:val="%3."/>
-      <w:lvlJc w:val="right"/>
-      <w:pPr>
-        <w:ind w:left="2160" w:hanging="180"/>
-      </w:pPr>
-    </w:lvl>
-    <w:lvl w:ilvl="3" w:tplc="0809000F" w:tentative="1">
-      <w:start w:val="1"/>
-      <w:numFmt w:val="decimal"/>
-      <w:lvlText w:val="%4."/>
-      <w:lvlJc w:val="left"/>
-      <w:pPr>
-        <w:ind w:left="2880" w:hanging="360"/>
-      </w:pPr>
-    </w:lvl>
-    <w:lvl w:ilvl="4" w:tplc="08090019" w:tentative="1">
-      <w:start w:val="1"/>
-      <w:numFmt w:val="lowerLetter"/>
-      <w:lvlText w:val="%5."/>
-      <w:lvlJc w:val="left"/>
-      <w:pPr>
-        <w:ind w:left="3600" w:hanging="360"/>
-      </w:pPr>
-    </w:lvl>
-    <w:lvl w:ilvl="5" w:tplc="0809001B" w:tentative="1">
-      <w:start w:val="1"/>
-      <w:numFmt w:val="lowerRoman"/>
-      <w:lvlText w:val="%6."/>
-      <w:lvlJc w:val="right"/>
-      <w:pPr>
-        <w:ind w:left="4320" w:hanging="180"/>
-      </w:pPr>
-    </w:lvl>
-    <w:lvl w:ilvl="6" w:tplc="0809000F" w:tentative="1">
-      <w:start w:val="1"/>
-      <w:numFmt w:val="decimal"/>
-      <w:lvlText w:val="%7."/>
-      <w:lvlJc w:val="left"/>
-      <w:pPr>
-        <w:ind w:left="5040" w:hanging="360"/>
-      </w:pPr>
-    </w:lvl>
-    <w:lvl w:ilvl="7" w:tplc="08090019" w:tentative="1">
-      <w:start w:val="1"/>
-      <w:numFmt w:val="lowerLetter"/>
-      <w:lvlText w:val="%8."/>
-      <w:lvlJc w:val="left"/>
-      <w:pPr>
-        <w:ind w:left="5760" w:hanging="360"/>
-      </w:pPr>
-    </w:lvl>
-    <w:lvl w:ilvl="8" w:tplc="0809001B" w:tentative="1">
-      <w:start w:val="1"/>
-      <w:numFmt w:val="lowerRoman"/>
-      <w:lvlText w:val="%9."/>
-      <w:lvlJc w:val="right"/>
-      <w:pPr>
-        <w:ind w:left="6480" w:hanging="180"/>
-      </w:pPr>
-    </w:lvl>
-  </w:abstractNum>
-  <w:num w:numId="1" w16cid:durableId="216479329">
-    <w:abstractNumId w:val="15"/>
+  <w:num w:numId="1" w16cid:durableId="1896113144">
+    <w:abstractNumId w:val="7"/>
   </w:num>
-  <w:num w:numId="2" w16cid:durableId="806582284">
-    <w:abstractNumId w:val="27"/>
+  <w:num w:numId="2" w16cid:durableId="55469474">
+    <w:abstractNumId w:val="2"/>
   </w:num>
-  <w:num w:numId="3" w16cid:durableId="1759399916">
-    <w:abstractNumId w:val="35"/>
+  <w:num w:numId="3" w16cid:durableId="1650211878">
+    <w:abstractNumId w:val="4"/>
   </w:num>
-  <w:num w:numId="4" w16cid:durableId="364447141">
-    <w:abstractNumId w:val="31"/>
+  <w:num w:numId="4" w16cid:durableId="745372182">
+    <w:abstractNumId w:val="5"/>
   </w:num>
-  <w:num w:numId="5" w16cid:durableId="212926781">
-    <w:abstractNumId w:val="31"/>
+  <w:num w:numId="5" w16cid:durableId="1042831386">
+    <w:abstractNumId w:val="1"/>
+  </w:num>
+  <w:num w:numId="6" w16cid:durableId="389961947">
+    <w:abstractNumId w:val="0"/>
+  </w:num>
+  <w:num w:numId="7" w16cid:durableId="674502552">
+    <w:abstractNumId w:val="6"/>
+  </w:num>
+  <w:num w:numId="8" w16cid:durableId="24327379">
+    <w:abstractNumId w:val="3"/>
+  </w:num>
+  <w:num w:numId="9" w16cid:durableId="1266228586">
+    <w:abstractNumId w:val="7"/>
     <w:lvlOverride w:ilvl="0">
       <w:startOverride w:val="1"/>
     </w:lvlOverride>
@@ -8390,199 +4340,7 @@
       <w:startOverride w:val="1"/>
     </w:lvlOverride>
   </w:num>
-  <w:num w:numId="6" w16cid:durableId="1250116090">
-    <w:abstractNumId w:val="38"/>
-  </w:num>
-  <w:num w:numId="7" w16cid:durableId="1004631249">
-    <w:abstractNumId w:val="36"/>
-  </w:num>
-  <w:num w:numId="8" w16cid:durableId="990059835">
-    <w:abstractNumId w:val="0"/>
-  </w:num>
-  <w:num w:numId="9" w16cid:durableId="1407608565">
-    <w:abstractNumId w:val="11"/>
-  </w:num>
-  <w:num w:numId="10" w16cid:durableId="1896113144">
-    <w:abstractNumId w:val="45"/>
-  </w:num>
-  <w:num w:numId="11" w16cid:durableId="1946421380">
-    <w:abstractNumId w:val="34"/>
-  </w:num>
-  <w:num w:numId="12" w16cid:durableId="1329016835">
-    <w:abstractNumId w:val="10"/>
-  </w:num>
-  <w:num w:numId="13" w16cid:durableId="1587760967">
-    <w:abstractNumId w:val="30"/>
-  </w:num>
-  <w:num w:numId="14" w16cid:durableId="1704552852">
-    <w:abstractNumId w:val="6"/>
-  </w:num>
-  <w:num w:numId="15" w16cid:durableId="1746997372">
-    <w:abstractNumId w:val="8"/>
-  </w:num>
-  <w:num w:numId="16" w16cid:durableId="598485243">
-    <w:abstractNumId w:val="37"/>
-  </w:num>
-  <w:num w:numId="17" w16cid:durableId="2130581446">
-    <w:abstractNumId w:val="19"/>
-  </w:num>
-  <w:num w:numId="18" w16cid:durableId="923416964">
-    <w:abstractNumId w:val="17"/>
-  </w:num>
-  <w:num w:numId="19" w16cid:durableId="1746301713">
-    <w:abstractNumId w:val="14"/>
-  </w:num>
-  <w:num w:numId="20" w16cid:durableId="898517517">
-    <w:abstractNumId w:val="2"/>
-  </w:num>
-  <w:num w:numId="21" w16cid:durableId="55469474">
-    <w:abstractNumId w:val="22"/>
-  </w:num>
-  <w:num w:numId="22" w16cid:durableId="1650211878">
-    <w:abstractNumId w:val="32"/>
-  </w:num>
-  <w:num w:numId="23" w16cid:durableId="745372182">
-    <w:abstractNumId w:val="43"/>
-  </w:num>
-  <w:num w:numId="24" w16cid:durableId="1042831386">
-    <w:abstractNumId w:val="18"/>
-  </w:num>
-  <w:num w:numId="25" w16cid:durableId="389961947">
-    <w:abstractNumId w:val="5"/>
-  </w:num>
-  <w:num w:numId="26" w16cid:durableId="431049703">
-    <w:abstractNumId w:val="13"/>
-    <w:lvlOverride w:ilvl="0">
-      <w:startOverride w:val="1"/>
-    </w:lvlOverride>
-    <w:lvlOverride w:ilvl="1"/>
-    <w:lvlOverride w:ilvl="2"/>
-    <w:lvlOverride w:ilvl="3"/>
-    <w:lvlOverride w:ilvl="4"/>
-    <w:lvlOverride w:ilvl="5"/>
-    <w:lvlOverride w:ilvl="6"/>
-    <w:lvlOverride w:ilvl="7"/>
-    <w:lvlOverride w:ilvl="8"/>
-  </w:num>
-  <w:num w:numId="27" w16cid:durableId="1997566340">
-    <w:abstractNumId w:val="20"/>
-  </w:num>
-  <w:num w:numId="28" w16cid:durableId="24641818">
-    <w:abstractNumId w:val="47"/>
-  </w:num>
-  <w:num w:numId="29" w16cid:durableId="674502552">
-    <w:abstractNumId w:val="44"/>
-  </w:num>
-  <w:num w:numId="30" w16cid:durableId="24327379">
-    <w:abstractNumId w:val="23"/>
-  </w:num>
-  <w:num w:numId="31" w16cid:durableId="1063479920">
-    <w:abstractNumId w:val="25"/>
-  </w:num>
-  <w:num w:numId="32" w16cid:durableId="1755710988">
-    <w:abstractNumId w:val="9"/>
-  </w:num>
-  <w:num w:numId="33" w16cid:durableId="2036298065">
-    <w:abstractNumId w:val="40"/>
-  </w:num>
-  <w:num w:numId="34" w16cid:durableId="1574387567">
-    <w:abstractNumId w:val="1"/>
-  </w:num>
-  <w:num w:numId="35" w16cid:durableId="1678266263">
-    <w:abstractNumId w:val="33"/>
-  </w:num>
-  <w:num w:numId="36" w16cid:durableId="878320731">
-    <w:abstractNumId w:val="24"/>
-  </w:num>
-  <w:num w:numId="37" w16cid:durableId="377167397">
-    <w:abstractNumId w:val="3"/>
-  </w:num>
-  <w:num w:numId="38" w16cid:durableId="1217543664">
-    <w:abstractNumId w:val="39"/>
-  </w:num>
-  <w:num w:numId="39" w16cid:durableId="1033112769">
-    <w:abstractNumId w:val="29"/>
-  </w:num>
-  <w:num w:numId="40" w16cid:durableId="1277519627">
-    <w:abstractNumId w:val="42"/>
-  </w:num>
-  <w:num w:numId="41" w16cid:durableId="1313756844">
-    <w:abstractNumId w:val="28"/>
-  </w:num>
-  <w:num w:numId="42" w16cid:durableId="917517758">
-    <w:abstractNumId w:val="7"/>
-    <w:lvlOverride w:ilvl="0">
-      <w:startOverride w:val="1"/>
-    </w:lvlOverride>
-    <w:lvlOverride w:ilvl="1"/>
-    <w:lvlOverride w:ilvl="2"/>
-    <w:lvlOverride w:ilvl="3"/>
-    <w:lvlOverride w:ilvl="4"/>
-    <w:lvlOverride w:ilvl="5"/>
-    <w:lvlOverride w:ilvl="6"/>
-    <w:lvlOverride w:ilvl="7"/>
-    <w:lvlOverride w:ilvl="8"/>
-  </w:num>
-  <w:num w:numId="43" w16cid:durableId="360782687">
-    <w:abstractNumId w:val="21"/>
-    <w:lvlOverride w:ilvl="0">
-      <w:startOverride w:val="1"/>
-    </w:lvlOverride>
-  </w:num>
-  <w:num w:numId="44" w16cid:durableId="116460447">
-    <w:abstractNumId w:val="48"/>
-  </w:num>
-  <w:num w:numId="45" w16cid:durableId="621693894">
-    <w:abstractNumId w:val="26"/>
-  </w:num>
-  <w:num w:numId="46" w16cid:durableId="1096826934">
-    <w:abstractNumId w:val="4"/>
-  </w:num>
-  <w:num w:numId="47" w16cid:durableId="1292442524">
-    <w:abstractNumId w:val="41"/>
-  </w:num>
-  <w:num w:numId="48" w16cid:durableId="1993756227">
-    <w:abstractNumId w:val="12"/>
-  </w:num>
-  <w:num w:numId="49" w16cid:durableId="245579638">
-    <w:abstractNumId w:val="46"/>
-  </w:num>
-  <w:num w:numId="50" w16cid:durableId="364910543">
-    <w:abstractNumId w:val="16"/>
-  </w:num>
-  <w:num w:numId="51" w16cid:durableId="190607467">
-    <w:abstractNumId w:val="49"/>
-  </w:num>
-  <w:num w:numId="52" w16cid:durableId="1266228586">
-    <w:abstractNumId w:val="45"/>
-    <w:lvlOverride w:ilvl="0">
-      <w:startOverride w:val="1"/>
-    </w:lvlOverride>
-    <w:lvlOverride w:ilvl="1">
-      <w:startOverride w:val="1"/>
-    </w:lvlOverride>
-    <w:lvlOverride w:ilvl="2">
-      <w:startOverride w:val="1"/>
-    </w:lvlOverride>
-    <w:lvlOverride w:ilvl="3">
-      <w:startOverride w:val="1"/>
-    </w:lvlOverride>
-    <w:lvlOverride w:ilvl="4">
-      <w:startOverride w:val="1"/>
-    </w:lvlOverride>
-    <w:lvlOverride w:ilvl="5">
-      <w:startOverride w:val="1"/>
-    </w:lvlOverride>
-    <w:lvlOverride w:ilvl="6">
-      <w:startOverride w:val="1"/>
-    </w:lvlOverride>
-    <w:lvlOverride w:ilvl="7">
-      <w:startOverride w:val="1"/>
-    </w:lvlOverride>
-    <w:lvlOverride w:ilvl="8">
-      <w:startOverride w:val="1"/>
-    </w:lvlOverride>
-  </w:num>
+  <w:numIdMacAtCleanup w:val="9"/>
 </w:numbering>
 </file>
 
@@ -9189,6 +4947,7 @@
   <w:style w:type="character" w:default="1" w:styleId="DefaultParagraphFont">
     <w:name w:val="Default Paragraph Font"/>
     <w:uiPriority w:val="1"/>
+    <w:semiHidden/>
     <w:unhideWhenUsed/>
   </w:style>
   <w:style w:type="table" w:default="1" w:styleId="TableNormal">
@@ -9528,7 +5287,7 @@
     <w:rsid w:val="005D217D"/>
     <w:pPr>
       <w:numPr>
-        <w:numId w:val="10"/>
+        <w:numId w:val="1"/>
       </w:numPr>
       <w:spacing w:before="240"/>
       <w:ind w:left="357" w:hanging="357"/>
@@ -9632,7 +5391,7 @@
     <w:pPr>
       <w:numPr>
         <w:ilvl w:val="1"/>
-        <w:numId w:val="10"/>
+        <w:numId w:val="1"/>
       </w:numPr>
       <w:spacing w:before="80" w:line="240" w:lineRule="auto"/>
       <w:ind w:left="697" w:hanging="357"/>

</xml_diff>